<commit_message>
Add native Markdown hyperlinks and release v0.3.0
</commit_message>
<xml_diff>
--- a/sample/showcase.docx
+++ b/sample/showcase.docx
@@ -1313,6 +1313,41 @@
           </w:p>
         </w:tc>
       </w:tr>
+      <w:tr>
+        <w:tc>
+          <w:tcPr>
+            <w:tcW w:type="dxa" w:w="4933"/>
+          </w:tcPr>
+          <w:p>
+            <w:pPr>
+              <w:jc w:val="left"/>
+            </w:pPr>
+            <w:r>
+              <w:rPr/>
+              <w:t>Hyperlink</w:t>
+            </w:r>
+          </w:p>
+        </w:tc>
+        <w:tc>
+          <w:tcPr>
+            <w:tcW w:type="dxa" w:w="4933"/>
+          </w:tcPr>
+          <w:p>
+            <w:pPr>
+              <w:jc w:val="left"/>
+            </w:pPr>
+            <w:hyperlink r:id="rId16" w:history="1" w:tooltip="Open the project">
+              <w:r>
+                <w:rPr>
+                  <w:rStyle w:val="Hyperlink"/>
+                  <w:b/>
+                </w:rPr>
+                <w:t>Project documentation</w:t>
+              </w:r>
+            </w:hyperlink>
+          </w:p>
+        </w:tc>
+      </w:tr>
     </w:tbl>
     <w:p>
       <w:pPr/>
@@ -1341,7 +1376,7 @@
                     <pic:cNvPicPr/>
                   </pic:nvPicPr>
                   <pic:blipFill>
-                    <a:blip r:embed="rId16"/>
+                    <a:blip r:embed="rId17"/>
                     <a:stretch>
                       <a:fillRect/>
                     </a:stretch>
@@ -1845,7 +1880,19 @@
       </w:r>
       <w:r>
         <w:rPr/>
-        <w:t>. Headings, paragraphs, quotes, code, lists, tables, images, page breaks, and sections are all native Word content.</w:t>
+        <w:t xml:space="preserve">. Headings, paragraphs, quotes, code, lists, tables, hyperlinks, images, page breaks, and sections are all native Word content. Read the </w:t>
+      </w:r>
+      <w:hyperlink r:id="rId16" w:history="1">
+        <w:r>
+          <w:rPr>
+            <w:rStyle w:val="Hyperlink"/>
+          </w:rPr>
+          <w:t>project documentation</w:t>
+        </w:r>
+      </w:hyperlink>
+      <w:r>
+        <w:rPr/>
+        <w:t xml:space="preserve"> for more examples.</w:t>
       </w:r>
     </w:p>
     <w:sectPr>
@@ -13981,6 +14028,13 @@
     <w:rPr>
       <w:rFonts w:ascii="Consolas" w:hAnsi="Consolas"/>
       <w:sz w:val="18"/>
+    </w:rPr>
+  </w:style>
+  <w:style w:type="character" w:customStyle="1" w:styleId="Hyperlink">
+    <w:name w:val="Hyperlink"/>
+    <w:rPr>
+      <w:color w:val="000000" w:themeColor="hyperlink"/>
+      <w:u w:val="single"/>
     </w:rPr>
   </w:style>
 </w:styles>

</xml_diff>

<commit_message>
Apply document theme fonts through ps-python-docx public APIs
</commit_message>
<xml_diff>
--- a/sample/showcase.docx
+++ b/sample/showcase.docx
@@ -2292,7 +2292,7 @@
       <w:spacing w:before="0" w:after="120" w:line="264" w:lineRule="auto"/>
     </w:pPr>
     <w:rPr>
-      <w:rFonts w:ascii="Calibri" w:hAnsi="Calibri"/>
+      <w:rFonts w:asciiTheme="minorHAnsi" w:hAnsiTheme="minorHAnsi"/>
       <w:sz w:val="22"/>
     </w:rPr>
   </w:style>
@@ -2355,7 +2355,7 @@
       <w:outlineLvl w:val="0"/>
     </w:pPr>
     <w:rPr>
-      <w:rFonts w:asciiTheme="majorHAnsi" w:eastAsiaTheme="majorEastAsia" w:hAnsiTheme="majorHAnsi" w:cstheme="majorBidi" w:ascii="Calibri" w:hAnsi="Calibri"/>
+      <w:rFonts w:asciiTheme="majorHAnsi" w:eastAsiaTheme="majorEastAsia" w:hAnsiTheme="majorHAnsi" w:cstheme="majorBidi"/>
       <w:b/>
       <w:bCs/>
       <w:color w:val="2E74B5"/>
@@ -2379,7 +2379,7 @@
       <w:outlineLvl w:val="1"/>
     </w:pPr>
     <w:rPr>
-      <w:rFonts w:asciiTheme="majorHAnsi" w:eastAsiaTheme="majorEastAsia" w:hAnsiTheme="majorHAnsi" w:cstheme="majorBidi" w:ascii="Calibri" w:hAnsi="Calibri"/>
+      <w:rFonts w:asciiTheme="majorHAnsi" w:eastAsiaTheme="majorEastAsia" w:hAnsiTheme="majorHAnsi" w:cstheme="majorBidi"/>
       <w:b/>
       <w:bCs/>
       <w:color w:val="2E74B5"/>
@@ -2403,7 +2403,7 @@
       <w:outlineLvl w:val="2"/>
     </w:pPr>
     <w:rPr>
-      <w:rFonts w:asciiTheme="majorHAnsi" w:eastAsiaTheme="majorEastAsia" w:hAnsiTheme="majorHAnsi" w:cstheme="majorBidi" w:ascii="Calibri" w:hAnsi="Calibri"/>
+      <w:rFonts w:asciiTheme="majorHAnsi" w:eastAsiaTheme="majorEastAsia" w:hAnsiTheme="majorHAnsi" w:cstheme="majorBidi"/>
       <w:b/>
       <w:bCs/>
       <w:color w:val="1F4D78"/>
@@ -2427,7 +2427,7 @@
       <w:outlineLvl w:val="3"/>
     </w:pPr>
     <w:rPr>
-      <w:rFonts w:asciiTheme="majorHAnsi" w:eastAsiaTheme="majorEastAsia" w:hAnsiTheme="majorHAnsi" w:cstheme="majorBidi" w:ascii="Calibri" w:hAnsi="Calibri"/>
+      <w:rFonts w:asciiTheme="majorHAnsi" w:eastAsiaTheme="majorEastAsia" w:hAnsiTheme="majorHAnsi" w:cstheme="majorBidi"/>
       <w:b/>
       <w:bCs/>
       <w:i/>
@@ -2453,7 +2453,7 @@
       <w:outlineLvl w:val="4"/>
     </w:pPr>
     <w:rPr>
-      <w:rFonts w:asciiTheme="majorHAnsi" w:eastAsiaTheme="majorEastAsia" w:hAnsiTheme="majorHAnsi" w:cstheme="majorBidi" w:ascii="Calibri" w:hAnsi="Calibri"/>
+      <w:rFonts w:asciiTheme="majorHAnsi" w:eastAsiaTheme="majorEastAsia" w:hAnsiTheme="majorHAnsi" w:cstheme="majorBidi"/>
       <w:b/>
       <w:color w:val="555555"/>
       <w:sz w:val="22"/>
@@ -2476,7 +2476,7 @@
       <w:outlineLvl w:val="5"/>
     </w:pPr>
     <w:rPr>
-      <w:rFonts w:asciiTheme="majorHAnsi" w:eastAsiaTheme="majorEastAsia" w:hAnsiTheme="majorHAnsi" w:cstheme="majorBidi" w:ascii="Calibri" w:hAnsi="Calibri"/>
+      <w:rFonts w:asciiTheme="majorHAnsi" w:eastAsiaTheme="majorEastAsia" w:hAnsiTheme="majorHAnsi" w:cstheme="majorBidi"/>
       <w:b/>
       <w:i/>
       <w:iCs/>
@@ -2832,7 +2832,7 @@
       <w:contextualSpacing/>
     </w:pPr>
     <w:rPr>
-      <w:rFonts w:ascii="Calibri" w:hAnsi="Calibri"/>
+      <w:rFonts w:asciiTheme="minorHAnsi" w:hAnsiTheme="minorHAnsi"/>
       <w:sz w:val="22"/>
     </w:rPr>
   </w:style>
@@ -2850,7 +2850,7 @@
       <w:contextualSpacing/>
     </w:pPr>
     <w:rPr>
-      <w:rFonts w:ascii="Calibri" w:hAnsi="Calibri"/>
+      <w:rFonts w:asciiTheme="minorHAnsi" w:hAnsiTheme="minorHAnsi"/>
       <w:sz w:val="22"/>
     </w:rPr>
   </w:style>
@@ -2868,7 +2868,7 @@
       <w:contextualSpacing/>
     </w:pPr>
     <w:rPr>
-      <w:rFonts w:ascii="Calibri" w:hAnsi="Calibri"/>
+      <w:rFonts w:asciiTheme="minorHAnsi" w:hAnsiTheme="minorHAnsi"/>
       <w:sz w:val="22"/>
     </w:rPr>
   </w:style>
@@ -2886,7 +2886,7 @@
       <w:contextualSpacing/>
     </w:pPr>
     <w:rPr>
-      <w:rFonts w:ascii="Calibri" w:hAnsi="Calibri"/>
+      <w:rFonts w:asciiTheme="minorHAnsi" w:hAnsiTheme="minorHAnsi"/>
       <w:sz w:val="22"/>
     </w:rPr>
   </w:style>
@@ -2904,7 +2904,7 @@
       <w:contextualSpacing/>
     </w:pPr>
     <w:rPr>
-      <w:rFonts w:ascii="Calibri" w:hAnsi="Calibri"/>
+      <w:rFonts w:asciiTheme="minorHAnsi" w:hAnsiTheme="minorHAnsi"/>
       <w:sz w:val="22"/>
     </w:rPr>
   </w:style>
@@ -2922,7 +2922,7 @@
       <w:contextualSpacing/>
     </w:pPr>
     <w:rPr>
-      <w:rFonts w:ascii="Calibri" w:hAnsi="Calibri"/>
+      <w:rFonts w:asciiTheme="minorHAnsi" w:hAnsiTheme="minorHAnsi"/>
       <w:sz w:val="22"/>
     </w:rPr>
   </w:style>
@@ -3009,7 +3009,7 @@
       <w:spacing w:after="120"/>
     </w:pPr>
     <w:rPr>
-      <w:rFonts w:ascii="Calibri" w:hAnsi="Calibri"/>
+      <w:rFonts w:asciiTheme="minorHAnsi" w:hAnsiTheme="minorHAnsi"/>
       <w:i/>
       <w:iCs/>
       <w:color w:val="555555"/>
@@ -3023,6 +3023,7 @@
     <w:uiPriority w:val="29"/>
     <w:rsid w:val="00FC693F"/>
     <w:rPr>
+      <w:rFonts w:asciiTheme="minorHAnsi" w:hAnsiTheme="minorHAnsi"/>
       <w:i/>
       <w:iCs/>
       <w:color w:val="000000" w:themeColor="text1"/>
@@ -25883,9 +25884,9 @@
         <a:srgbClr val="800080"/>
       </a:folHlink>
     </a:clrScheme>
-    <a:fontScheme name="Office">
+    <a:fontScheme name="markdown-docx">
       <a:majorFont>
-        <a:latin typeface="Calibri"/>
+        <a:latin typeface="Aptos Display"/>
         <a:ea typeface=""/>
         <a:cs typeface=""/>
         <a:font script="Jpan" typeface="ＭＳ ゴシック"/>
@@ -25920,7 +25921,7 @@
         <a:font script="Geor" typeface="Sylfaen"/>
       </a:majorFont>
       <a:minorFont>
-        <a:latin typeface="Cambria"/>
+        <a:latin typeface="Aptos"/>
         <a:ea typeface=""/>
         <a:cs typeface=""/>
         <a:font script="Jpan" typeface="ＭＳ 明朝"/>

</xml_diff>

<commit_message>
Support native list starts and continuation paragraphs in 0.3.4
</commit_message>
<xml_diff>
--- a/sample/showcase.docx
+++ b/sample/showcase.docx
@@ -42,7 +42,7 @@
         <w:drawing>
           <wp:inline xmlns:a="http://schemas.openxmlformats.org/drawingml/2006/main" xmlns:pic="http://schemas.openxmlformats.org/drawingml/2006/picture">
             <wp:extent cx="5636362" cy="1878787"/>
-            <wp:docPr id="1" name="Picture 1"/>
+            <wp:docPr id="1" name="Picture 1" descr="Pepper, Biscuit, and Juniper begin their park run" title="The park run begins"/>
             <wp:cNvGraphicFramePr>
               <a:graphicFrameLocks noChangeAspect="1"/>
             </wp:cNvGraphicFramePr>
@@ -83,6 +83,10 @@
     <w:p>
       <w:pPr>
         <w:pStyle w:val="ListBullet"/>
+        <w:numPr>
+          <w:ilvl w:val="0"/>
+          <w:numId w:val="10"/>
+        </w:numPr>
       </w:pPr>
       <w:r>
         <w:rPr>
@@ -98,6 +102,10 @@
     <w:p>
       <w:pPr>
         <w:pStyle w:val="ListBullet"/>
+        <w:numPr>
+          <w:ilvl w:val="0"/>
+          <w:numId w:val="10"/>
+        </w:numPr>
       </w:pPr>
       <w:r>
         <w:rPr>
@@ -113,6 +121,10 @@
     <w:p>
       <w:pPr>
         <w:pStyle w:val="ListBullet"/>
+        <w:numPr>
+          <w:ilvl w:val="0"/>
+          <w:numId w:val="10"/>
+        </w:numPr>
       </w:pPr>
       <w:r>
         <w:rPr>
@@ -193,7 +205,7 @@
         <w:drawing>
           <wp:inline xmlns:a="http://schemas.openxmlformats.org/drawingml/2006/main" xmlns:pic="http://schemas.openxmlformats.org/drawingml/2006/picture">
             <wp:extent cx="5394960" cy="1798320"/>
-            <wp:docPr id="2" name="Picture 2"/>
+            <wp:docPr id="2" name="Picture 2" descr="The three dogs spot a windblown lunch bag"/>
             <wp:cNvGraphicFramePr>
               <a:graphicFrameLocks noChangeAspect="1"/>
             </wp:cNvGraphicFramePr>
@@ -304,7 +316,7 @@
         <w:drawing>
           <wp:inline xmlns:a="http://schemas.openxmlformats.org/drawingml/2006/main" xmlns:pic="http://schemas.openxmlformats.org/drawingml/2006/picture">
             <wp:extent cx="5400000" cy="1800000"/>
-            <wp:docPr id="3" name="Picture 3"/>
+            <wp:docPr id="3" name="Picture 3" descr="Juniper stops the wagon while Pepper leaps and Biscuit scrambles"/>
             <wp:cNvGraphicFramePr>
               <a:graphicFrameLocks noChangeAspect="1"/>
             </wp:cNvGraphicFramePr>
@@ -345,6 +357,10 @@
     <w:p>
       <w:pPr>
         <w:pStyle w:val="ListBullet"/>
+        <w:numPr>
+          <w:ilvl w:val="0"/>
+          <w:numId w:val="11"/>
+        </w:numPr>
       </w:pPr>
       <w:r>
         <w:rPr/>
@@ -354,6 +370,10 @@
     <w:p>
       <w:pPr>
         <w:pStyle w:val="ListBullet2"/>
+        <w:numPr>
+          <w:ilvl w:val="0"/>
+          <w:numId w:val="12"/>
+        </w:numPr>
       </w:pPr>
       <w:r>
         <w:rPr/>
@@ -363,6 +383,10 @@
     <w:p>
       <w:pPr>
         <w:pStyle w:val="ListBullet3"/>
+        <w:numPr>
+          <w:ilvl w:val="0"/>
+          <w:numId w:val="13"/>
+        </w:numPr>
       </w:pPr>
       <w:r>
         <w:rPr/>
@@ -372,6 +396,10 @@
     <w:p>
       <w:pPr>
         <w:pStyle w:val="ListBullet"/>
+        <w:numPr>
+          <w:ilvl w:val="0"/>
+          <w:numId w:val="11"/>
+        </w:numPr>
       </w:pPr>
       <w:r>
         <w:rPr/>
@@ -381,6 +409,10 @@
     <w:p>
       <w:pPr>
         <w:pStyle w:val="ListBullet2"/>
+        <w:numPr>
+          <w:ilvl w:val="0"/>
+          <w:numId w:val="14"/>
+        </w:numPr>
       </w:pPr>
       <w:r>
         <w:rPr/>
@@ -390,6 +422,10 @@
     <w:p>
       <w:pPr>
         <w:pStyle w:val="ListBullet3"/>
+        <w:numPr>
+          <w:ilvl w:val="0"/>
+          <w:numId w:val="15"/>
+        </w:numPr>
       </w:pPr>
       <w:r>
         <w:rPr/>
@@ -399,6 +435,10 @@
     <w:p>
       <w:pPr>
         <w:pStyle w:val="ListBullet"/>
+        <w:numPr>
+          <w:ilvl w:val="0"/>
+          <w:numId w:val="11"/>
+        </w:numPr>
       </w:pPr>
       <w:r>
         <w:rPr/>
@@ -441,7 +481,7 @@
         <w:drawing>
           <wp:inline xmlns:a="http://schemas.openxmlformats.org/drawingml/2006/main" xmlns:pic="http://schemas.openxmlformats.org/drawingml/2006/picture">
             <wp:extent cx="5220000" cy="1740000"/>
-            <wp:docPr id="4" name="Picture 4"/>
+            <wp:docPr id="4" name="Picture 4" descr="The dogs sit proudly beside the safely returned lunch"/>
             <wp:cNvGraphicFramePr>
               <a:graphicFrameLocks noChangeAspect="1"/>
             </wp:cNvGraphicFramePr>
@@ -750,7 +790,7 @@
         <w:drawing>
           <wp:inline xmlns:a="http://schemas.openxmlformats.org/drawingml/2006/main" xmlns:pic="http://schemas.openxmlformats.org/drawingml/2006/picture">
             <wp:extent cx="1270065" cy="508026"/>
-            <wp:docPr id="5" name="Picture 5"/>
+            <wp:docPr id="5" name="Picture 5" descr="Pepper, Biscuit, and Juniper"/>
             <wp:cNvGraphicFramePr>
               <a:graphicFrameLocks noChangeAspect="1"/>
             </wp:cNvGraphicFramePr>
@@ -1003,12 +1043,87 @@
       </w:pPr>
       <w:r>
         <w:rPr/>
+        <w:t>List starts and continuation paragraphs</w:t>
+      </w:r>
+    </w:p>
+    <w:p>
+      <w:pPr>
+        <w:pStyle w:val="ListNumber"/>
+        <w:numPr>
+          <w:ilvl w:val="0"/>
+          <w:numId w:val="16"/>
+        </w:numPr>
+      </w:pPr>
+      <w:r>
+        <w:rPr/>
+        <w:t>This ordered list begins at three.</w:t>
+      </w:r>
+    </w:p>
+    <w:p>
+      <w:pPr>
+        <w:pStyle w:val="ListNumber"/>
+        <w:numPr>
+          <w:numId w:val="0"/>
+        </w:numPr>
+        <w:tabs>
+          <w:tab w:val="num" w:pos="360"/>
+        </w:tabs>
+        <w:ind w:left="360" w:firstLine="0"/>
+      </w:pPr>
+      <w:r>
+        <w:rPr/>
+        <w:t>This second paragraph belongs to the same item and has no number.</w:t>
+      </w:r>
+    </w:p>
+    <w:p>
+      <w:pPr>
+        <w:pStyle w:val="ListNumber"/>
+        <w:numPr>
+          <w:ilvl w:val="0"/>
+          <w:numId w:val="16"/>
+        </w:numPr>
+      </w:pPr>
+      <w:r>
+        <w:rPr/>
+        <w:t>This item continues at four.</w:t>
+      </w:r>
+    </w:p>
+    <w:p>
+      <w:pPr/>
+      <w:r>
+        <w:rPr/>
+        <w:t>A paragraph separates the next list from the previous sequence.</w:t>
+      </w:r>
+    </w:p>
+    <w:p>
+      <w:pPr>
+        <w:pStyle w:val="ListNumber"/>
+        <w:numPr>
+          <w:ilvl w:val="0"/>
+          <w:numId w:val="17"/>
+        </w:numPr>
+      </w:pPr>
+      <w:r>
+        <w:rPr/>
+        <w:t>This independent list starts again at one.</w:t>
+      </w:r>
+    </w:p>
+    <w:p>
+      <w:pPr>
+        <w:pStyle w:val="Heading2"/>
+      </w:pPr>
+      <w:r>
+        <w:rPr/>
         <w:t>List kinds and depths</w:t>
       </w:r>
     </w:p>
     <w:p>
       <w:pPr>
         <w:pStyle w:val="ListBullet"/>
+        <w:numPr>
+          <w:ilvl w:val="0"/>
+          <w:numId w:val="18"/>
+        </w:numPr>
       </w:pPr>
       <w:r>
         <w:rPr/>
@@ -1018,6 +1133,10 @@
     <w:p>
       <w:pPr>
         <w:pStyle w:val="ListBullet2"/>
+        <w:numPr>
+          <w:ilvl w:val="0"/>
+          <w:numId w:val="19"/>
+        </w:numPr>
       </w:pPr>
       <w:r>
         <w:rPr/>
@@ -1027,6 +1146,10 @@
     <w:p>
       <w:pPr>
         <w:pStyle w:val="ListBullet3"/>
+        <w:numPr>
+          <w:ilvl w:val="0"/>
+          <w:numId w:val="20"/>
+        </w:numPr>
       </w:pPr>
       <w:r>
         <w:rPr/>
@@ -1036,6 +1159,10 @@
     <w:p>
       <w:pPr>
         <w:pStyle w:val="ListNumber"/>
+        <w:numPr>
+          <w:ilvl w:val="0"/>
+          <w:numId w:val="21"/>
+        </w:numPr>
       </w:pPr>
       <w:r>
         <w:rPr/>
@@ -1045,6 +1172,10 @@
     <w:p>
       <w:pPr>
         <w:pStyle w:val="ListNumber2"/>
+        <w:numPr>
+          <w:ilvl w:val="0"/>
+          <w:numId w:val="22"/>
+        </w:numPr>
       </w:pPr>
       <w:r>
         <w:rPr/>
@@ -1054,6 +1185,10 @@
     <w:p>
       <w:pPr>
         <w:pStyle w:val="ListNumber3"/>
+        <w:numPr>
+          <w:ilvl w:val="0"/>
+          <w:numId w:val="23"/>
+        </w:numPr>
       </w:pPr>
       <w:r>
         <w:rPr/>
@@ -1063,6 +1198,10 @@
     <w:p>
       <w:pPr>
         <w:pStyle w:val="ListBullet"/>
+        <w:numPr>
+          <w:ilvl w:val="0"/>
+          <w:numId w:val="24"/>
+        </w:numPr>
       </w:pPr>
       <w:r>
         <w:rPr/>
@@ -1072,6 +1211,10 @@
     <w:p>
       <w:pPr>
         <w:pStyle w:val="ListNumber2"/>
+        <w:numPr>
+          <w:ilvl w:val="0"/>
+          <w:numId w:val="25"/>
+        </w:numPr>
       </w:pPr>
       <w:r>
         <w:rPr/>
@@ -1081,6 +1224,10 @@
     <w:p>
       <w:pPr>
         <w:pStyle w:val="ListNumber3"/>
+        <w:numPr>
+          <w:ilvl w:val="0"/>
+          <w:numId w:val="26"/>
+        </w:numPr>
       </w:pPr>
       <w:r>
         <w:rPr/>
@@ -1090,6 +1237,10 @@
     <w:p>
       <w:pPr>
         <w:pStyle w:val="ListNumber"/>
+        <w:numPr>
+          <w:ilvl w:val="0"/>
+          <w:numId w:val="27"/>
+        </w:numPr>
       </w:pPr>
       <w:r>
         <w:rPr/>
@@ -1099,6 +1250,10 @@
     <w:p>
       <w:pPr>
         <w:pStyle w:val="ListBullet2"/>
+        <w:numPr>
+          <w:ilvl w:val="0"/>
+          <w:numId w:val="28"/>
+        </w:numPr>
       </w:pPr>
       <w:r>
         <w:rPr/>
@@ -1108,6 +1263,10 @@
     <w:p>
       <w:pPr>
         <w:pStyle w:val="ListBullet3"/>
+        <w:numPr>
+          <w:ilvl w:val="0"/>
+          <w:numId w:val="29"/>
+        </w:numPr>
       </w:pPr>
       <w:r>
         <w:rPr/>
@@ -1336,7 +1495,7 @@
             <w:pPr>
               <w:jc w:val="left"/>
             </w:pPr>
-            <w:hyperlink r:id="rId16" w:history="1" w:tooltip="Open the project">
+            <w:hyperlink w:tooltip="Open the project" r:id="rId16">
               <w:r>
                 <w:rPr>
                   <w:rStyle w:val="Hyperlink"/>
@@ -1364,7 +1523,7 @@
         <w:drawing>
           <wp:inline xmlns:a="http://schemas.openxmlformats.org/drawingml/2006/main" xmlns:pic="http://schemas.openxmlformats.org/drawingml/2006/picture">
             <wp:extent cx="6264000" cy="2505600"/>
-            <wp:docPr id="6" name="Picture 6"/>
+            <wp:docPr id="6" name="Picture 6" descr="Natural-width dog cameo used to demonstrate page clamping"/>
             <wp:cNvGraphicFramePr>
               <a:graphicFrameLocks noChangeAspect="1"/>
             </wp:cNvGraphicFramePr>
@@ -1625,7 +1784,7 @@
         <w:drawing>
           <wp:inline xmlns:a="http://schemas.openxmlformats.org/drawingml/2006/main" xmlns:pic="http://schemas.openxmlformats.org/drawingml/2006/picture">
             <wp:extent cx="5400000" cy="1800000"/>
-            <wp:docPr id="7" name="Picture 7"/>
+            <wp:docPr id="7" name="Picture 7" descr="Right-aligned dog team on legal landscape paper"/>
             <wp:cNvGraphicFramePr>
               <a:graphicFrameLocks noChangeAspect="1"/>
             </wp:cNvGraphicFramePr>
@@ -1690,7 +1849,7 @@
         <w:drawing>
           <wp:inline xmlns:a="http://schemas.openxmlformats.org/drawingml/2006/main" xmlns:pic="http://schemas.openxmlformats.org/drawingml/2006/picture">
             <wp:extent cx="4572000" cy="1524000"/>
-            <wp:docPr id="8" name="Picture 8"/>
+            <wp:docPr id="8" name="Picture 8" descr="Point-sized illustration on a custom page"/>
             <wp:cNvGraphicFramePr>
               <a:graphicFrameLocks noChangeAspect="1"/>
             </wp:cNvGraphicFramePr>
@@ -1882,7 +2041,7 @@
         <w:rPr/>
         <w:t xml:space="preserve">. Headings, paragraphs, quotes, code, lists, tables, hyperlinks, images, page breaks, and sections are all native Word content. Read the </w:t>
       </w:r>
-      <w:hyperlink r:id="rId16" w:history="1">
+      <w:hyperlink r:id="rId16">
         <w:r>
           <w:rPr>
             <w:rStyle w:val="Hyperlink"/>
@@ -2098,6 +2257,402 @@
       </w:rPr>
     </w:lvl>
   </w:abstractNum>
+  <w:abstractNum w:abstractNumId="9">
+    <w:nsid w:val="4D14D51D"/>
+    <w:multiLevelType w:val="singleLevel"/>
+    <w:tmpl w:val="29761A62"/>
+    <w:lvl w:ilvl="0">
+      <w:start w:val="1"/>
+      <w:numFmt w:val="bullet"/>
+      <w:pStyle w:val="ListBullet"/>
+      <w:lvlText w:val=""/>
+      <w:lvlJc w:val="left"/>
+      <w:pPr>
+        <w:tabs>
+          <w:tab w:val="num" w:pos="360"/>
+        </w:tabs>
+        <w:ind w:left="360" w:hanging="360"/>
+      </w:pPr>
+      <w:rPr>
+        <w:rFonts w:ascii="Symbol" w:hAnsi="Symbol" w:hint="default"/>
+      </w:rPr>
+    </w:lvl>
+  </w:abstractNum>
+  <w:abstractNum w:abstractNumId="10">
+    <w:nsid w:val="2F1180E2"/>
+    <w:multiLevelType w:val="singleLevel"/>
+    <w:tmpl w:val="29761A62"/>
+    <w:lvl w:ilvl="0">
+      <w:start w:val="1"/>
+      <w:numFmt w:val="bullet"/>
+      <w:pStyle w:val="ListBullet"/>
+      <w:lvlText w:val=""/>
+      <w:lvlJc w:val="left"/>
+      <w:pPr>
+        <w:tabs>
+          <w:tab w:val="num" w:pos="360"/>
+        </w:tabs>
+        <w:ind w:left="360" w:hanging="360"/>
+      </w:pPr>
+      <w:rPr>
+        <w:rFonts w:ascii="Symbol" w:hAnsi="Symbol" w:hint="default"/>
+      </w:rPr>
+    </w:lvl>
+  </w:abstractNum>
+  <w:abstractNum w:abstractNumId="11">
+    <w:nsid w:val="E2C50B8B"/>
+    <w:multiLevelType w:val="singleLevel"/>
+    <w:tmpl w:val="3D1EFFD4"/>
+    <w:lvl w:ilvl="0">
+      <w:start w:val="1"/>
+      <w:numFmt w:val="bullet"/>
+      <w:pStyle w:val="ListBullet2"/>
+      <w:lvlText w:val=""/>
+      <w:lvlJc w:val="left"/>
+      <w:pPr>
+        <w:tabs>
+          <w:tab w:val="num" w:pos="720"/>
+        </w:tabs>
+        <w:ind w:left="720" w:hanging="360"/>
+      </w:pPr>
+      <w:rPr>
+        <w:rFonts w:ascii="Symbol" w:hAnsi="Symbol" w:hint="default"/>
+      </w:rPr>
+    </w:lvl>
+  </w:abstractNum>
+  <w:abstractNum w:abstractNumId="12">
+    <w:nsid w:val="CE9CB24A"/>
+    <w:multiLevelType w:val="singleLevel"/>
+    <w:tmpl w:val="F3EAFDEC"/>
+    <w:lvl w:ilvl="0">
+      <w:start w:val="1"/>
+      <w:numFmt w:val="bullet"/>
+      <w:pStyle w:val="ListBullet3"/>
+      <w:lvlText w:val=""/>
+      <w:lvlJc w:val="left"/>
+      <w:pPr>
+        <w:tabs>
+          <w:tab w:val="num" w:pos="1080"/>
+        </w:tabs>
+        <w:ind w:left="1080" w:hanging="360"/>
+      </w:pPr>
+      <w:rPr>
+        <w:rFonts w:ascii="Symbol" w:hAnsi="Symbol" w:hint="default"/>
+      </w:rPr>
+    </w:lvl>
+  </w:abstractNum>
+  <w:abstractNum w:abstractNumId="13">
+    <w:nsid w:val="C7E8C989"/>
+    <w:multiLevelType w:val="singleLevel"/>
+    <w:tmpl w:val="3D1EFFD4"/>
+    <w:lvl w:ilvl="0">
+      <w:start w:val="1"/>
+      <w:numFmt w:val="bullet"/>
+      <w:pStyle w:val="ListBullet2"/>
+      <w:lvlText w:val=""/>
+      <w:lvlJc w:val="left"/>
+      <w:pPr>
+        <w:tabs>
+          <w:tab w:val="num" w:pos="720"/>
+        </w:tabs>
+        <w:ind w:left="720" w:hanging="360"/>
+      </w:pPr>
+      <w:rPr>
+        <w:rFonts w:ascii="Symbol" w:hAnsi="Symbol" w:hint="default"/>
+      </w:rPr>
+    </w:lvl>
+  </w:abstractNum>
+  <w:abstractNum w:abstractNumId="14">
+    <w:nsid w:val="06D9F2E1"/>
+    <w:multiLevelType w:val="singleLevel"/>
+    <w:tmpl w:val="F3EAFDEC"/>
+    <w:lvl w:ilvl="0">
+      <w:start w:val="1"/>
+      <w:numFmt w:val="bullet"/>
+      <w:pStyle w:val="ListBullet3"/>
+      <w:lvlText w:val=""/>
+      <w:lvlJc w:val="left"/>
+      <w:pPr>
+        <w:tabs>
+          <w:tab w:val="num" w:pos="1080"/>
+        </w:tabs>
+        <w:ind w:left="1080" w:hanging="360"/>
+      </w:pPr>
+      <w:rPr>
+        <w:rFonts w:ascii="Symbol" w:hAnsi="Symbol" w:hint="default"/>
+      </w:rPr>
+    </w:lvl>
+  </w:abstractNum>
+  <w:abstractNum w:abstractNumId="15">
+    <w:nsid w:val="79D57026"/>
+    <w:multiLevelType w:val="singleLevel"/>
+    <w:tmpl w:val="D0A62B40"/>
+    <w:lvl w:ilvl="0">
+      <w:start w:val="1"/>
+      <w:numFmt w:val="decimal"/>
+      <w:pStyle w:val="ListNumber"/>
+      <w:lvlText w:val="%1."/>
+      <w:lvlJc w:val="left"/>
+      <w:pPr>
+        <w:tabs>
+          <w:tab w:val="num" w:pos="360"/>
+        </w:tabs>
+        <w:ind w:left="360" w:hanging="360"/>
+      </w:pPr>
+    </w:lvl>
+  </w:abstractNum>
+  <w:abstractNum w:abstractNumId="16">
+    <w:nsid w:val="D18DD15F"/>
+    <w:multiLevelType w:val="singleLevel"/>
+    <w:tmpl w:val="D0A62B40"/>
+    <w:lvl w:ilvl="0">
+      <w:start w:val="1"/>
+      <w:numFmt w:val="decimal"/>
+      <w:pStyle w:val="ListNumber"/>
+      <w:lvlText w:val="%1."/>
+      <w:lvlJc w:val="left"/>
+      <w:pPr>
+        <w:tabs>
+          <w:tab w:val="num" w:pos="360"/>
+        </w:tabs>
+        <w:ind w:left="360" w:hanging="360"/>
+      </w:pPr>
+    </w:lvl>
+  </w:abstractNum>
+  <w:abstractNum w:abstractNumId="17">
+    <w:nsid w:val="833CD3CB"/>
+    <w:multiLevelType w:val="singleLevel"/>
+    <w:tmpl w:val="29761A62"/>
+    <w:lvl w:ilvl="0">
+      <w:start w:val="1"/>
+      <w:numFmt w:val="bullet"/>
+      <w:pStyle w:val="ListBullet"/>
+      <w:lvlText w:val=""/>
+      <w:lvlJc w:val="left"/>
+      <w:pPr>
+        <w:tabs>
+          <w:tab w:val="num" w:pos="360"/>
+        </w:tabs>
+        <w:ind w:left="360" w:hanging="360"/>
+      </w:pPr>
+      <w:rPr>
+        <w:rFonts w:ascii="Symbol" w:hAnsi="Symbol" w:hint="default"/>
+      </w:rPr>
+    </w:lvl>
+  </w:abstractNum>
+  <w:abstractNum w:abstractNumId="18">
+    <w:nsid w:val="861A49FE"/>
+    <w:multiLevelType w:val="singleLevel"/>
+    <w:tmpl w:val="3D1EFFD4"/>
+    <w:lvl w:ilvl="0">
+      <w:start w:val="1"/>
+      <w:numFmt w:val="bullet"/>
+      <w:pStyle w:val="ListBullet2"/>
+      <w:lvlText w:val=""/>
+      <w:lvlJc w:val="left"/>
+      <w:pPr>
+        <w:tabs>
+          <w:tab w:val="num" w:pos="720"/>
+        </w:tabs>
+        <w:ind w:left="720" w:hanging="360"/>
+      </w:pPr>
+      <w:rPr>
+        <w:rFonts w:ascii="Symbol" w:hAnsi="Symbol" w:hint="default"/>
+      </w:rPr>
+    </w:lvl>
+  </w:abstractNum>
+  <w:abstractNum w:abstractNumId="19">
+    <w:nsid w:val="23051C86"/>
+    <w:multiLevelType w:val="singleLevel"/>
+    <w:tmpl w:val="F3EAFDEC"/>
+    <w:lvl w:ilvl="0">
+      <w:start w:val="1"/>
+      <w:numFmt w:val="bullet"/>
+      <w:pStyle w:val="ListBullet3"/>
+      <w:lvlText w:val=""/>
+      <w:lvlJc w:val="left"/>
+      <w:pPr>
+        <w:tabs>
+          <w:tab w:val="num" w:pos="1080"/>
+        </w:tabs>
+        <w:ind w:left="1080" w:hanging="360"/>
+      </w:pPr>
+      <w:rPr>
+        <w:rFonts w:ascii="Symbol" w:hAnsi="Symbol" w:hint="default"/>
+      </w:rPr>
+    </w:lvl>
+  </w:abstractNum>
+  <w:abstractNum w:abstractNumId="20">
+    <w:nsid w:val="3205DD49"/>
+    <w:multiLevelType w:val="singleLevel"/>
+    <w:tmpl w:val="D0A62B40"/>
+    <w:lvl w:ilvl="0">
+      <w:start w:val="1"/>
+      <w:numFmt w:val="decimal"/>
+      <w:pStyle w:val="ListNumber"/>
+      <w:lvlText w:val="%1."/>
+      <w:lvlJc w:val="left"/>
+      <w:pPr>
+        <w:tabs>
+          <w:tab w:val="num" w:pos="360"/>
+        </w:tabs>
+        <w:ind w:left="360" w:hanging="360"/>
+      </w:pPr>
+    </w:lvl>
+  </w:abstractNum>
+  <w:abstractNum w:abstractNumId="21">
+    <w:nsid w:val="38C31660"/>
+    <w:multiLevelType w:val="singleLevel"/>
+    <w:tmpl w:val="38441652"/>
+    <w:lvl w:ilvl="0">
+      <w:start w:val="1"/>
+      <w:numFmt w:val="decimal"/>
+      <w:pStyle w:val="ListNumber2"/>
+      <w:lvlText w:val="%1."/>
+      <w:lvlJc w:val="left"/>
+      <w:pPr>
+        <w:tabs>
+          <w:tab w:val="num" w:pos="720"/>
+        </w:tabs>
+        <w:ind w:left="720" w:hanging="360"/>
+      </w:pPr>
+    </w:lvl>
+  </w:abstractNum>
+  <w:abstractNum w:abstractNumId="22">
+    <w:nsid w:val="72EDE54E"/>
+    <w:multiLevelType w:val="singleLevel"/>
+    <w:tmpl w:val="FB12693A"/>
+    <w:lvl w:ilvl="0">
+      <w:start w:val="1"/>
+      <w:numFmt w:val="decimal"/>
+      <w:pStyle w:val="ListNumber3"/>
+      <w:lvlText w:val="%1."/>
+      <w:lvlJc w:val="left"/>
+      <w:pPr>
+        <w:tabs>
+          <w:tab w:val="num" w:pos="1080"/>
+        </w:tabs>
+        <w:ind w:left="1080" w:hanging="360"/>
+      </w:pPr>
+    </w:lvl>
+  </w:abstractNum>
+  <w:abstractNum w:abstractNumId="23">
+    <w:nsid w:val="2D070345"/>
+    <w:multiLevelType w:val="singleLevel"/>
+    <w:tmpl w:val="29761A62"/>
+    <w:lvl w:ilvl="0">
+      <w:start w:val="1"/>
+      <w:numFmt w:val="bullet"/>
+      <w:pStyle w:val="ListBullet"/>
+      <w:lvlText w:val=""/>
+      <w:lvlJc w:val="left"/>
+      <w:pPr>
+        <w:tabs>
+          <w:tab w:val="num" w:pos="360"/>
+        </w:tabs>
+        <w:ind w:left="360" w:hanging="360"/>
+      </w:pPr>
+      <w:rPr>
+        <w:rFonts w:ascii="Symbol" w:hAnsi="Symbol" w:hint="default"/>
+      </w:rPr>
+    </w:lvl>
+  </w:abstractNum>
+  <w:abstractNum w:abstractNumId="24">
+    <w:nsid w:val="1E95158A"/>
+    <w:multiLevelType w:val="singleLevel"/>
+    <w:tmpl w:val="38441652"/>
+    <w:lvl w:ilvl="0">
+      <w:start w:val="1"/>
+      <w:numFmt w:val="decimal"/>
+      <w:pStyle w:val="ListNumber2"/>
+      <w:lvlText w:val="%1."/>
+      <w:lvlJc w:val="left"/>
+      <w:pPr>
+        <w:tabs>
+          <w:tab w:val="num" w:pos="720"/>
+        </w:tabs>
+        <w:ind w:left="720" w:hanging="360"/>
+      </w:pPr>
+    </w:lvl>
+  </w:abstractNum>
+  <w:abstractNum w:abstractNumId="25">
+    <w:nsid w:val="871B4E87"/>
+    <w:multiLevelType w:val="singleLevel"/>
+    <w:tmpl w:val="FB12693A"/>
+    <w:lvl w:ilvl="0">
+      <w:start w:val="1"/>
+      <w:numFmt w:val="decimal"/>
+      <w:pStyle w:val="ListNumber3"/>
+      <w:lvlText w:val="%1."/>
+      <w:lvlJc w:val="left"/>
+      <w:pPr>
+        <w:tabs>
+          <w:tab w:val="num" w:pos="1080"/>
+        </w:tabs>
+        <w:ind w:left="1080" w:hanging="360"/>
+      </w:pPr>
+    </w:lvl>
+  </w:abstractNum>
+  <w:abstractNum w:abstractNumId="26">
+    <w:nsid w:val="F25310E3"/>
+    <w:multiLevelType w:val="singleLevel"/>
+    <w:tmpl w:val="D0A62B40"/>
+    <w:lvl w:ilvl="0">
+      <w:start w:val="1"/>
+      <w:numFmt w:val="decimal"/>
+      <w:pStyle w:val="ListNumber"/>
+      <w:lvlText w:val="%1."/>
+      <w:lvlJc w:val="left"/>
+      <w:pPr>
+        <w:tabs>
+          <w:tab w:val="num" w:pos="360"/>
+        </w:tabs>
+        <w:ind w:left="360" w:hanging="360"/>
+      </w:pPr>
+    </w:lvl>
+  </w:abstractNum>
+  <w:abstractNum w:abstractNumId="27">
+    <w:nsid w:val="B092C3C2"/>
+    <w:multiLevelType w:val="singleLevel"/>
+    <w:tmpl w:val="3D1EFFD4"/>
+    <w:lvl w:ilvl="0">
+      <w:start w:val="1"/>
+      <w:numFmt w:val="bullet"/>
+      <w:pStyle w:val="ListBullet2"/>
+      <w:lvlText w:val=""/>
+      <w:lvlJc w:val="left"/>
+      <w:pPr>
+        <w:tabs>
+          <w:tab w:val="num" w:pos="720"/>
+        </w:tabs>
+        <w:ind w:left="720" w:hanging="360"/>
+      </w:pPr>
+      <w:rPr>
+        <w:rFonts w:ascii="Symbol" w:hAnsi="Symbol" w:hint="default"/>
+      </w:rPr>
+    </w:lvl>
+  </w:abstractNum>
+  <w:abstractNum w:abstractNumId="28">
+    <w:nsid w:val="FD2260A8"/>
+    <w:multiLevelType w:val="singleLevel"/>
+    <w:tmpl w:val="F3EAFDEC"/>
+    <w:lvl w:ilvl="0">
+      <w:start w:val="1"/>
+      <w:numFmt w:val="bullet"/>
+      <w:pStyle w:val="ListBullet3"/>
+      <w:lvlText w:val=""/>
+      <w:lvlJc w:val="left"/>
+      <w:pPr>
+        <w:tabs>
+          <w:tab w:val="num" w:pos="1080"/>
+        </w:tabs>
+        <w:ind w:left="1080" w:hanging="360"/>
+      </w:pPr>
+      <w:rPr>
+        <w:rFonts w:ascii="Symbol" w:hAnsi="Symbol" w:hint="default"/>
+      </w:rPr>
+    </w:lvl>
+  </w:abstractNum>
   <w:num w:numId="1">
     <w:abstractNumId w:val="8"/>
   </w:num>
@@ -2124,6 +2679,126 @@
   </w:num>
   <w:num w:numId="9">
     <w:abstractNumId w:val="0"/>
+  </w:num>
+  <w:num w:numId="10">
+    <w:abstractNumId w:val="9"/>
+    <w:lvlOverride w:ilvl="0">
+      <w:startOverride w:val="1"/>
+    </w:lvlOverride>
+  </w:num>
+  <w:num w:numId="11">
+    <w:abstractNumId w:val="10"/>
+    <w:lvlOverride w:ilvl="0">
+      <w:startOverride w:val="1"/>
+    </w:lvlOverride>
+  </w:num>
+  <w:num w:numId="12">
+    <w:abstractNumId w:val="11"/>
+    <w:lvlOverride w:ilvl="0">
+      <w:startOverride w:val="1"/>
+    </w:lvlOverride>
+  </w:num>
+  <w:num w:numId="13">
+    <w:abstractNumId w:val="12"/>
+    <w:lvlOverride w:ilvl="0">
+      <w:startOverride w:val="1"/>
+    </w:lvlOverride>
+  </w:num>
+  <w:num w:numId="14">
+    <w:abstractNumId w:val="13"/>
+    <w:lvlOverride w:ilvl="0">
+      <w:startOverride w:val="1"/>
+    </w:lvlOverride>
+  </w:num>
+  <w:num w:numId="15">
+    <w:abstractNumId w:val="14"/>
+    <w:lvlOverride w:ilvl="0">
+      <w:startOverride w:val="1"/>
+    </w:lvlOverride>
+  </w:num>
+  <w:num w:numId="16">
+    <w:abstractNumId w:val="15"/>
+    <w:lvlOverride w:ilvl="0">
+      <w:startOverride w:val="3"/>
+    </w:lvlOverride>
+  </w:num>
+  <w:num w:numId="17">
+    <w:abstractNumId w:val="16"/>
+    <w:lvlOverride w:ilvl="0">
+      <w:startOverride w:val="1"/>
+    </w:lvlOverride>
+  </w:num>
+  <w:num w:numId="18">
+    <w:abstractNumId w:val="17"/>
+    <w:lvlOverride w:ilvl="0">
+      <w:startOverride w:val="1"/>
+    </w:lvlOverride>
+  </w:num>
+  <w:num w:numId="19">
+    <w:abstractNumId w:val="18"/>
+    <w:lvlOverride w:ilvl="0">
+      <w:startOverride w:val="1"/>
+    </w:lvlOverride>
+  </w:num>
+  <w:num w:numId="20">
+    <w:abstractNumId w:val="19"/>
+    <w:lvlOverride w:ilvl="0">
+      <w:startOverride w:val="1"/>
+    </w:lvlOverride>
+  </w:num>
+  <w:num w:numId="21">
+    <w:abstractNumId w:val="20"/>
+    <w:lvlOverride w:ilvl="0">
+      <w:startOverride w:val="1"/>
+    </w:lvlOverride>
+  </w:num>
+  <w:num w:numId="22">
+    <w:abstractNumId w:val="21"/>
+    <w:lvlOverride w:ilvl="0">
+      <w:startOverride w:val="1"/>
+    </w:lvlOverride>
+  </w:num>
+  <w:num w:numId="23">
+    <w:abstractNumId w:val="22"/>
+    <w:lvlOverride w:ilvl="0">
+      <w:startOverride w:val="1"/>
+    </w:lvlOverride>
+  </w:num>
+  <w:num w:numId="24">
+    <w:abstractNumId w:val="23"/>
+    <w:lvlOverride w:ilvl="0">
+      <w:startOverride w:val="1"/>
+    </w:lvlOverride>
+  </w:num>
+  <w:num w:numId="25">
+    <w:abstractNumId w:val="24"/>
+    <w:lvlOverride w:ilvl="0">
+      <w:startOverride w:val="1"/>
+    </w:lvlOverride>
+  </w:num>
+  <w:num w:numId="26">
+    <w:abstractNumId w:val="25"/>
+    <w:lvlOverride w:ilvl="0">
+      <w:startOverride w:val="1"/>
+    </w:lvlOverride>
+  </w:num>
+  <w:num w:numId="27">
+    <w:abstractNumId w:val="26"/>
+    <w:lvlOverride w:ilvl="0">
+      <w:startOverride w:val="1"/>
+    </w:lvlOverride>
+  </w:num>
+  <w:num w:numId="28">
+    <w:abstractNumId w:val="27"/>
+    <w:lvlOverride w:ilvl="0">
+      <w:startOverride w:val="1"/>
+    </w:lvlOverride>
+  </w:num>
+  <w:num w:numId="29">
+    <w:abstractNumId w:val="28"/>
+    <w:lvlOverride w:ilvl="0">
+      <w:startOverride w:val="1"/>
+    </w:lvlOverride>
   </w:num>
 </w:numbering>
 </file>

</xml_diff>

<commit_message>
Support heading bookmarks and internal links in 0.3.5
</commit_message>
<xml_diff>
--- a/sample/showcase.docx
+++ b/sample/showcase.docx
@@ -6,6 +6,8 @@
       <w:pPr>
         <w:pStyle w:val="Heading1"/>
       </w:pPr>
+      <w:bookmarkStart w:id="0" w:name="md_6d2c162b238518bdfea0648721ee"/>
+      <w:bookmarkEnd w:id="0"/>
       <w:r>
         <w:rPr/>
         <w:t>The Great Lunch Bag Chase</w:t>
@@ -146,6 +148,8 @@
       <w:pPr>
         <w:pStyle w:val="Heading2"/>
       </w:pPr>
+      <w:bookmarkStart w:id="1" w:name="md_8c584b456d8d90dcc448ef84def6"/>
+      <w:bookmarkEnd w:id="1"/>
       <w:r>
         <w:rPr/>
         <w:t>Chapter One: A Bag on the Breeze</w:t>
@@ -282,6 +286,8 @@
       <w:pPr>
         <w:pStyle w:val="Heading2"/>
       </w:pPr>
+      <w:bookmarkStart w:id="2" w:name="md_d2e711003e0f3a9dfec7933964cf"/>
+      <w:bookmarkEnd w:id="2"/>
       <w:r>
         <w:rPr/>
         <w:t>Chapter Two: The Wagon Problem</w:t>
@@ -461,6 +467,8 @@
       <w:pPr>
         <w:pStyle w:val="Heading2"/>
       </w:pPr>
+      <w:bookmarkStart w:id="3" w:name="md_3048ad2377d4ca1f681304d0e464"/>
+      <w:bookmarkEnd w:id="3"/>
       <w:r>
         <w:rPr/>
         <w:t>Chapter Three: Innocent Until Dinner</w:t>
@@ -851,6 +859,8 @@
       <w:pPr>
         <w:pStyle w:val="Heading1"/>
       </w:pPr>
+      <w:bookmarkStart w:id="4" w:name="md_77810967038c4da87ebcf8cd754c"/>
+      <w:bookmarkEnd w:id="4"/>
       <w:r>
         <w:rPr/>
         <w:t>Capability Lab</w:t>
@@ -877,6 +887,8 @@
       <w:pPr>
         <w:pStyle w:val="Heading2"/>
       </w:pPr>
+      <w:bookmarkStart w:id="5" w:name="md_e29913ac8f344124a37344916859"/>
+      <w:bookmarkEnd w:id="5"/>
       <w:r>
         <w:rPr/>
         <w:t>Text and hierarchy</w:t>
@@ -948,6 +960,8 @@
       <w:pPr>
         <w:pStyle w:val="Heading3"/>
       </w:pPr>
+      <w:bookmarkStart w:id="6" w:name="md_19560e5152ba5633d4328eeaf09e"/>
+      <w:bookmarkEnd w:id="6"/>
       <w:r>
         <w:rPr/>
         <w:t>Heading level three</w:t>
@@ -957,6 +971,8 @@
       <w:pPr>
         <w:pStyle w:val="Heading4"/>
       </w:pPr>
+      <w:bookmarkStart w:id="7" w:name="md_0b11f9a7106048df0ef5d3464f9d"/>
+      <w:bookmarkEnd w:id="7"/>
       <w:r>
         <w:rPr/>
         <w:t>Heading level four</w:t>
@@ -966,6 +982,8 @@
       <w:pPr>
         <w:pStyle w:val="Heading5"/>
       </w:pPr>
+      <w:bookmarkStart w:id="8" w:name="md_b0c920238f01011be62993f6f895"/>
+      <w:bookmarkEnd w:id="8"/>
       <w:r>
         <w:rPr/>
         <w:t>Heading level five</w:t>
@@ -975,6 +993,8 @@
       <w:pPr>
         <w:pStyle w:val="Heading6"/>
       </w:pPr>
+      <w:bookmarkStart w:id="9" w:name="md_1ce1922a5e8ad230dc6b5ac39693"/>
+      <w:bookmarkEnd w:id="9"/>
       <w:r>
         <w:rPr/>
         <w:t>Heading level six</w:t>
@@ -1012,6 +1032,8 @@
       <w:pPr>
         <w:pStyle w:val="Heading2"/>
       </w:pPr>
+      <w:bookmarkStart w:id="10" w:name="md_e782f36a97b4acda8ab01a4dd294"/>
+      <w:bookmarkEnd w:id="10"/>
       <w:r>
         <w:rPr/>
         <w:t>Fenced code</w:t>
@@ -1038,9 +1060,26 @@
       </w:r>
     </w:p>
     <w:p>
+      <w:pPr/>
+      <w:hyperlink w:anchor="md_64d072884695e541eaca3f6db85c">
+        <w:r>
+          <w:rPr>
+            <w:rStyle w:val="Hyperlink"/>
+          </w:rPr>
+          <w:t>Jump to list kinds and depths</w:t>
+        </w:r>
+      </w:hyperlink>
+      <w:r>
+        <w:rPr/>
+        <w:t>.</w:t>
+      </w:r>
+    </w:p>
+    <w:p>
       <w:pPr>
         <w:pStyle w:val="Heading2"/>
       </w:pPr>
+      <w:bookmarkStart w:id="11" w:name="md_fc7accb762a496c79519fba735f9"/>
+      <w:bookmarkEnd w:id="11"/>
       <w:r>
         <w:rPr/>
         <w:t>List starts and continuation paragraphs</w:t>
@@ -1112,6 +1151,8 @@
       <w:pPr>
         <w:pStyle w:val="Heading2"/>
       </w:pPr>
+      <w:bookmarkStart w:id="12" w:name="md_64d072884695e541eaca3f6db85c"/>
+      <w:bookmarkEnd w:id="12"/>
       <w:r>
         <w:rPr/>
         <w:t>List kinds and depths</w:t>
@@ -1289,6 +1330,8 @@
       <w:pPr>
         <w:pStyle w:val="Heading1"/>
       </w:pPr>
+      <w:bookmarkStart w:id="13" w:name="md_4e45b09e0dac07d9d9474bd6a825"/>
+      <w:bookmarkEnd w:id="13"/>
       <w:r>
         <w:rPr/>
         <w:t>A4 Layout Lab</w:t>
@@ -1568,6 +1611,8 @@
       <w:pPr>
         <w:pStyle w:val="Heading1"/>
       </w:pPr>
+      <w:bookmarkStart w:id="14" w:name="md_1bf6c18defbb212aebe8b6ce6927"/>
+      <w:bookmarkEnd w:id="14"/>
       <w:r>
         <w:rPr/>
         <w:t>Legal Landscape Lab</w:t>
@@ -1829,6 +1874,8 @@
       <w:pPr>
         <w:pStyle w:val="Heading1"/>
       </w:pPr>
+      <w:bookmarkStart w:id="15" w:name="md_a009503c39a92748e3d467d7c61a"/>
+      <w:bookmarkEnd w:id="15"/>
       <w:r>
         <w:rPr/>
         <w:t>Custom Page Lab</w:t>
@@ -1884,6 +1931,8 @@
       <w:pPr>
         <w:pStyle w:val="Heading2"/>
       </w:pPr>
+      <w:bookmarkStart w:id="16" w:name="md_f383a0d0b844d9b00681969c334c"/>
+      <w:bookmarkEnd w:id="16"/>
       <w:r>
         <w:rPr/>
         <w:t>Environment-dependent coverage</w:t>
@@ -2013,6 +2062,8 @@
       <w:pPr>
         <w:pStyle w:val="Heading1"/>
       </w:pPr>
+      <w:bookmarkStart w:id="17" w:name="md_ac49b03d58a09e1d112171499dfe"/>
+      <w:bookmarkEnd w:id="17"/>
       <w:r>
         <w:rPr/>
         <w:t>Back to Document Defaults</w:t>
@@ -2258,7 +2309,7 @@
     </w:lvl>
   </w:abstractNum>
   <w:abstractNum w:abstractNumId="9">
-    <w:nsid w:val="4D14D51D"/>
+    <w:nsid w:val="CF39BE32"/>
     <w:multiLevelType w:val="singleLevel"/>
     <w:tmpl w:val="29761A62"/>
     <w:lvl w:ilvl="0">
@@ -2279,7 +2330,7 @@
     </w:lvl>
   </w:abstractNum>
   <w:abstractNum w:abstractNumId="10">
-    <w:nsid w:val="2F1180E2"/>
+    <w:nsid w:val="7395C393"/>
     <w:multiLevelType w:val="singleLevel"/>
     <w:tmpl w:val="29761A62"/>
     <w:lvl w:ilvl="0">
@@ -2300,7 +2351,7 @@
     </w:lvl>
   </w:abstractNum>
   <w:abstractNum w:abstractNumId="11">
-    <w:nsid w:val="E2C50B8B"/>
+    <w:nsid w:val="F7A2B6D2"/>
     <w:multiLevelType w:val="singleLevel"/>
     <w:tmpl w:val="3D1EFFD4"/>
     <w:lvl w:ilvl="0">
@@ -2321,7 +2372,7 @@
     </w:lvl>
   </w:abstractNum>
   <w:abstractNum w:abstractNumId="12">
-    <w:nsid w:val="CE9CB24A"/>
+    <w:nsid w:val="0C8150D7"/>
     <w:multiLevelType w:val="singleLevel"/>
     <w:tmpl w:val="F3EAFDEC"/>
     <w:lvl w:ilvl="0">
@@ -2342,7 +2393,7 @@
     </w:lvl>
   </w:abstractNum>
   <w:abstractNum w:abstractNumId="13">
-    <w:nsid w:val="C7E8C989"/>
+    <w:nsid w:val="990B181C"/>
     <w:multiLevelType w:val="singleLevel"/>
     <w:tmpl w:val="3D1EFFD4"/>
     <w:lvl w:ilvl="0">
@@ -2363,7 +2414,7 @@
     </w:lvl>
   </w:abstractNum>
   <w:abstractNum w:abstractNumId="14">
-    <w:nsid w:val="06D9F2E1"/>
+    <w:nsid w:val="4C6DA3B4"/>
     <w:multiLevelType w:val="singleLevel"/>
     <w:tmpl w:val="F3EAFDEC"/>
     <w:lvl w:ilvl="0">
@@ -2384,7 +2435,7 @@
     </w:lvl>
   </w:abstractNum>
   <w:abstractNum w:abstractNumId="15">
-    <w:nsid w:val="79D57026"/>
+    <w:nsid w:val="30FBEC5B"/>
     <w:multiLevelType w:val="singleLevel"/>
     <w:tmpl w:val="D0A62B40"/>
     <w:lvl w:ilvl="0">
@@ -2402,7 +2453,7 @@
     </w:lvl>
   </w:abstractNum>
   <w:abstractNum w:abstractNumId="16">
-    <w:nsid w:val="D18DD15F"/>
+    <w:nsid w:val="D27581CA"/>
     <w:multiLevelType w:val="singleLevel"/>
     <w:tmpl w:val="D0A62B40"/>
     <w:lvl w:ilvl="0">
@@ -2420,7 +2471,7 @@
     </w:lvl>
   </w:abstractNum>
   <w:abstractNum w:abstractNumId="17">
-    <w:nsid w:val="833CD3CB"/>
+    <w:nsid w:val="C876B002"/>
     <w:multiLevelType w:val="singleLevel"/>
     <w:tmpl w:val="29761A62"/>
     <w:lvl w:ilvl="0">
@@ -2441,7 +2492,7 @@
     </w:lvl>
   </w:abstractNum>
   <w:abstractNum w:abstractNumId="18">
-    <w:nsid w:val="861A49FE"/>
+    <w:nsid w:val="1C762E66"/>
     <w:multiLevelType w:val="singleLevel"/>
     <w:tmpl w:val="3D1EFFD4"/>
     <w:lvl w:ilvl="0">
@@ -2462,7 +2513,7 @@
     </w:lvl>
   </w:abstractNum>
   <w:abstractNum w:abstractNumId="19">
-    <w:nsid w:val="23051C86"/>
+    <w:nsid w:val="91C1E598"/>
     <w:multiLevelType w:val="singleLevel"/>
     <w:tmpl w:val="F3EAFDEC"/>
     <w:lvl w:ilvl="0">
@@ -2483,7 +2534,7 @@
     </w:lvl>
   </w:abstractNum>
   <w:abstractNum w:abstractNumId="20">
-    <w:nsid w:val="3205DD49"/>
+    <w:nsid w:val="91962A76"/>
     <w:multiLevelType w:val="singleLevel"/>
     <w:tmpl w:val="D0A62B40"/>
     <w:lvl w:ilvl="0">
@@ -2501,7 +2552,7 @@
     </w:lvl>
   </w:abstractNum>
   <w:abstractNum w:abstractNumId="21">
-    <w:nsid w:val="38C31660"/>
+    <w:nsid w:val="C5534E81"/>
     <w:multiLevelType w:val="singleLevel"/>
     <w:tmpl w:val="38441652"/>
     <w:lvl w:ilvl="0">
@@ -2519,7 +2570,7 @@
     </w:lvl>
   </w:abstractNum>
   <w:abstractNum w:abstractNumId="22">
-    <w:nsid w:val="72EDE54E"/>
+    <w:nsid w:val="346E425C"/>
     <w:multiLevelType w:val="singleLevel"/>
     <w:tmpl w:val="FB12693A"/>
     <w:lvl w:ilvl="0">
@@ -2537,7 +2588,7 @@
     </w:lvl>
   </w:abstractNum>
   <w:abstractNum w:abstractNumId="23">
-    <w:nsid w:val="2D070345"/>
+    <w:nsid w:val="7DDAC22C"/>
     <w:multiLevelType w:val="singleLevel"/>
     <w:tmpl w:val="29761A62"/>
     <w:lvl w:ilvl="0">
@@ -2558,7 +2609,7 @@
     </w:lvl>
   </w:abstractNum>
   <w:abstractNum w:abstractNumId="24">
-    <w:nsid w:val="1E95158A"/>
+    <w:nsid w:val="71678F79"/>
     <w:multiLevelType w:val="singleLevel"/>
     <w:tmpl w:val="38441652"/>
     <w:lvl w:ilvl="0">
@@ -2576,7 +2627,7 @@
     </w:lvl>
   </w:abstractNum>
   <w:abstractNum w:abstractNumId="25">
-    <w:nsid w:val="871B4E87"/>
+    <w:nsid w:val="AA9A0079"/>
     <w:multiLevelType w:val="singleLevel"/>
     <w:tmpl w:val="FB12693A"/>
     <w:lvl w:ilvl="0">
@@ -2594,7 +2645,7 @@
     </w:lvl>
   </w:abstractNum>
   <w:abstractNum w:abstractNumId="26">
-    <w:nsid w:val="F25310E3"/>
+    <w:nsid w:val="BF50B4C6"/>
     <w:multiLevelType w:val="singleLevel"/>
     <w:tmpl w:val="D0A62B40"/>
     <w:lvl w:ilvl="0">
@@ -2612,7 +2663,7 @@
     </w:lvl>
   </w:abstractNum>
   <w:abstractNum w:abstractNumId="27">
-    <w:nsid w:val="B092C3C2"/>
+    <w:nsid w:val="AC48CE44"/>
     <w:multiLevelType w:val="singleLevel"/>
     <w:tmpl w:val="3D1EFFD4"/>
     <w:lvl w:ilvl="0">
@@ -2633,7 +2684,7 @@
     </w:lvl>
   </w:abstractNum>
   <w:abstractNum w:abstractNumId="28">
-    <w:nsid w:val="FD2260A8"/>
+    <w:nsid w:val="6219AC6F"/>
     <w:multiLevelType w:val="singleLevel"/>
     <w:tmpl w:val="F3EAFDEC"/>
     <w:lvl w:ilvl="0">

</xml_diff>

<commit_message>
Support native Markdown footnotes in 0.3.6
</commit_message>
<xml_diff>
--- a/sample/showcase.docx
+++ b/sample/showcase.docx
@@ -2105,6 +2105,35 @@
         <w:t xml:space="preserve"> for more examples.</w:t>
       </w:r>
     </w:p>
+    <w:p>
+      <w:pPr>
+        <w:pStyle w:val="Heading2"/>
+      </w:pPr>
+      <w:bookmarkStart w:id="18" w:name="md_9652f0b201e92db1e8d62a4c5b77"/>
+      <w:bookmarkEnd w:id="18"/>
+      <w:r>
+        <w:rPr/>
+        <w:t>Native footnotes</w:t>
+      </w:r>
+    </w:p>
+    <w:p>
+      <w:pPr/>
+      <w:r>
+        <w:rPr/>
+        <w:t>This statement has an editable Word footnote</w:t>
+      </w:r>
+      <w:r/>
+      <w:r>
+        <w:rPr>
+          <w:rStyle w:val="FootnoteReference"/>
+        </w:rPr>
+        <w:footnoteReference w:id="1"/>
+      </w:r>
+      <w:r>
+        <w:rPr/>
+        <w:t>.</w:t>
+      </w:r>
+    </w:p>
     <w:sectPr>
       <w:pgSz w:w="12240" w:h="15840"/>
       <w:pgMar w:top="1224" w:right="1296" w:bottom="1224" w:left="1296" w:header="708" w:footer="708" w:gutter="0"/>
@@ -2123,6 +2152,77 @@
     </w:pPr>
   </w:p>
 </w:ftr>
+</file>
+
+<file path=word/footnotes1.xml><?xml version="1.0" encoding="utf-8"?>
+<w:footnotes xmlns:w="http://schemas.openxmlformats.org/wordprocessingml/2006/main">
+  <w:footnote w:type="separator" w:id="-1">
+    <w:p>
+      <w:r>
+        <w:separator/>
+      </w:r>
+    </w:p>
+  </w:footnote>
+  <w:footnote w:type="continuationSeparator" w:id="0">
+    <w:p>
+      <w:r>
+        <w:continuationSeparator/>
+      </w:r>
+    </w:p>
+  </w:footnote>
+  <w:footnote w:id="1">
+    <w:p>
+      <w:pPr>
+        <w:pStyle w:val="FootnoteText"/>
+      </w:pPr>
+      <w:r>
+        <w:rPr>
+          <w:rStyle w:val="FootnoteReference"/>
+        </w:rPr>
+        <w:footnoteRef/>
+      </w:r>
+      <w:r>
+        <w:t xml:space="preserve"> </w:t>
+      </w:r>
+      <w:r/>
+      <w:r>
+        <w:rPr/>
+        <w:t xml:space="preserve">A </w:t>
+      </w:r>
+      <w:r>
+        <w:rPr>
+          <w:b/>
+        </w:rPr>
+        <w:t>formatted</w:t>
+      </w:r>
+      <w:r>
+        <w:rPr/>
+        <w:t xml:space="preserve"> explanation with a </w:t>
+      </w:r>
+      <w:hyperlink xmlns:ns0="http://schemas.openxmlformats.org/officeDocument/2006/relationships" ns0:id="rId1">
+        <w:r>
+          <w:rPr>
+            <w:rStyle w:val="Hyperlink"/>
+          </w:rPr>
+          <w:t>reference link</w:t>
+        </w:r>
+      </w:hyperlink>
+      <w:r>
+        <w:rPr/>
+        <w:t>.</w:t>
+      </w:r>
+    </w:p>
+    <w:p>
+      <w:pPr>
+        <w:pStyle w:val="FootnoteText"/>
+      </w:pPr>
+      <w:r>
+        <w:rPr/>
+        <w:t>A second paragraph keeps the note content together.</w:t>
+      </w:r>
+    </w:p>
+  </w:footnote>
+</w:footnotes>
 </file>
 
 <file path=word/header1.xml><?xml version="1.0" encoding="utf-8"?>
@@ -2309,7 +2409,7 @@
     </w:lvl>
   </w:abstractNum>
   <w:abstractNum w:abstractNumId="9">
-    <w:nsid w:val="CF39BE32"/>
+    <w:nsid w:val="3374A28D"/>
     <w:multiLevelType w:val="singleLevel"/>
     <w:tmpl w:val="29761A62"/>
     <w:lvl w:ilvl="0">
@@ -2330,7 +2430,7 @@
     </w:lvl>
   </w:abstractNum>
   <w:abstractNum w:abstractNumId="10">
-    <w:nsid w:val="7395C393"/>
+    <w:nsid w:val="72FB053B"/>
     <w:multiLevelType w:val="singleLevel"/>
     <w:tmpl w:val="29761A62"/>
     <w:lvl w:ilvl="0">
@@ -2351,7 +2451,7 @@
     </w:lvl>
   </w:abstractNum>
   <w:abstractNum w:abstractNumId="11">
-    <w:nsid w:val="F7A2B6D2"/>
+    <w:nsid w:val="EA6F3483"/>
     <w:multiLevelType w:val="singleLevel"/>
     <w:tmpl w:val="3D1EFFD4"/>
     <w:lvl w:ilvl="0">
@@ -2372,7 +2472,7 @@
     </w:lvl>
   </w:abstractNum>
   <w:abstractNum w:abstractNumId="12">
-    <w:nsid w:val="0C8150D7"/>
+    <w:nsid w:val="B89DEEE7"/>
     <w:multiLevelType w:val="singleLevel"/>
     <w:tmpl w:val="F3EAFDEC"/>
     <w:lvl w:ilvl="0">
@@ -2393,7 +2493,7 @@
     </w:lvl>
   </w:abstractNum>
   <w:abstractNum w:abstractNumId="13">
-    <w:nsid w:val="990B181C"/>
+    <w:nsid w:val="93448E71"/>
     <w:multiLevelType w:val="singleLevel"/>
     <w:tmpl w:val="3D1EFFD4"/>
     <w:lvl w:ilvl="0">
@@ -2414,7 +2514,7 @@
     </w:lvl>
   </w:abstractNum>
   <w:abstractNum w:abstractNumId="14">
-    <w:nsid w:val="4C6DA3B4"/>
+    <w:nsid w:val="1D6B4590"/>
     <w:multiLevelType w:val="singleLevel"/>
     <w:tmpl w:val="F3EAFDEC"/>
     <w:lvl w:ilvl="0">
@@ -2435,7 +2535,7 @@
     </w:lvl>
   </w:abstractNum>
   <w:abstractNum w:abstractNumId="15">
-    <w:nsid w:val="30FBEC5B"/>
+    <w:nsid w:val="D344993D"/>
     <w:multiLevelType w:val="singleLevel"/>
     <w:tmpl w:val="D0A62B40"/>
     <w:lvl w:ilvl="0">
@@ -2453,7 +2553,7 @@
     </w:lvl>
   </w:abstractNum>
   <w:abstractNum w:abstractNumId="16">
-    <w:nsid w:val="D27581CA"/>
+    <w:nsid w:val="3F433C9D"/>
     <w:multiLevelType w:val="singleLevel"/>
     <w:tmpl w:val="D0A62B40"/>
     <w:lvl w:ilvl="0">
@@ -2471,7 +2571,7 @@
     </w:lvl>
   </w:abstractNum>
   <w:abstractNum w:abstractNumId="17">
-    <w:nsid w:val="C876B002"/>
+    <w:nsid w:val="1E29EA6F"/>
     <w:multiLevelType w:val="singleLevel"/>
     <w:tmpl w:val="29761A62"/>
     <w:lvl w:ilvl="0">
@@ -2492,7 +2592,7 @@
     </w:lvl>
   </w:abstractNum>
   <w:abstractNum w:abstractNumId="18">
-    <w:nsid w:val="1C762E66"/>
+    <w:nsid w:val="77E6EA4E"/>
     <w:multiLevelType w:val="singleLevel"/>
     <w:tmpl w:val="3D1EFFD4"/>
     <w:lvl w:ilvl="0">
@@ -2513,7 +2613,7 @@
     </w:lvl>
   </w:abstractNum>
   <w:abstractNum w:abstractNumId="19">
-    <w:nsid w:val="91C1E598"/>
+    <w:nsid w:val="ED6E238E"/>
     <w:multiLevelType w:val="singleLevel"/>
     <w:tmpl w:val="F3EAFDEC"/>
     <w:lvl w:ilvl="0">
@@ -2534,7 +2634,7 @@
     </w:lvl>
   </w:abstractNum>
   <w:abstractNum w:abstractNumId="20">
-    <w:nsid w:val="91962A76"/>
+    <w:nsid w:val="B2A606E2"/>
     <w:multiLevelType w:val="singleLevel"/>
     <w:tmpl w:val="D0A62B40"/>
     <w:lvl w:ilvl="0">
@@ -2552,7 +2652,7 @@
     </w:lvl>
   </w:abstractNum>
   <w:abstractNum w:abstractNumId="21">
-    <w:nsid w:val="C5534E81"/>
+    <w:nsid w:val="0B40F406"/>
     <w:multiLevelType w:val="singleLevel"/>
     <w:tmpl w:val="38441652"/>
     <w:lvl w:ilvl="0">
@@ -2570,7 +2670,7 @@
     </w:lvl>
   </w:abstractNum>
   <w:abstractNum w:abstractNumId="22">
-    <w:nsid w:val="346E425C"/>
+    <w:nsid w:val="5A852113"/>
     <w:multiLevelType w:val="singleLevel"/>
     <w:tmpl w:val="FB12693A"/>
     <w:lvl w:ilvl="0">
@@ -2588,7 +2688,7 @@
     </w:lvl>
   </w:abstractNum>
   <w:abstractNum w:abstractNumId="23">
-    <w:nsid w:val="7DDAC22C"/>
+    <w:nsid w:val="75C0FA19"/>
     <w:multiLevelType w:val="singleLevel"/>
     <w:tmpl w:val="29761A62"/>
     <w:lvl w:ilvl="0">
@@ -2609,7 +2709,7 @@
     </w:lvl>
   </w:abstractNum>
   <w:abstractNum w:abstractNumId="24">
-    <w:nsid w:val="71678F79"/>
+    <w:nsid w:val="3ACE69FF"/>
     <w:multiLevelType w:val="singleLevel"/>
     <w:tmpl w:val="38441652"/>
     <w:lvl w:ilvl="0">
@@ -2627,7 +2727,7 @@
     </w:lvl>
   </w:abstractNum>
   <w:abstractNum w:abstractNumId="25">
-    <w:nsid w:val="AA9A0079"/>
+    <w:nsid w:val="24157515"/>
     <w:multiLevelType w:val="singleLevel"/>
     <w:tmpl w:val="FB12693A"/>
     <w:lvl w:ilvl="0">
@@ -2645,7 +2745,7 @@
     </w:lvl>
   </w:abstractNum>
   <w:abstractNum w:abstractNumId="26">
-    <w:nsid w:val="BF50B4C6"/>
+    <w:nsid w:val="E55CA3F2"/>
     <w:multiLevelType w:val="singleLevel"/>
     <w:tmpl w:val="D0A62B40"/>
     <w:lvl w:ilvl="0">
@@ -2663,7 +2763,7 @@
     </w:lvl>
   </w:abstractNum>
   <w:abstractNum w:abstractNumId="27">
-    <w:nsid w:val="AC48CE44"/>
+    <w:nsid w:val="D8EF3811"/>
     <w:multiLevelType w:val="singleLevel"/>
     <w:tmpl w:val="3D1EFFD4"/>
     <w:lvl w:ilvl="0">
@@ -2684,7 +2784,7 @@
     </w:lvl>
   </w:abstractNum>
   <w:abstractNum w:abstractNumId="28">
-    <w:nsid w:val="6219AC6F"/>
+    <w:nsid w:val="F90E2761"/>
     <w:multiLevelType w:val="singleLevel"/>
     <w:tmpl w:val="F3EAFDEC"/>
     <w:lvl w:ilvl="0">
@@ -14762,6 +14862,16 @@
     <w:rPr>
       <w:color w:val="000000" w:themeColor="hyperlink"/>
       <w:u w:val="single"/>
+    </w:rPr>
+  </w:style>
+  <w:style w:type="paragraph" w:styleId="FootnoteText">
+    <w:name w:val="Footnote Text"/>
+    <w:basedOn w:val="Normal"/>
+  </w:style>
+  <w:style w:type="character" w:styleId="FootnoteReference">
+    <w:name w:val="Footnote Reference"/>
+    <w:rPr>
+      <w:vertAlign w:val="superscript"/>
     </w:rPr>
   </w:style>
 </w:styles>

</xml_diff>

<commit_message>
Repeat Markdown table headers by default in 0.3.7
</commit_message>
<xml_diff>
--- a/sample/showcase.docx
+++ b/sample/showcase.docx
@@ -542,6 +542,9 @@
         <w:gridCol w:w="2721"/>
       </w:tblGrid>
       <w:tr>
+        <w:trPr>
+          <w:tblHeader/>
+        </w:trPr>
         <w:tc>
           <w:tcPr>
             <w:tcW w:type="dxa" w:w="1484"/>
@@ -1357,6 +1360,9 @@
         <w:gridCol w:w="4933"/>
       </w:tblGrid>
       <w:tr>
+        <w:trPr>
+          <w:tblHeader/>
+        </w:trPr>
         <w:tc>
           <w:tcPr>
             <w:tcW w:type="dxa" w:w="4933"/>
@@ -1640,6 +1646,9 @@
         <w:gridCol w:w="4615"/>
       </w:tblGrid>
       <w:tr>
+        <w:trPr>
+          <w:tblHeader/>
+        </w:trPr>
         <w:tc>
           <w:tcPr>
             <w:tcW w:type="dxa" w:w="4615"/>
@@ -1958,6 +1967,9 @@
         <w:gridCol w:w="5280"/>
       </w:tblGrid>
       <w:tr>
+        <w:trPr>
+          <w:tblHeader/>
+        </w:trPr>
         <w:tc>
           <w:tcPr>
             <w:tcW w:type="dxa" w:w="2640"/>
@@ -2134,6 +2146,130 @@
         <w:t>.</w:t>
       </w:r>
     </w:p>
+    <w:p>
+      <w:pPr>
+        <w:pStyle w:val="Heading2"/>
+      </w:pPr>
+      <w:bookmarkStart w:id="19" w:name="md_03a6d15b03b1c0e43eb5c060ff2b"/>
+      <w:bookmarkEnd w:id="19"/>
+      <w:r>
+        <w:rPr/>
+        <w:t>Repeating table headers</w:t>
+      </w:r>
+    </w:p>
+    <w:p>
+      <w:pPr/>
+      <w:r>
+        <w:rPr/>
+        <w:t>Pipe-table headers repeat automatically when their table spans pages. Body rows retain their normal behavior.</w:t>
+      </w:r>
+    </w:p>
+    <w:tbl>
+      <w:tblPr>
+        <w:tblStyle w:val="TableGrid"/>
+        <w:tblW w:type="auto" w:w="0"/>
+        <w:jc w:val="left"/>
+        <w:tblLayout w:type="fixed"/>
+        <w:tblLook w:firstColumn="1" w:firstRow="1" w:lastColumn="0" w:lastRow="0" w:noHBand="0" w:noVBand="1" w:val="04A0"/>
+      </w:tblPr>
+      <w:tblGrid>
+        <w:gridCol w:w="4824"/>
+        <w:gridCol w:w="4824"/>
+      </w:tblGrid>
+      <w:tr>
+        <w:trPr>
+          <w:tblHeader/>
+        </w:trPr>
+        <w:tc>
+          <w:tcPr>
+            <w:tcW w:type="dxa" w:w="4824"/>
+          </w:tcPr>
+          <w:p>
+            <w:pPr>
+              <w:jc w:val="left"/>
+            </w:pPr>
+            <w:r>
+              <w:rPr/>
+              <w:t>Capability</w:t>
+            </w:r>
+          </w:p>
+        </w:tc>
+        <w:tc>
+          <w:tcPr>
+            <w:tcW w:type="dxa" w:w="4824"/>
+          </w:tcPr>
+          <w:p>
+            <w:pPr>
+              <w:jc w:val="left"/>
+            </w:pPr>
+            <w:r>
+              <w:rPr/>
+              <w:t>Behavior</w:t>
+            </w:r>
+          </w:p>
+        </w:tc>
+      </w:tr>
+      <w:tr>
+        <w:tc>
+          <w:tcPr>
+            <w:tcW w:type="dxa" w:w="4824"/>
+          </w:tcPr>
+          <w:p>
+            <w:pPr>
+              <w:jc w:val="left"/>
+            </w:pPr>
+            <w:r>
+              <w:rPr/>
+              <w:t>Header row</w:t>
+            </w:r>
+          </w:p>
+        </w:tc>
+        <w:tc>
+          <w:tcPr>
+            <w:tcW w:type="dxa" w:w="4824"/>
+          </w:tcPr>
+          <w:p>
+            <w:pPr>
+              <w:jc w:val="left"/>
+            </w:pPr>
+            <w:r>
+              <w:rPr/>
+              <w:t>Repeats on later table pages</w:t>
+            </w:r>
+          </w:p>
+        </w:tc>
+      </w:tr>
+      <w:tr>
+        <w:tc>
+          <w:tcPr>
+            <w:tcW w:type="dxa" w:w="4824"/>
+          </w:tcPr>
+          <w:p>
+            <w:pPr>
+              <w:jc w:val="left"/>
+            </w:pPr>
+            <w:r>
+              <w:rPr/>
+              <w:t>Body row</w:t>
+            </w:r>
+          </w:p>
+        </w:tc>
+        <w:tc>
+          <w:tcPr>
+            <w:tcW w:type="dxa" w:w="4824"/>
+          </w:tcPr>
+          <w:p>
+            <w:pPr>
+              <w:jc w:val="left"/>
+            </w:pPr>
+            <w:r>
+              <w:rPr/>
+              <w:t>Appears once</w:t>
+            </w:r>
+          </w:p>
+        </w:tc>
+      </w:tr>
+    </w:tbl>
     <w:sectPr>
       <w:pgSz w:w="12240" w:h="15840"/>
       <w:pgMar w:top="1224" w:right="1296" w:bottom="1224" w:left="1296" w:header="708" w:footer="708" w:gutter="0"/>
@@ -2409,7 +2545,7 @@
     </w:lvl>
   </w:abstractNum>
   <w:abstractNum w:abstractNumId="9">
-    <w:nsid w:val="3374A28D"/>
+    <w:nsid w:val="DCF662F9"/>
     <w:multiLevelType w:val="singleLevel"/>
     <w:tmpl w:val="29761A62"/>
     <w:lvl w:ilvl="0">
@@ -2430,7 +2566,7 @@
     </w:lvl>
   </w:abstractNum>
   <w:abstractNum w:abstractNumId="10">
-    <w:nsid w:val="72FB053B"/>
+    <w:nsid w:val="E9CE19DF"/>
     <w:multiLevelType w:val="singleLevel"/>
     <w:tmpl w:val="29761A62"/>
     <w:lvl w:ilvl="0">
@@ -2451,7 +2587,7 @@
     </w:lvl>
   </w:abstractNum>
   <w:abstractNum w:abstractNumId="11">
-    <w:nsid w:val="EA6F3483"/>
+    <w:nsid w:val="151B407E"/>
     <w:multiLevelType w:val="singleLevel"/>
     <w:tmpl w:val="3D1EFFD4"/>
     <w:lvl w:ilvl="0">
@@ -2472,7 +2608,7 @@
     </w:lvl>
   </w:abstractNum>
   <w:abstractNum w:abstractNumId="12">
-    <w:nsid w:val="B89DEEE7"/>
+    <w:nsid w:val="375DA032"/>
     <w:multiLevelType w:val="singleLevel"/>
     <w:tmpl w:val="F3EAFDEC"/>
     <w:lvl w:ilvl="0">
@@ -2493,7 +2629,7 @@
     </w:lvl>
   </w:abstractNum>
   <w:abstractNum w:abstractNumId="13">
-    <w:nsid w:val="93448E71"/>
+    <w:nsid w:val="4B816001"/>
     <w:multiLevelType w:val="singleLevel"/>
     <w:tmpl w:val="3D1EFFD4"/>
     <w:lvl w:ilvl="0">
@@ -2514,7 +2650,7 @@
     </w:lvl>
   </w:abstractNum>
   <w:abstractNum w:abstractNumId="14">
-    <w:nsid w:val="1D6B4590"/>
+    <w:nsid w:val="9E79B3A4"/>
     <w:multiLevelType w:val="singleLevel"/>
     <w:tmpl w:val="F3EAFDEC"/>
     <w:lvl w:ilvl="0">
@@ -2535,7 +2671,7 @@
     </w:lvl>
   </w:abstractNum>
   <w:abstractNum w:abstractNumId="15">
-    <w:nsid w:val="D344993D"/>
+    <w:nsid w:val="30AB818F"/>
     <w:multiLevelType w:val="singleLevel"/>
     <w:tmpl w:val="D0A62B40"/>
     <w:lvl w:ilvl="0">
@@ -2553,7 +2689,7 @@
     </w:lvl>
   </w:abstractNum>
   <w:abstractNum w:abstractNumId="16">
-    <w:nsid w:val="3F433C9D"/>
+    <w:nsid w:val="BFD8D6B4"/>
     <w:multiLevelType w:val="singleLevel"/>
     <w:tmpl w:val="D0A62B40"/>
     <w:lvl w:ilvl="0">
@@ -2571,7 +2707,7 @@
     </w:lvl>
   </w:abstractNum>
   <w:abstractNum w:abstractNumId="17">
-    <w:nsid w:val="1E29EA6F"/>
+    <w:nsid w:val="D0E3FFD5"/>
     <w:multiLevelType w:val="singleLevel"/>
     <w:tmpl w:val="29761A62"/>
     <w:lvl w:ilvl="0">
@@ -2592,7 +2728,7 @@
     </w:lvl>
   </w:abstractNum>
   <w:abstractNum w:abstractNumId="18">
-    <w:nsid w:val="77E6EA4E"/>
+    <w:nsid w:val="343438A9"/>
     <w:multiLevelType w:val="singleLevel"/>
     <w:tmpl w:val="3D1EFFD4"/>
     <w:lvl w:ilvl="0">
@@ -2613,7 +2749,7 @@
     </w:lvl>
   </w:abstractNum>
   <w:abstractNum w:abstractNumId="19">
-    <w:nsid w:val="ED6E238E"/>
+    <w:nsid w:val="9B215FE1"/>
     <w:multiLevelType w:val="singleLevel"/>
     <w:tmpl w:val="F3EAFDEC"/>
     <w:lvl w:ilvl="0">
@@ -2634,7 +2770,7 @@
     </w:lvl>
   </w:abstractNum>
   <w:abstractNum w:abstractNumId="20">
-    <w:nsid w:val="B2A606E2"/>
+    <w:nsid w:val="85A179DE"/>
     <w:multiLevelType w:val="singleLevel"/>
     <w:tmpl w:val="D0A62B40"/>
     <w:lvl w:ilvl="0">
@@ -2652,7 +2788,7 @@
     </w:lvl>
   </w:abstractNum>
   <w:abstractNum w:abstractNumId="21">
-    <w:nsid w:val="0B40F406"/>
+    <w:nsid w:val="2A1F6650"/>
     <w:multiLevelType w:val="singleLevel"/>
     <w:tmpl w:val="38441652"/>
     <w:lvl w:ilvl="0">
@@ -2670,7 +2806,7 @@
     </w:lvl>
   </w:abstractNum>
   <w:abstractNum w:abstractNumId="22">
-    <w:nsid w:val="5A852113"/>
+    <w:nsid w:val="7FD54F68"/>
     <w:multiLevelType w:val="singleLevel"/>
     <w:tmpl w:val="FB12693A"/>
     <w:lvl w:ilvl="0">
@@ -2688,7 +2824,7 @@
     </w:lvl>
   </w:abstractNum>
   <w:abstractNum w:abstractNumId="23">
-    <w:nsid w:val="75C0FA19"/>
+    <w:nsid w:val="8C226542"/>
     <w:multiLevelType w:val="singleLevel"/>
     <w:tmpl w:val="29761A62"/>
     <w:lvl w:ilvl="0">
@@ -2709,7 +2845,7 @@
     </w:lvl>
   </w:abstractNum>
   <w:abstractNum w:abstractNumId="24">
-    <w:nsid w:val="3ACE69FF"/>
+    <w:nsid w:val="DC520603"/>
     <w:multiLevelType w:val="singleLevel"/>
     <w:tmpl w:val="38441652"/>
     <w:lvl w:ilvl="0">
@@ -2727,7 +2863,7 @@
     </w:lvl>
   </w:abstractNum>
   <w:abstractNum w:abstractNumId="25">
-    <w:nsid w:val="24157515"/>
+    <w:nsid w:val="0DEEE2AC"/>
     <w:multiLevelType w:val="singleLevel"/>
     <w:tmpl w:val="FB12693A"/>
     <w:lvl w:ilvl="0">
@@ -2745,7 +2881,7 @@
     </w:lvl>
   </w:abstractNum>
   <w:abstractNum w:abstractNumId="26">
-    <w:nsid w:val="E55CA3F2"/>
+    <w:nsid w:val="1F4A7851"/>
     <w:multiLevelType w:val="singleLevel"/>
     <w:tmpl w:val="D0A62B40"/>
     <w:lvl w:ilvl="0">
@@ -2763,7 +2899,7 @@
     </w:lvl>
   </w:abstractNum>
   <w:abstractNum w:abstractNumId="27">
-    <w:nsid w:val="D8EF3811"/>
+    <w:nsid w:val="5323249D"/>
     <w:multiLevelType w:val="singleLevel"/>
     <w:tmpl w:val="3D1EFFD4"/>
     <w:lvl w:ilvl="0">
@@ -2784,7 +2920,7 @@
     </w:lvl>
   </w:abstractNum>
   <w:abstractNum w:abstractNumId="28">
-    <w:nsid w:val="F90E2761"/>
+    <w:nsid w:val="6F0D4A9F"/>
     <w:multiLevelType w:val="singleLevel"/>
     <w:tmpl w:val="F3EAFDEC"/>
     <w:lvl w:ilvl="0">

</xml_diff>

<commit_message>
Support blank DOTX formatting templates in 0.3.8
</commit_message>
<xml_diff>
--- a/sample/showcase.docx
+++ b/sample/showcase.docx
@@ -2270,6 +2270,54 @@
         </w:tc>
       </w:tr>
     </w:tbl>
+    <w:p>
+      <w:pPr>
+        <w:pStyle w:val="Heading2"/>
+      </w:pPr>
+      <w:bookmarkStart w:id="20" w:name="md_21d73fac803abc9fd064976aa2c3"/>
+      <w:bookmarkEnd w:id="20"/>
+      <w:r>
+        <w:rPr/>
+        <w:t>DOTX formatting templates</w:t>
+      </w:r>
+    </w:p>
+    <w:p>
+      <w:pPr/>
+      <w:r>
+        <w:rPr/>
+        <w:t xml:space="preserve">The same Markdown can use a blank macro-free </w:t>
+      </w:r>
+      <w:r>
+        <w:rPr>
+          <w:rFonts w:ascii="Consolas" w:hAnsi="Consolas"/>
+        </w:rPr>
+        <w:t>.dotx</w:t>
+      </w:r>
+      <w:r>
+        <w:rPr/>
+        <w:t xml:space="preserve"> file through </w:t>
+      </w:r>
+      <w:r>
+        <w:rPr>
+          <w:rFonts w:ascii="Consolas" w:hAnsi="Consolas"/>
+        </w:rPr>
+        <w:t>--template</w:t>
+      </w:r>
+      <w:r>
+        <w:rPr/>
+        <w:t xml:space="preserve">. Output remains an editable </w:t>
+      </w:r>
+      <w:r>
+        <w:rPr>
+          <w:rFonts w:ascii="Consolas" w:hAnsi="Consolas"/>
+        </w:rPr>
+        <w:t>.docx</w:t>
+      </w:r>
+      <w:r>
+        <w:rPr/>
+        <w:t>, and the source template stays unchanged.</w:t>
+      </w:r>
+    </w:p>
     <w:sectPr>
       <w:pgSz w:w="12240" w:h="15840"/>
       <w:pgMar w:top="1224" w:right="1296" w:bottom="1224" w:left="1296" w:header="708" w:footer="708" w:gutter="0"/>
@@ -2545,7 +2593,7 @@
     </w:lvl>
   </w:abstractNum>
   <w:abstractNum w:abstractNumId="9">
-    <w:nsid w:val="DCF662F9"/>
+    <w:nsid w:val="65D8EBBC"/>
     <w:multiLevelType w:val="singleLevel"/>
     <w:tmpl w:val="29761A62"/>
     <w:lvl w:ilvl="0">
@@ -2566,7 +2614,7 @@
     </w:lvl>
   </w:abstractNum>
   <w:abstractNum w:abstractNumId="10">
-    <w:nsid w:val="E9CE19DF"/>
+    <w:nsid w:val="2D96D298"/>
     <w:multiLevelType w:val="singleLevel"/>
     <w:tmpl w:val="29761A62"/>
     <w:lvl w:ilvl="0">
@@ -2587,7 +2635,7 @@
     </w:lvl>
   </w:abstractNum>
   <w:abstractNum w:abstractNumId="11">
-    <w:nsid w:val="151B407E"/>
+    <w:nsid w:val="2DAA8B90"/>
     <w:multiLevelType w:val="singleLevel"/>
     <w:tmpl w:val="3D1EFFD4"/>
     <w:lvl w:ilvl="0">
@@ -2608,7 +2656,7 @@
     </w:lvl>
   </w:abstractNum>
   <w:abstractNum w:abstractNumId="12">
-    <w:nsid w:val="375DA032"/>
+    <w:nsid w:val="AF4AE28B"/>
     <w:multiLevelType w:val="singleLevel"/>
     <w:tmpl w:val="F3EAFDEC"/>
     <w:lvl w:ilvl="0">
@@ -2629,7 +2677,7 @@
     </w:lvl>
   </w:abstractNum>
   <w:abstractNum w:abstractNumId="13">
-    <w:nsid w:val="4B816001"/>
+    <w:nsid w:val="4BACE8D0"/>
     <w:multiLevelType w:val="singleLevel"/>
     <w:tmpl w:val="3D1EFFD4"/>
     <w:lvl w:ilvl="0">
@@ -2650,7 +2698,7 @@
     </w:lvl>
   </w:abstractNum>
   <w:abstractNum w:abstractNumId="14">
-    <w:nsid w:val="9E79B3A4"/>
+    <w:nsid w:val="1E161B4E"/>
     <w:multiLevelType w:val="singleLevel"/>
     <w:tmpl w:val="F3EAFDEC"/>
     <w:lvl w:ilvl="0">
@@ -2671,7 +2719,7 @@
     </w:lvl>
   </w:abstractNum>
   <w:abstractNum w:abstractNumId="15">
-    <w:nsid w:val="30AB818F"/>
+    <w:nsid w:val="7C297919"/>
     <w:multiLevelType w:val="singleLevel"/>
     <w:tmpl w:val="D0A62B40"/>
     <w:lvl w:ilvl="0">
@@ -2689,7 +2737,7 @@
     </w:lvl>
   </w:abstractNum>
   <w:abstractNum w:abstractNumId="16">
-    <w:nsid w:val="BFD8D6B4"/>
+    <w:nsid w:val="2E5E0A87"/>
     <w:multiLevelType w:val="singleLevel"/>
     <w:tmpl w:val="D0A62B40"/>
     <w:lvl w:ilvl="0">
@@ -2707,7 +2755,7 @@
     </w:lvl>
   </w:abstractNum>
   <w:abstractNum w:abstractNumId="17">
-    <w:nsid w:val="D0E3FFD5"/>
+    <w:nsid w:val="C194A30A"/>
     <w:multiLevelType w:val="singleLevel"/>
     <w:tmpl w:val="29761A62"/>
     <w:lvl w:ilvl="0">
@@ -2728,7 +2776,7 @@
     </w:lvl>
   </w:abstractNum>
   <w:abstractNum w:abstractNumId="18">
-    <w:nsid w:val="343438A9"/>
+    <w:nsid w:val="19483D54"/>
     <w:multiLevelType w:val="singleLevel"/>
     <w:tmpl w:val="3D1EFFD4"/>
     <w:lvl w:ilvl="0">
@@ -2749,7 +2797,7 @@
     </w:lvl>
   </w:abstractNum>
   <w:abstractNum w:abstractNumId="19">
-    <w:nsid w:val="9B215FE1"/>
+    <w:nsid w:val="04F9D18C"/>
     <w:multiLevelType w:val="singleLevel"/>
     <w:tmpl w:val="F3EAFDEC"/>
     <w:lvl w:ilvl="0">
@@ -2770,7 +2818,7 @@
     </w:lvl>
   </w:abstractNum>
   <w:abstractNum w:abstractNumId="20">
-    <w:nsid w:val="85A179DE"/>
+    <w:nsid w:val="79ACDD63"/>
     <w:multiLevelType w:val="singleLevel"/>
     <w:tmpl w:val="D0A62B40"/>
     <w:lvl w:ilvl="0">
@@ -2788,7 +2836,7 @@
     </w:lvl>
   </w:abstractNum>
   <w:abstractNum w:abstractNumId="21">
-    <w:nsid w:val="2A1F6650"/>
+    <w:nsid w:val="AD18A0B1"/>
     <w:multiLevelType w:val="singleLevel"/>
     <w:tmpl w:val="38441652"/>
     <w:lvl w:ilvl="0">
@@ -2806,7 +2854,7 @@
     </w:lvl>
   </w:abstractNum>
   <w:abstractNum w:abstractNumId="22">
-    <w:nsid w:val="7FD54F68"/>
+    <w:nsid w:val="76A350BF"/>
     <w:multiLevelType w:val="singleLevel"/>
     <w:tmpl w:val="FB12693A"/>
     <w:lvl w:ilvl="0">
@@ -2824,7 +2872,7 @@
     </w:lvl>
   </w:abstractNum>
   <w:abstractNum w:abstractNumId="23">
-    <w:nsid w:val="8C226542"/>
+    <w:nsid w:val="58478D63"/>
     <w:multiLevelType w:val="singleLevel"/>
     <w:tmpl w:val="29761A62"/>
     <w:lvl w:ilvl="0">
@@ -2845,7 +2893,7 @@
     </w:lvl>
   </w:abstractNum>
   <w:abstractNum w:abstractNumId="24">
-    <w:nsid w:val="DC520603"/>
+    <w:nsid w:val="1F27C80A"/>
     <w:multiLevelType w:val="singleLevel"/>
     <w:tmpl w:val="38441652"/>
     <w:lvl w:ilvl="0">
@@ -2863,7 +2911,7 @@
     </w:lvl>
   </w:abstractNum>
   <w:abstractNum w:abstractNumId="25">
-    <w:nsid w:val="0DEEE2AC"/>
+    <w:nsid w:val="36788B1A"/>
     <w:multiLevelType w:val="singleLevel"/>
     <w:tmpl w:val="FB12693A"/>
     <w:lvl w:ilvl="0">
@@ -2881,7 +2929,7 @@
     </w:lvl>
   </w:abstractNum>
   <w:abstractNum w:abstractNumId="26">
-    <w:nsid w:val="1F4A7851"/>
+    <w:nsid w:val="B661ACD2"/>
     <w:multiLevelType w:val="singleLevel"/>
     <w:tmpl w:val="D0A62B40"/>
     <w:lvl w:ilvl="0">
@@ -2899,7 +2947,7 @@
     </w:lvl>
   </w:abstractNum>
   <w:abstractNum w:abstractNumId="27">
-    <w:nsid w:val="5323249D"/>
+    <w:nsid w:val="4BBC6FC1"/>
     <w:multiLevelType w:val="singleLevel"/>
     <w:tmpl w:val="3D1EFFD4"/>
     <w:lvl w:ilvl="0">
@@ -2920,7 +2968,7 @@
     </w:lvl>
   </w:abstractNum>
   <w:abstractNum w:abstractNumId="28">
-    <w:nsid w:val="6F0D4A9F"/>
+    <w:nsid w:val="AE522809"/>
     <w:multiLevelType w:val="singleLevel"/>
     <w:tmpl w:val="F3EAFDEC"/>
     <w:lvl w:ilvl="0">

</xml_diff>

<commit_message>
Highlight fenced code in editable Word runs
</commit_message>
<xml_diff>
--- a/sample/showcase.docx
+++ b/sample/showcase.docx
@@ -179,6 +179,7 @@
     <w:p>
       <w:pPr>
         <w:pStyle w:val="Quote"/>
+        <w:ind w:left="720"/>
       </w:pPr>
       <w:r>
         <w:rPr/>
@@ -188,6 +189,7 @@
     <w:p>
       <w:pPr>
         <w:pStyle w:val="Quote"/>
+        <w:ind w:left="720"/>
       </w:pPr>
       <w:r>
         <w:rPr/>
@@ -883,7 +885,7 @@
       </w:r>
       <w:r>
         <w:rPr/>
-        <w:t xml:space="preserve"> 0.1.0 while remaining readable as ordinary Markdown.</w:t>
+        <w:t xml:space="preserve"> while remaining readable as ordinary Markdown.</w:t>
       </w:r>
     </w:p>
     <w:p>
@@ -960,11 +962,78 @@
       </w:r>
     </w:p>
     <w:p>
+      <w:pPr/>
+      <w:r>
+        <w:rPr/>
+        <w:t xml:space="preserve">This line shows </w:t>
+      </w:r>
+      <w:r>
+        <w:rPr>
+          <w:strike/>
+        </w:rPr>
+        <w:t>strikethrough</w:t>
+      </w:r>
+      <w:r>
+        <w:rPr/>
+        <w:t>, H</w:t>
+      </w:r>
+      <w:r>
+        <w:rPr>
+          <w:vertAlign w:val="subscript"/>
+        </w:rPr>
+        <w:t>2</w:t>
+      </w:r>
+      <w:r>
+        <w:rPr/>
+        <w:t>O, and x</w:t>
+      </w:r>
+      <w:r>
+        <w:rPr>
+          <w:vertAlign w:val="superscript"/>
+        </w:rPr>
+        <w:t>2</w:t>
+      </w:r>
+      <w:r>
+        <w:rPr/>
+        <w:t xml:space="preserve">. A bare URL such as </w:t>
+      </w:r>
+      <w:hyperlink r:id="rId16">
+        <w:r>
+          <w:rPr>
+            <w:rStyle w:val="Hyperlink"/>
+          </w:rPr>
+          <w:t>https://example.com/docs</w:t>
+        </w:r>
+      </w:hyperlink>
+      <w:r>
+        <w:rPr/>
+        <w:t xml:space="preserve"> becomes a native hyperlink.</w:t>
+      </w:r>
+    </w:p>
+    <w:p>
+      <w:pPr>
+        <w:pStyle w:val="Heading2"/>
+      </w:pPr>
+      <w:bookmarkStart w:id="6" w:name="md_d99218e241924bd72e4715bf78b5"/>
+      <w:bookmarkEnd w:id="6"/>
+      <w:r>
+        <w:rPr/>
+        <w:t>Setext heading level two</w:t>
+      </w:r>
+    </w:p>
+    <w:p>
+      <w:pPr/>
+      <w:r>
+        <w:rPr/>
+        <w:t>Setext headings create the same Word heading and bookmark as hash headings.</w:t>
+      </w:r>
+    </w:p>
+    <w:p>
       <w:pPr>
         <w:pStyle w:val="Heading3"/>
       </w:pPr>
-      <w:bookmarkStart w:id="6" w:name="md_19560e5152ba5633d4328eeaf09e"/>
-      <w:bookmarkEnd w:id="6"/>
+      <w:bookmarkStart w:id="7" w:name="md_19560e5152ba5633d4328eeaf09e"/>
+      <w:bookmarkEnd w:id="7"/>
       <w:r>
         <w:rPr/>
         <w:t>Heading level three</w:t>
@@ -974,8 +1043,8 @@
       <w:pPr>
         <w:pStyle w:val="Heading4"/>
       </w:pPr>
-      <w:bookmarkStart w:id="7" w:name="md_0b11f9a7106048df0ef5d3464f9d"/>
-      <w:bookmarkEnd w:id="7"/>
+      <w:bookmarkStart w:id="8" w:name="md_0b11f9a7106048df0ef5d3464f9d"/>
+      <w:bookmarkEnd w:id="8"/>
       <w:r>
         <w:rPr/>
         <w:t>Heading level four</w:t>
@@ -985,8 +1054,8 @@
       <w:pPr>
         <w:pStyle w:val="Heading5"/>
       </w:pPr>
-      <w:bookmarkStart w:id="8" w:name="md_b0c920238f01011be62993f6f895"/>
-      <w:bookmarkEnd w:id="8"/>
+      <w:bookmarkStart w:id="9" w:name="md_b0c920238f01011be62993f6f895"/>
+      <w:bookmarkEnd w:id="9"/>
       <w:r>
         <w:rPr/>
         <w:t>Heading level five</w:t>
@@ -996,8 +1065,8 @@
       <w:pPr>
         <w:pStyle w:val="Heading6"/>
       </w:pPr>
-      <w:bookmarkStart w:id="9" w:name="md_1ce1922a5e8ad230dc6b5ac39693"/>
-      <w:bookmarkEnd w:id="9"/>
+      <w:bookmarkStart w:id="10" w:name="md_1ce1922a5e8ad230dc6b5ac39693"/>
+      <w:bookmarkEnd w:id="10"/>
       <w:r>
         <w:rPr/>
         <w:t>Heading level six</w:t>
@@ -1006,6 +1075,7 @@
     <w:p>
       <w:pPr>
         <w:pStyle w:val="Quote"/>
+        <w:ind w:left="720"/>
       </w:pPr>
       <w:r>
         <w:rPr/>
@@ -1025,6 +1095,7 @@
     <w:p>
       <w:pPr>
         <w:pStyle w:val="Quote"/>
+        <w:ind w:left="720"/>
       </w:pPr>
       <w:r>
         <w:rPr/>
@@ -1033,10 +1104,172 @@
     </w:p>
     <w:p>
       <w:pPr>
+        <w:pStyle w:val="Heading3"/>
+        <w:ind w:left="720"/>
+      </w:pPr>
+      <w:bookmarkStart w:id="11" w:name="md_ba034601a5beb9b7fd90d8cb51aa"/>
+      <w:bookmarkEnd w:id="11"/>
+      <w:r>
+        <w:rPr/>
+        <w:t>A heading inside a quote</w:t>
+      </w:r>
+    </w:p>
+    <w:p>
+      <w:pPr>
+        <w:pStyle w:val="ListBullet"/>
+        <w:numPr>
+          <w:ilvl w:val="0"/>
+          <w:numId w:val="16"/>
+        </w:numPr>
+        <w:ind w:left="1080"/>
+      </w:pPr>
+      <w:r>
+        <w:rPr/>
+        <w:t>A list item keeps native bullets inside the quote.</w:t>
+      </w:r>
+    </w:p>
+    <w:p>
+      <w:pPr>
+        <w:pStyle w:val="CodeBlock"/>
+        <w:ind w:left="1080"/>
+      </w:pPr>
+      <w:r>
+        <w:t>Quoted code stays editable.</w:t>
+      </w:r>
+    </w:p>
+    <w:tbl>
+      <w:tblPr>
+        <w:tblStyle w:val="TableGrid"/>
+        <w:tblW w:type="auto" w:w="0"/>
+        <w:jc w:val="left"/>
+        <w:tblInd w:type="dxa" w:w="720"/>
+        <w:tblLayout w:type="fixed"/>
+        <w:tblLook w:firstColumn="1" w:firstRow="1" w:lastColumn="0" w:lastRow="0" w:noHBand="0" w:noVBand="1" w:val="04A0"/>
+      </w:tblPr>
+      <w:tblGrid>
+        <w:gridCol w:w="4464"/>
+        <w:gridCol w:w="4464"/>
+      </w:tblGrid>
+      <w:tr>
+        <w:trPr>
+          <w:tblHeader/>
+        </w:trPr>
+        <w:tc>
+          <w:tcPr>
+            <w:tcW w:type="dxa" w:w="4464"/>
+          </w:tcPr>
+          <w:p>
+            <w:pPr>
+              <w:jc w:val="left"/>
+            </w:pPr>
+            <w:r>
+              <w:rPr/>
+              <w:t>Quoted part</w:t>
+            </w:r>
+          </w:p>
+        </w:tc>
+        <w:tc>
+          <w:tcPr>
+            <w:tcW w:type="dxa" w:w="4464"/>
+          </w:tcPr>
+          <w:p>
+            <w:pPr>
+              <w:jc w:val="left"/>
+            </w:pPr>
+            <w:r>
+              <w:rPr/>
+              <w:t>Status</w:t>
+            </w:r>
+          </w:p>
+        </w:tc>
+      </w:tr>
+      <w:tr>
+        <w:tc>
+          <w:tcPr>
+            <w:tcW w:type="dxa" w:w="4464"/>
+          </w:tcPr>
+          <w:p>
+            <w:pPr>
+              <w:jc w:val="left"/>
+            </w:pPr>
+            <w:r>
+              <w:rPr/>
+              <w:t>Table</w:t>
+            </w:r>
+          </w:p>
+        </w:tc>
+        <w:tc>
+          <w:tcPr>
+            <w:tcW w:type="dxa" w:w="4464"/>
+          </w:tcPr>
+          <w:p>
+            <w:pPr>
+              <w:jc w:val="left"/>
+            </w:pPr>
+            <w:r>
+              <w:rPr/>
+              <w:t>Ready</w:t>
+            </w:r>
+          </w:p>
+        </w:tc>
+      </w:tr>
+    </w:tbl>
+    <w:p>
+      <w:pPr>
+        <w:ind w:left="720"/>
+        <w:jc w:val="left"/>
+      </w:pPr>
+      <w:r>
+        <w:drawing>
+          <wp:inline xmlns:a="http://schemas.openxmlformats.org/drawingml/2006/main" xmlns:pic="http://schemas.openxmlformats.org/drawingml/2006/picture">
+            <wp:extent cx="1270065" cy="508026"/>
+            <wp:docPr id="6" name="Picture 6" descr="Three dogs in a quoted illustration"/>
+            <wp:cNvGraphicFramePr>
+              <a:graphicFrameLocks noChangeAspect="1"/>
+            </wp:cNvGraphicFramePr>
+            <a:graphic>
+              <a:graphicData uri="http://schemas.openxmlformats.org/drawingml/2006/picture">
+                <pic:pic>
+                  <pic:nvPicPr>
+                    <pic:cNvPr id="0" name="image.png"/>
+                    <pic:cNvPicPr/>
+                  </pic:nvPicPr>
+                  <pic:blipFill>
+                    <a:blip r:embed="rId15"/>
+                    <a:stretch>
+                      <a:fillRect/>
+                    </a:stretch>
+                  </pic:blipFill>
+                  <pic:spPr>
+                    <a:xfrm>
+                      <a:off x="0" y="0"/>
+                      <a:ext cx="1270065" cy="508026"/>
+                    </a:xfrm>
+                    <a:prstGeom prst="rect"/>
+                  </pic:spPr>
+                </pic:pic>
+              </a:graphicData>
+            </a:graphic>
+          </wp:inline>
+        </w:drawing>
+      </w:r>
+    </w:p>
+    <w:p>
+      <w:pPr>
+        <w:pStyle w:val="Quote"/>
+        <w:ind w:left="1440"/>
+      </w:pPr>
+      <w:r>
+        <w:rPr/>
+        <w:t>A second quote level adds another indent.</w:t>
+      </w:r>
+    </w:p>
+    <w:p>
+      <w:pPr>
         <w:pStyle w:val="Heading2"/>
       </w:pPr>
-      <w:bookmarkStart w:id="10" w:name="md_e782f36a97b4acda8ab01a4dd294"/>
-      <w:bookmarkEnd w:id="10"/>
+      <w:bookmarkStart w:id="12" w:name="md_e782f36a97b4acda8ab01a4dd294"/>
+      <w:bookmarkEnd w:id="12"/>
       <w:r>
         <w:rPr/>
         <w:t>Fenced code</w:t>
@@ -1047,14 +1280,235 @@
         <w:pStyle w:val="CodeBlock"/>
       </w:pPr>
       <w:r>
-        <w:t>from pathlib import Path</w:t>
+        <w:rPr>
+          <w:b/>
+          <w:color w:val="008000"/>
+        </w:rPr>
+        <w:t>from</w:t>
+      </w:r>
+      <w:r>
+        <w:t xml:space="preserve"> </w:t>
+      </w:r>
+      <w:r>
+        <w:rPr>
+          <w:b/>
+          <w:color w:val="0000FF"/>
+        </w:rPr>
+        <w:t>pathlib</w:t>
+      </w:r>
+      <w:r>
+        <w:t xml:space="preserve"> </w:t>
+      </w:r>
+      <w:r>
+        <w:rPr>
+          <w:b/>
+          <w:color w:val="008000"/>
+        </w:rPr>
+        <w:t>import</w:t>
+      </w:r>
+      <w:r>
+        <w:t xml:space="preserve"> </w:t>
+      </w:r>
+      <w:r>
+        <w:t>Path</w:t>
+      </w:r>
+      <w:r>
         <w:br/>
+      </w:r>
+      <w:r>
         <w:br/>
-        <w:t>source = Path("showcase.md")</w:t>
+      </w:r>
+      <w:r>
+        <w:t>source</w:t>
+      </w:r>
+      <w:r>
+        <w:t xml:space="preserve"> </w:t>
+      </w:r>
+      <w:r>
+        <w:rPr>
+          <w:color w:val="666666"/>
+        </w:rPr>
+        <w:t>=</w:t>
+      </w:r>
+      <w:r>
+        <w:t xml:space="preserve"> </w:t>
+      </w:r>
+      <w:r>
+        <w:t>Path</w:t>
+      </w:r>
+      <w:r>
+        <w:t>(</w:t>
+      </w:r>
+      <w:r>
+        <w:rPr>
+          <w:color w:val="BA2121"/>
+        </w:rPr>
+        <w:t>"</w:t>
+      </w:r>
+      <w:r>
+        <w:rPr>
+          <w:color w:val="BA2121"/>
+        </w:rPr>
+        <w:t>showcase.md</w:t>
+      </w:r>
+      <w:r>
+        <w:rPr>
+          <w:color w:val="BA2121"/>
+        </w:rPr>
+        <w:t>"</w:t>
+      </w:r>
+      <w:r>
+        <w:t>)</w:t>
+      </w:r>
+      <w:r>
         <w:br/>
-        <w:t>target = source.with_suffix(".docx")</w:t>
+      </w:r>
+      <w:r>
+        <w:t>target</w:t>
+      </w:r>
+      <w:r>
+        <w:t xml:space="preserve"> </w:t>
+      </w:r>
+      <w:r>
+        <w:rPr>
+          <w:color w:val="666666"/>
+        </w:rPr>
+        <w:t>=</w:t>
+      </w:r>
+      <w:r>
+        <w:t xml:space="preserve"> </w:t>
+      </w:r>
+      <w:r>
+        <w:t>source</w:t>
+      </w:r>
+      <w:r>
+        <w:rPr>
+          <w:color w:val="666666"/>
+        </w:rPr>
+        <w:t>.</w:t>
+      </w:r>
+      <w:r>
+        <w:t>with_suffix</w:t>
+      </w:r>
+      <w:r>
+        <w:t>(</w:t>
+      </w:r>
+      <w:r>
+        <w:rPr>
+          <w:color w:val="BA2121"/>
+        </w:rPr>
+        <w:t>"</w:t>
+      </w:r>
+      <w:r>
+        <w:rPr>
+          <w:color w:val="BA2121"/>
+        </w:rPr>
+        <w:t>.docx</w:t>
+      </w:r>
+      <w:r>
+        <w:rPr>
+          <w:color w:val="BA2121"/>
+        </w:rPr>
+        <w:t>"</w:t>
+      </w:r>
+      <w:r>
+        <w:t>)</w:t>
+      </w:r>
+      <w:r>
         <w:br/>
-        <w:t>print(target)</w:t>
+      </w:r>
+      <w:r>
+        <w:rPr>
+          <w:color w:val="008000"/>
+        </w:rPr>
+        <w:t>print</w:t>
+      </w:r>
+      <w:r>
+        <w:t>(</w:t>
+      </w:r>
+      <w:r>
+        <w:t>target</w:t>
+      </w:r>
+      <w:r>
+        <w:t>)</w:t>
+      </w:r>
+    </w:p>
+    <w:p>
+      <w:pPr/>
+      <w:r>
+        <w:rPr/>
+        <w:t>The CSS fence demonstrates a second recognized language.</w:t>
+      </w:r>
+    </w:p>
+    <w:p>
+      <w:pPr>
+        <w:pStyle w:val="CodeBlock"/>
+      </w:pPr>
+      <w:r>
+        <w:t>.</w:t>
+      </w:r>
+      <w:r>
+        <w:rPr>
+          <w:b/>
+          <w:color w:val="0000FF"/>
+        </w:rPr>
+        <w:t>showcase</w:t>
+      </w:r>
+      <w:r>
+        <w:t xml:space="preserve"> </w:t>
+      </w:r>
+      <w:r>
+        <w:t>{</w:t>
+      </w:r>
+      <w:r>
+        <w:br/>
+        <w:t xml:space="preserve">  </w:t>
+      </w:r>
+      <w:r>
+        <w:rPr>
+          <w:b/>
+          <w:color w:val="008000"/>
+        </w:rPr>
+        <w:t>color</w:t>
+      </w:r>
+      <w:r>
+        <w:t>:</w:t>
+      </w:r>
+      <w:r>
+        <w:t xml:space="preserve"> </w:t>
+      </w:r>
+      <w:r>
+        <w:rPr>
+          <w:color w:val="666666"/>
+        </w:rPr>
+        <w:t>#2464a4</w:t>
+      </w:r>
+      <w:r>
+        <w:br/>
+      </w:r>
+      <w:r>
+        <w:t>}</w:t>
+      </w:r>
+    </w:p>
+    <w:p>
+      <w:pPr>
+        <w:pStyle w:val="Heading2"/>
+      </w:pPr>
+      <w:bookmarkStart w:id="13" w:name="md_9f56f36ed86b9b74bc5278600db8"/>
+      <w:bookmarkEnd w:id="13"/>
+      <w:r>
+        <w:rPr/>
+        <w:t>Indented code</w:t>
+      </w:r>
+    </w:p>
+    <w:p>
+      <w:pPr>
+        <w:pStyle w:val="CodeBlock"/>
+      </w:pPr>
+      <w:r>
+        <w:t>source = "showcase.md"</w:t>
+        <w:br/>
+        <w:t>print(source)</w:t>
       </w:r>
     </w:p>
     <w:p>
@@ -1081,8 +1535,8 @@
       <w:pPr>
         <w:pStyle w:val="Heading2"/>
       </w:pPr>
-      <w:bookmarkStart w:id="11" w:name="md_fc7accb762a496c79519fba735f9"/>
-      <w:bookmarkEnd w:id="11"/>
+      <w:bookmarkStart w:id="14" w:name="md_fc7accb762a496c79519fba735f9"/>
+      <w:bookmarkEnd w:id="14"/>
       <w:r>
         <w:rPr/>
         <w:t>List starts and continuation paragraphs</w:t>
@@ -1093,7 +1547,7 @@
         <w:pStyle w:val="ListNumber"/>
         <w:numPr>
           <w:ilvl w:val="0"/>
-          <w:numId w:val="16"/>
+          <w:numId w:val="17"/>
         </w:numPr>
       </w:pPr>
       <w:r>
@@ -1122,7 +1576,7 @@
         <w:pStyle w:val="ListNumber"/>
         <w:numPr>
           <w:ilvl w:val="0"/>
-          <w:numId w:val="16"/>
+          <w:numId w:val="17"/>
         </w:numPr>
       </w:pPr>
       <w:r>
@@ -1142,7 +1596,7 @@
         <w:pStyle w:val="ListNumber"/>
         <w:numPr>
           <w:ilvl w:val="0"/>
-          <w:numId w:val="17"/>
+          <w:numId w:val="18"/>
         </w:numPr>
       </w:pPr>
       <w:r>
@@ -1154,8 +1608,8 @@
       <w:pPr>
         <w:pStyle w:val="Heading2"/>
       </w:pPr>
-      <w:bookmarkStart w:id="12" w:name="md_64d072884695e541eaca3f6db85c"/>
-      <w:bookmarkEnd w:id="12"/>
+      <w:bookmarkStart w:id="15" w:name="md_64d072884695e541eaca3f6db85c"/>
+      <w:bookmarkEnd w:id="15"/>
       <w:r>
         <w:rPr/>
         <w:t>List kinds and depths</w:t>
@@ -1166,7 +1620,7 @@
         <w:pStyle w:val="ListBullet"/>
         <w:numPr>
           <w:ilvl w:val="0"/>
-          <w:numId w:val="18"/>
+          <w:numId w:val="19"/>
         </w:numPr>
       </w:pPr>
       <w:r>
@@ -1179,7 +1633,7 @@
         <w:pStyle w:val="ListBullet2"/>
         <w:numPr>
           <w:ilvl w:val="0"/>
-          <w:numId w:val="19"/>
+          <w:numId w:val="20"/>
         </w:numPr>
       </w:pPr>
       <w:r>
@@ -1192,7 +1646,7 @@
         <w:pStyle w:val="ListBullet3"/>
         <w:numPr>
           <w:ilvl w:val="0"/>
-          <w:numId w:val="20"/>
+          <w:numId w:val="21"/>
         </w:numPr>
       </w:pPr>
       <w:r>
@@ -1205,7 +1659,7 @@
         <w:pStyle w:val="ListNumber"/>
         <w:numPr>
           <w:ilvl w:val="0"/>
-          <w:numId w:val="21"/>
+          <w:numId w:val="22"/>
         </w:numPr>
       </w:pPr>
       <w:r>
@@ -1218,7 +1672,7 @@
         <w:pStyle w:val="ListNumber2"/>
         <w:numPr>
           <w:ilvl w:val="0"/>
-          <w:numId w:val="22"/>
+          <w:numId w:val="23"/>
         </w:numPr>
       </w:pPr>
       <w:r>
@@ -1231,7 +1685,7 @@
         <w:pStyle w:val="ListNumber3"/>
         <w:numPr>
           <w:ilvl w:val="0"/>
-          <w:numId w:val="23"/>
+          <w:numId w:val="24"/>
         </w:numPr>
       </w:pPr>
       <w:r>
@@ -1244,7 +1698,7 @@
         <w:pStyle w:val="ListBullet"/>
         <w:numPr>
           <w:ilvl w:val="0"/>
-          <w:numId w:val="24"/>
+          <w:numId w:val="25"/>
         </w:numPr>
       </w:pPr>
       <w:r>
@@ -1257,7 +1711,7 @@
         <w:pStyle w:val="ListNumber2"/>
         <w:numPr>
           <w:ilvl w:val="0"/>
-          <w:numId w:val="25"/>
+          <w:numId w:val="26"/>
         </w:numPr>
       </w:pPr>
       <w:r>
@@ -1270,7 +1724,7 @@
         <w:pStyle w:val="ListNumber3"/>
         <w:numPr>
           <w:ilvl w:val="0"/>
-          <w:numId w:val="26"/>
+          <w:numId w:val="27"/>
         </w:numPr>
       </w:pPr>
       <w:r>
@@ -1283,7 +1737,7 @@
         <w:pStyle w:val="ListNumber"/>
         <w:numPr>
           <w:ilvl w:val="0"/>
-          <w:numId w:val="27"/>
+          <w:numId w:val="28"/>
         </w:numPr>
       </w:pPr>
       <w:r>
@@ -1296,7 +1750,7 @@
         <w:pStyle w:val="ListBullet2"/>
         <w:numPr>
           <w:ilvl w:val="0"/>
-          <w:numId w:val="28"/>
+          <w:numId w:val="29"/>
         </w:numPr>
       </w:pPr>
       <w:r>
@@ -1309,12 +1763,476 @@
         <w:pStyle w:val="ListBullet3"/>
         <w:numPr>
           <w:ilvl w:val="0"/>
-          <w:numId w:val="29"/>
+          <w:numId w:val="30"/>
         </w:numPr>
       </w:pPr>
       <w:r>
         <w:rPr/>
         <w:t>Unordered grandchild</w:t>
+      </w:r>
+    </w:p>
+    <w:p>
+      <w:pPr>
+        <w:pStyle w:val="Heading2"/>
+      </w:pPr>
+      <w:bookmarkStart w:id="16" w:name="md_540996c52d6982291dfbaf78a79f"/>
+      <w:bookmarkEnd w:id="16"/>
+      <w:r>
+        <w:rPr/>
+        <w:t>Rich list items</w:t>
+      </w:r>
+    </w:p>
+    <w:p>
+      <w:pPr>
+        <w:pStyle w:val="ListNumber"/>
+        <w:numPr>
+          <w:ilvl w:val="0"/>
+          <w:numId w:val="31"/>
+        </w:numPr>
+      </w:pPr>
+      <w:r>
+        <w:rPr/>
+        <w:t>This item contains several editable blocks beneath one Word list number.</w:t>
+      </w:r>
+    </w:p>
+    <w:p>
+      <w:pPr>
+        <w:pStyle w:val="CodeBlock"/>
+        <w:numPr>
+          <w:numId w:val="0"/>
+        </w:numPr>
+        <w:tabs>
+          <w:tab w:val="num" w:pos="360"/>
+        </w:tabs>
+        <w:ind w:left="360" w:firstLine="0"/>
+      </w:pPr>
+      <w:r>
+        <w:rPr>
+          <w:color w:val="008000"/>
+        </w:rPr>
+        <w:t>print</w:t>
+      </w:r>
+      <w:r>
+        <w:t>(</w:t>
+      </w:r>
+      <w:r>
+        <w:rPr>
+          <w:color w:val="BA2121"/>
+        </w:rPr>
+        <w:t>"</w:t>
+      </w:r>
+      <w:r>
+        <w:rPr>
+          <w:color w:val="BA2121"/>
+        </w:rPr>
+        <w:t>Nested code</w:t>
+      </w:r>
+      <w:r>
+        <w:rPr>
+          <w:color w:val="BA2121"/>
+        </w:rPr>
+        <w:t>"</w:t>
+      </w:r>
+      <w:r>
+        <w:t>)</w:t>
+      </w:r>
+    </w:p>
+    <w:p>
+      <w:pPr>
+        <w:pStyle w:val="Quote"/>
+        <w:numPr>
+          <w:numId w:val="0"/>
+        </w:numPr>
+        <w:tabs>
+          <w:tab w:val="num" w:pos="360"/>
+        </w:tabs>
+        <w:ind w:left="1080" w:firstLine="0"/>
+      </w:pPr>
+      <w:r>
+        <w:rPr/>
+        <w:t>A quote inside the list item stays indented with its text.</w:t>
+      </w:r>
+    </w:p>
+    <w:tbl>
+      <w:tblPr>
+        <w:tblStyle w:val="TableGrid"/>
+        <w:tblW w:type="auto" w:w="0"/>
+        <w:jc w:val="left"/>
+        <w:tblInd w:type="dxa" w:w="360"/>
+        <w:tblLayout w:type="fixed"/>
+        <w:tblLook w:firstColumn="1" w:firstRow="1" w:lastColumn="0" w:lastRow="0" w:noHBand="0" w:noVBand="1" w:val="04A0"/>
+      </w:tblPr>
+      <w:tblGrid>
+        <w:gridCol w:w="4644"/>
+        <w:gridCol w:w="4644"/>
+      </w:tblGrid>
+      <w:tr>
+        <w:trPr>
+          <w:tblHeader/>
+        </w:trPr>
+        <w:tc>
+          <w:tcPr>
+            <w:tcW w:type="dxa" w:w="4644"/>
+          </w:tcPr>
+          <w:p>
+            <w:pPr>
+              <w:jc w:val="left"/>
+            </w:pPr>
+            <w:r>
+              <w:rPr/>
+              <w:t>Part</w:t>
+            </w:r>
+          </w:p>
+        </w:tc>
+        <w:tc>
+          <w:tcPr>
+            <w:tcW w:type="dxa" w:w="4644"/>
+          </w:tcPr>
+          <w:p>
+            <w:pPr>
+              <w:jc w:val="left"/>
+            </w:pPr>
+            <w:r>
+              <w:rPr/>
+              <w:t>Status</w:t>
+            </w:r>
+          </w:p>
+        </w:tc>
+      </w:tr>
+      <w:tr>
+        <w:tc>
+          <w:tcPr>
+            <w:tcW w:type="dxa" w:w="4644"/>
+          </w:tcPr>
+          <w:p>
+            <w:pPr>
+              <w:jc w:val="left"/>
+            </w:pPr>
+            <w:r>
+              <w:rPr/>
+              <w:t>Code</w:t>
+            </w:r>
+          </w:p>
+        </w:tc>
+        <w:tc>
+          <w:tcPr>
+            <w:tcW w:type="dxa" w:w="4644"/>
+          </w:tcPr>
+          <w:p>
+            <w:pPr>
+              <w:jc w:val="left"/>
+            </w:pPr>
+            <w:r>
+              <w:rPr/>
+              <w:t>Ready</w:t>
+            </w:r>
+          </w:p>
+        </w:tc>
+      </w:tr>
+    </w:tbl>
+    <w:p>
+      <w:pPr>
+        <w:numPr>
+          <w:numId w:val="0"/>
+        </w:numPr>
+        <w:tabs>
+          <w:tab w:val="num" w:pos="360"/>
+        </w:tabs>
+        <w:ind w:left="360" w:firstLine="0"/>
+      </w:pPr>
+      <w:r>
+        <w:drawing>
+          <wp:inline xmlns:a="http://schemas.openxmlformats.org/drawingml/2006/main" xmlns:pic="http://schemas.openxmlformats.org/drawingml/2006/picture">
+            <wp:extent cx="1270065" cy="508026"/>
+            <wp:docPr id="7" name="Picture 7" descr="The three dogs together"/>
+            <wp:cNvGraphicFramePr>
+              <a:graphicFrameLocks noChangeAspect="1"/>
+            </wp:cNvGraphicFramePr>
+            <a:graphic>
+              <a:graphicData uri="http://schemas.openxmlformats.org/drawingml/2006/picture">
+                <pic:pic>
+                  <pic:nvPicPr>
+                    <pic:cNvPr id="0" name="image.png"/>
+                    <pic:cNvPicPr/>
+                  </pic:nvPicPr>
+                  <pic:blipFill>
+                    <a:blip r:embed="rId15"/>
+                    <a:stretch>
+                      <a:fillRect/>
+                    </a:stretch>
+                  </pic:blipFill>
+                  <pic:spPr>
+                    <a:xfrm>
+                      <a:off x="0" y="0"/>
+                      <a:ext cx="1270065" cy="508026"/>
+                    </a:xfrm>
+                    <a:prstGeom prst="rect"/>
+                  </pic:spPr>
+                </pic:pic>
+              </a:graphicData>
+            </a:graphic>
+          </wp:inline>
+        </w:drawing>
+      </w:r>
+    </w:p>
+    <w:p>
+      <w:pPr>
+        <w:pStyle w:val="ListNumber"/>
+        <w:numPr>
+          <w:numId w:val="0"/>
+        </w:numPr>
+        <w:tabs>
+          <w:tab w:val="num" w:pos="360"/>
+        </w:tabs>
+        <w:ind w:left="360" w:firstLine="0"/>
+      </w:pPr>
+      <w:r>
+        <w:rPr/>
+        <w:t>The final paragraph still belongs to the same numbered item.</w:t>
+      </w:r>
+    </w:p>
+    <w:p>
+      <w:pPr>
+        <w:pStyle w:val="ListNumber"/>
+        <w:numPr>
+          <w:ilvl w:val="0"/>
+          <w:numId w:val="31"/>
+        </w:numPr>
+      </w:pPr>
+      <w:r>
+        <w:rPr/>
+        <w:t>Numbering continues after the nested blocks.</w:t>
+      </w:r>
+    </w:p>
+    <w:p>
+      <w:pPr>
+        <w:pStyle w:val="Heading2"/>
+      </w:pPr>
+      <w:bookmarkStart w:id="17" w:name="md_b85f10fdd3e5466da7337c39ab52"/>
+      <w:bookmarkEnd w:id="17"/>
+      <w:r>
+        <w:rPr/>
+        <w:t>Clickable task lists</w:t>
+      </w:r>
+    </w:p>
+    <w:p>
+      <w:pPr>
+        <w:pStyle w:val="ListBullet"/>
+        <w:numPr>
+          <w:numId w:val="0"/>
+        </w:numPr>
+        <w:tabs>
+          <w:tab w:val="num" w:pos="360"/>
+        </w:tabs>
+        <w:ind w:left="360" w:firstLine="0"/>
+      </w:pPr>
+      <w:sdt>
+        <w:sdtPr>
+          <w14:checkbox>
+            <w14:checked w14:val="0"/>
+            <w14:checkedState w14:val="2612" w14:font="MS Gothic"/>
+            <w14:uncheckedState w14:val="2610" w14:font="MS Gothic"/>
+          </w14:checkbox>
+        </w:sdtPr>
+        <w:sdtContent>
+          <w:r>
+            <w:rPr>
+              <w:rFonts w:ascii="MS Gothic" w:hAnsi="MS Gothic"/>
+            </w:rPr>
+            <w:t>☐</w:t>
+          </w:r>
+        </w:sdtContent>
+      </w:sdt>
+      <w:r>
+        <w:t xml:space="preserve"> </w:t>
+      </w:r>
+      <w:r>
+        <w:rPr/>
+        <w:t xml:space="preserve">Review the draft and follow </w:t>
+      </w:r>
+      <w:hyperlink r:id="rId17">
+        <w:r>
+          <w:rPr>
+            <w:rStyle w:val="Hyperlink"/>
+          </w:rPr>
+          <w:t>the checklist</w:t>
+        </w:r>
+      </w:hyperlink>
+      <w:r>
+        <w:rPr/>
+        <w:t>.</w:t>
+      </w:r>
+    </w:p>
+    <w:p>
+      <w:pPr>
+        <w:pStyle w:val="ListBullet"/>
+        <w:numPr>
+          <w:numId w:val="0"/>
+        </w:numPr>
+        <w:tabs>
+          <w:tab w:val="num" w:pos="360"/>
+        </w:tabs>
+        <w:ind w:left="360" w:firstLine="0"/>
+      </w:pPr>
+      <w:sdt>
+        <w:sdtPr>
+          <w14:checkbox>
+            <w14:checked w14:val="1"/>
+            <w14:checkedState w14:val="2612" w14:font="MS Gothic"/>
+            <w14:uncheckedState w14:val="2610" w14:font="MS Gothic"/>
+          </w14:checkbox>
+        </w:sdtPr>
+        <w:sdtContent>
+          <w:r>
+            <w:rPr>
+              <w:rFonts w:ascii="MS Gothic" w:hAnsi="MS Gothic"/>
+            </w:rPr>
+            <w:t>☒</w:t>
+          </w:r>
+        </w:sdtContent>
+      </w:sdt>
+      <w:r>
+        <w:t xml:space="preserve"> </w:t>
+      </w:r>
+      <w:r>
+        <w:rPr/>
+        <w:t xml:space="preserve">Approve the </w:t>
+      </w:r>
+      <w:r>
+        <w:rPr>
+          <w:b/>
+        </w:rPr>
+        <w:t>finished</w:t>
+      </w:r>
+      <w:r>
+        <w:rPr/>
+        <w:t xml:space="preserve"> document.</w:t>
+      </w:r>
+    </w:p>
+    <w:p>
+      <w:pPr>
+        <w:pStyle w:val="ListBullet"/>
+        <w:numPr>
+          <w:ilvl w:val="0"/>
+          <w:numId w:val="32"/>
+        </w:numPr>
+      </w:pPr>
+      <w:r>
+        <w:rPr/>
+        <w:t>Plain list items can sit alongside tasks.</w:t>
+      </w:r>
+    </w:p>
+    <w:p>
+      <w:pPr>
+        <w:pStyle w:val="ListNumber"/>
+        <w:numPr>
+          <w:ilvl w:val="0"/>
+          <w:numId w:val="33"/>
+        </w:numPr>
+      </w:pPr>
+      <w:sdt>
+        <w:sdtPr>
+          <w14:checkbox>
+            <w14:checked w14:val="0"/>
+            <w14:checkedState w14:val="2612" w14:font="MS Gothic"/>
+            <w14:uncheckedState w14:val="2610" w14:font="MS Gothic"/>
+          </w14:checkbox>
+        </w:sdtPr>
+        <w:sdtContent>
+          <w:r>
+            <w:rPr>
+              <w:rFonts w:ascii="MS Gothic" w:hAnsi="MS Gothic"/>
+            </w:rPr>
+            <w:t>☐</w:t>
+          </w:r>
+        </w:sdtContent>
+      </w:sdt>
+      <w:r>
+        <w:t xml:space="preserve"> </w:t>
+      </w:r>
+      <w:r>
+        <w:rPr/>
+        <w:t>A numbered task keeps its number and gains a check box.</w:t>
+      </w:r>
+    </w:p>
+    <w:p>
+      <w:pPr>
+        <w:pStyle w:val="Heading2"/>
+      </w:pPr>
+      <w:bookmarkStart w:id="18" w:name="md_44ea7c2cfd1629da0518d67c8eca"/>
+      <w:bookmarkEnd w:id="18"/>
+      <w:r>
+        <w:rPr/>
+        <w:t>Thematic breaks and empty blocks</w:t>
+      </w:r>
+    </w:p>
+    <w:p>
+      <w:pPr/>
+      <w:r>
+        <w:rPr/>
+        <w:t>A horizontal rule below uses Word's standard paragraph border.</w:t>
+      </w:r>
+    </w:p>
+    <w:p>
+      <w:pPr>
+        <w:pBdr>
+          <w:bottom w:val="single" w:sz="6" w:space="1" w:color="auto"/>
+        </w:pBdr>
+      </w:pPr>
+    </w:p>
+    <w:p>
+      <w:pPr/>
+      <w:r>
+        <w:rPr/>
+        <w:t>The empty link label stays visible without a destination.</w:t>
+      </w:r>
+    </w:p>
+    <w:p>
+      <w:pPr>
+        <w:pStyle w:val="ListBullet"/>
+        <w:numPr>
+          <w:ilvl w:val="0"/>
+          <w:numId w:val="34"/>
+        </w:numPr>
+      </w:pPr>
+      <w:r>
+        <w:rPr/>
+        <w:t>A list item before an empty one.</w:t>
+      </w:r>
+    </w:p>
+    <w:p>
+      <w:pPr>
+        <w:pStyle w:val="ListBullet"/>
+        <w:numPr>
+          <w:ilvl w:val="0"/>
+          <w:numId w:val="34"/>
+        </w:numPr>
+      </w:pPr>
+    </w:p>
+    <w:p>
+      <w:pPr>
+        <w:pStyle w:val="ListBullet"/>
+        <w:numPr>
+          <w:ilvl w:val="0"/>
+          <w:numId w:val="34"/>
+        </w:numPr>
+      </w:pPr>
+      <w:r>
+        <w:rPr/>
+        <w:t>A list item after an empty one.</w:t>
+      </w:r>
+    </w:p>
+    <w:p>
+      <w:pPr>
+        <w:pStyle w:val="Quote"/>
+        <w:ind w:left="720"/>
+      </w:pPr>
+    </w:p>
+    <w:p>
+      <w:pPr/>
+      <w:r>
+        <w:rPr/>
+        <w:t>The preceding quote is an empty Word paragraph with the Quote style.</w:t>
       </w:r>
     </w:p>
     <w:p>
@@ -1333,8 +2251,8 @@
       <w:pPr>
         <w:pStyle w:val="Heading1"/>
       </w:pPr>
-      <w:bookmarkStart w:id="13" w:name="md_4e45b09e0dac07d9d9474bd6a825"/>
-      <w:bookmarkEnd w:id="13"/>
+      <w:bookmarkStart w:id="19" w:name="md_4e45b09e0dac07d9d9474bd6a825"/>
+      <w:bookmarkEnd w:id="19"/>
       <w:r>
         <w:rPr/>
         <w:t>A4 Layout Lab</w:t>
@@ -1544,7 +2462,7 @@
             <w:pPr>
               <w:jc w:val="left"/>
             </w:pPr>
-            <w:hyperlink w:tooltip="Open the project" r:id="rId16">
+            <w:hyperlink w:tooltip="Open the project" r:id="rId18">
               <w:r>
                 <w:rPr>
                   <w:rStyle w:val="Hyperlink"/>
@@ -1572,7 +2490,7 @@
         <w:drawing>
           <wp:inline xmlns:a="http://schemas.openxmlformats.org/drawingml/2006/main" xmlns:pic="http://schemas.openxmlformats.org/drawingml/2006/picture">
             <wp:extent cx="6264000" cy="2505600"/>
-            <wp:docPr id="6" name="Picture 6" descr="Natural-width dog cameo used to demonstrate page clamping"/>
+            <wp:docPr id="8" name="Picture 8" descr="Natural-width dog cameo used to demonstrate page clamping"/>
             <wp:cNvGraphicFramePr>
               <a:graphicFrameLocks noChangeAspect="1"/>
             </wp:cNvGraphicFramePr>
@@ -1584,7 +2502,7 @@
                     <pic:cNvPicPr/>
                   </pic:nvPicPr>
                   <pic:blipFill>
-                    <a:blip r:embed="rId17"/>
+                    <a:blip r:embed="rId19"/>
                     <a:stretch>
                       <a:fillRect/>
                     </a:stretch>
@@ -1617,8 +2535,8 @@
       <w:pPr>
         <w:pStyle w:val="Heading1"/>
       </w:pPr>
-      <w:bookmarkStart w:id="14" w:name="md_1bf6c18defbb212aebe8b6ce6927"/>
-      <w:bookmarkEnd w:id="14"/>
+      <w:bookmarkStart w:id="20" w:name="md_1bf6c18defbb212aebe8b6ce6927"/>
+      <w:bookmarkEnd w:id="20"/>
       <w:r>
         <w:rPr/>
         <w:t>Legal Landscape Lab</w:t>
@@ -1838,7 +2756,7 @@
         <w:drawing>
           <wp:inline xmlns:a="http://schemas.openxmlformats.org/drawingml/2006/main" xmlns:pic="http://schemas.openxmlformats.org/drawingml/2006/picture">
             <wp:extent cx="5400000" cy="1800000"/>
-            <wp:docPr id="7" name="Picture 7" descr="Right-aligned dog team on legal landscape paper"/>
+            <wp:docPr id="9" name="Picture 9" descr="Right-aligned dog team on legal landscape paper"/>
             <wp:cNvGraphicFramePr>
               <a:graphicFrameLocks noChangeAspect="1"/>
             </wp:cNvGraphicFramePr>
@@ -1883,8 +2801,8 @@
       <w:pPr>
         <w:pStyle w:val="Heading1"/>
       </w:pPr>
-      <w:bookmarkStart w:id="15" w:name="md_a009503c39a92748e3d467d7c61a"/>
-      <w:bookmarkEnd w:id="15"/>
+      <w:bookmarkStart w:id="21" w:name="md_a009503c39a92748e3d467d7c61a"/>
+      <w:bookmarkEnd w:id="21"/>
       <w:r>
         <w:rPr/>
         <w:t>Custom Page Lab</w:t>
@@ -1905,7 +2823,7 @@
         <w:drawing>
           <wp:inline xmlns:a="http://schemas.openxmlformats.org/drawingml/2006/main" xmlns:pic="http://schemas.openxmlformats.org/drawingml/2006/picture">
             <wp:extent cx="4572000" cy="1524000"/>
-            <wp:docPr id="8" name="Picture 8" descr="Point-sized illustration on a custom page"/>
+            <wp:docPr id="10" name="Picture 10" descr="Point-sized illustration on a custom page"/>
             <wp:cNvGraphicFramePr>
               <a:graphicFrameLocks noChangeAspect="1"/>
             </wp:cNvGraphicFramePr>
@@ -1940,8 +2858,8 @@
       <w:pPr>
         <w:pStyle w:val="Heading2"/>
       </w:pPr>
-      <w:bookmarkStart w:id="16" w:name="md_f383a0d0b844d9b00681969c334c"/>
-      <w:bookmarkEnd w:id="16"/>
+      <w:bookmarkStart w:id="22" w:name="md_f383a0d0b844d9b00681969c334c"/>
+      <w:bookmarkEnd w:id="22"/>
       <w:r>
         <w:rPr/>
         <w:t>Environment-dependent coverage</w:t>
@@ -2074,8 +2992,8 @@
       <w:pPr>
         <w:pStyle w:val="Heading1"/>
       </w:pPr>
-      <w:bookmarkStart w:id="17" w:name="md_ac49b03d58a09e1d112171499dfe"/>
-      <w:bookmarkEnd w:id="17"/>
+      <w:bookmarkStart w:id="23" w:name="md_ac49b03d58a09e1d112171499dfe"/>
+      <w:bookmarkEnd w:id="23"/>
       <w:r>
         <w:rPr/>
         <w:t>Back to Document Defaults</w:t>
@@ -2104,7 +3022,7 @@
         <w:rPr/>
         <w:t xml:space="preserve">. Headings, paragraphs, quotes, code, lists, tables, hyperlinks, images, page breaks, and sections are all native Word content. Read the </w:t>
       </w:r>
-      <w:hyperlink r:id="rId16">
+      <w:hyperlink r:id="rId18">
         <w:r>
           <w:rPr>
             <w:rStyle w:val="Hyperlink"/>
@@ -2121,8 +3039,8 @@
       <w:pPr>
         <w:pStyle w:val="Heading2"/>
       </w:pPr>
-      <w:bookmarkStart w:id="18" w:name="md_9652f0b201e92db1e8d62a4c5b77"/>
-      <w:bookmarkEnd w:id="18"/>
+      <w:bookmarkStart w:id="24" w:name="md_9652f0b201e92db1e8d62a4c5b77"/>
+      <w:bookmarkEnd w:id="24"/>
       <w:r>
         <w:rPr/>
         <w:t>Native footnotes</w:t>
@@ -2150,8 +3068,8 @@
       <w:pPr>
         <w:pStyle w:val="Heading2"/>
       </w:pPr>
-      <w:bookmarkStart w:id="19" w:name="md_03a6d15b03b1c0e43eb5c060ff2b"/>
-      <w:bookmarkEnd w:id="19"/>
+      <w:bookmarkStart w:id="25" w:name="md_03a6d15b03b1c0e43eb5c060ff2b"/>
+      <w:bookmarkEnd w:id="25"/>
       <w:r>
         <w:rPr/>
         <w:t>Repeating table headers</w:t>
@@ -2274,8 +3192,8 @@
       <w:pPr>
         <w:pStyle w:val="Heading2"/>
       </w:pPr>
-      <w:bookmarkStart w:id="20" w:name="md_21d73fac803abc9fd064976aa2c3"/>
-      <w:bookmarkEnd w:id="20"/>
+      <w:bookmarkStart w:id="26" w:name="md_21d73fac803abc9fd064976aa2c3"/>
+      <w:bookmarkEnd w:id="26"/>
       <w:r>
         <w:rPr/>
         <w:t>DOTX formatting templates</w:t>
@@ -2593,7 +3511,7 @@
     </w:lvl>
   </w:abstractNum>
   <w:abstractNum w:abstractNumId="9">
-    <w:nsid w:val="65D8EBBC"/>
+    <w:nsid w:val="7730B4D9"/>
     <w:multiLevelType w:val="singleLevel"/>
     <w:tmpl w:val="29761A62"/>
     <w:lvl w:ilvl="0">
@@ -2614,7 +3532,7 @@
     </w:lvl>
   </w:abstractNum>
   <w:abstractNum w:abstractNumId="10">
-    <w:nsid w:val="2D96D298"/>
+    <w:nsid w:val="9E6132FE"/>
     <w:multiLevelType w:val="singleLevel"/>
     <w:tmpl w:val="29761A62"/>
     <w:lvl w:ilvl="0">
@@ -2635,7 +3553,7 @@
     </w:lvl>
   </w:abstractNum>
   <w:abstractNum w:abstractNumId="11">
-    <w:nsid w:val="2DAA8B90"/>
+    <w:nsid w:val="A81A9034"/>
     <w:multiLevelType w:val="singleLevel"/>
     <w:tmpl w:val="3D1EFFD4"/>
     <w:lvl w:ilvl="0">
@@ -2656,7 +3574,7 @@
     </w:lvl>
   </w:abstractNum>
   <w:abstractNum w:abstractNumId="12">
-    <w:nsid w:val="AF4AE28B"/>
+    <w:nsid w:val="1F913175"/>
     <w:multiLevelType w:val="singleLevel"/>
     <w:tmpl w:val="F3EAFDEC"/>
     <w:lvl w:ilvl="0">
@@ -2677,7 +3595,7 @@
     </w:lvl>
   </w:abstractNum>
   <w:abstractNum w:abstractNumId="13">
-    <w:nsid w:val="4BACE8D0"/>
+    <w:nsid w:val="9C781D57"/>
     <w:multiLevelType w:val="singleLevel"/>
     <w:tmpl w:val="3D1EFFD4"/>
     <w:lvl w:ilvl="0">
@@ -2698,7 +3616,7 @@
     </w:lvl>
   </w:abstractNum>
   <w:abstractNum w:abstractNumId="14">
-    <w:nsid w:val="1E161B4E"/>
+    <w:nsid w:val="FC9B84B9"/>
     <w:multiLevelType w:val="singleLevel"/>
     <w:tmpl w:val="F3EAFDEC"/>
     <w:lvl w:ilvl="0">
@@ -2719,14 +3637,14 @@
     </w:lvl>
   </w:abstractNum>
   <w:abstractNum w:abstractNumId="15">
-    <w:nsid w:val="7C297919"/>
+    <w:nsid w:val="9A2A702F"/>
     <w:multiLevelType w:val="singleLevel"/>
-    <w:tmpl w:val="D0A62B40"/>
+    <w:tmpl w:val="29761A62"/>
     <w:lvl w:ilvl="0">
       <w:start w:val="1"/>
-      <w:numFmt w:val="decimal"/>
-      <w:pStyle w:val="ListNumber"/>
-      <w:lvlText w:val="%1."/>
+      <w:numFmt w:val="bullet"/>
+      <w:pStyle w:val="ListBullet"/>
+      <w:lvlText w:val=""/>
       <w:lvlJc w:val="left"/>
       <w:pPr>
         <w:tabs>
@@ -2734,10 +3652,13 @@
         </w:tabs>
         <w:ind w:left="360" w:hanging="360"/>
       </w:pPr>
+      <w:rPr>
+        <w:rFonts w:ascii="Symbol" w:hAnsi="Symbol" w:hint="default"/>
+      </w:rPr>
     </w:lvl>
   </w:abstractNum>
   <w:abstractNum w:abstractNumId="16">
-    <w:nsid w:val="2E5E0A87"/>
+    <w:nsid w:val="0D4C155C"/>
     <w:multiLevelType w:val="singleLevel"/>
     <w:tmpl w:val="D0A62B40"/>
     <w:lvl w:ilvl="0">
@@ -2755,70 +3676,7 @@
     </w:lvl>
   </w:abstractNum>
   <w:abstractNum w:abstractNumId="17">
-    <w:nsid w:val="C194A30A"/>
-    <w:multiLevelType w:val="singleLevel"/>
-    <w:tmpl w:val="29761A62"/>
-    <w:lvl w:ilvl="0">
-      <w:start w:val="1"/>
-      <w:numFmt w:val="bullet"/>
-      <w:pStyle w:val="ListBullet"/>
-      <w:lvlText w:val=""/>
-      <w:lvlJc w:val="left"/>
-      <w:pPr>
-        <w:tabs>
-          <w:tab w:val="num" w:pos="360"/>
-        </w:tabs>
-        <w:ind w:left="360" w:hanging="360"/>
-      </w:pPr>
-      <w:rPr>
-        <w:rFonts w:ascii="Symbol" w:hAnsi="Symbol" w:hint="default"/>
-      </w:rPr>
-    </w:lvl>
-  </w:abstractNum>
-  <w:abstractNum w:abstractNumId="18">
-    <w:nsid w:val="19483D54"/>
-    <w:multiLevelType w:val="singleLevel"/>
-    <w:tmpl w:val="3D1EFFD4"/>
-    <w:lvl w:ilvl="0">
-      <w:start w:val="1"/>
-      <w:numFmt w:val="bullet"/>
-      <w:pStyle w:val="ListBullet2"/>
-      <w:lvlText w:val=""/>
-      <w:lvlJc w:val="left"/>
-      <w:pPr>
-        <w:tabs>
-          <w:tab w:val="num" w:pos="720"/>
-        </w:tabs>
-        <w:ind w:left="720" w:hanging="360"/>
-      </w:pPr>
-      <w:rPr>
-        <w:rFonts w:ascii="Symbol" w:hAnsi="Symbol" w:hint="default"/>
-      </w:rPr>
-    </w:lvl>
-  </w:abstractNum>
-  <w:abstractNum w:abstractNumId="19">
-    <w:nsid w:val="04F9D18C"/>
-    <w:multiLevelType w:val="singleLevel"/>
-    <w:tmpl w:val="F3EAFDEC"/>
-    <w:lvl w:ilvl="0">
-      <w:start w:val="1"/>
-      <w:numFmt w:val="bullet"/>
-      <w:pStyle w:val="ListBullet3"/>
-      <w:lvlText w:val=""/>
-      <w:lvlJc w:val="left"/>
-      <w:pPr>
-        <w:tabs>
-          <w:tab w:val="num" w:pos="1080"/>
-        </w:tabs>
-        <w:ind w:left="1080" w:hanging="360"/>
-      </w:pPr>
-      <w:rPr>
-        <w:rFonts w:ascii="Symbol" w:hAnsi="Symbol" w:hint="default"/>
-      </w:rPr>
-    </w:lvl>
-  </w:abstractNum>
-  <w:abstractNum w:abstractNumId="20">
-    <w:nsid w:val="79ACDD63"/>
+    <w:nsid w:val="5AE34D59"/>
     <w:multiLevelType w:val="singleLevel"/>
     <w:tmpl w:val="D0A62B40"/>
     <w:lvl w:ilvl="0">
@@ -2835,8 +3693,89 @@
       </w:pPr>
     </w:lvl>
   </w:abstractNum>
+  <w:abstractNum w:abstractNumId="18">
+    <w:nsid w:val="1BE27D60"/>
+    <w:multiLevelType w:val="singleLevel"/>
+    <w:tmpl w:val="29761A62"/>
+    <w:lvl w:ilvl="0">
+      <w:start w:val="1"/>
+      <w:numFmt w:val="bullet"/>
+      <w:pStyle w:val="ListBullet"/>
+      <w:lvlText w:val=""/>
+      <w:lvlJc w:val="left"/>
+      <w:pPr>
+        <w:tabs>
+          <w:tab w:val="num" w:pos="360"/>
+        </w:tabs>
+        <w:ind w:left="360" w:hanging="360"/>
+      </w:pPr>
+      <w:rPr>
+        <w:rFonts w:ascii="Symbol" w:hAnsi="Symbol" w:hint="default"/>
+      </w:rPr>
+    </w:lvl>
+  </w:abstractNum>
+  <w:abstractNum w:abstractNumId="19">
+    <w:nsid w:val="149258D0"/>
+    <w:multiLevelType w:val="singleLevel"/>
+    <w:tmpl w:val="3D1EFFD4"/>
+    <w:lvl w:ilvl="0">
+      <w:start w:val="1"/>
+      <w:numFmt w:val="bullet"/>
+      <w:pStyle w:val="ListBullet2"/>
+      <w:lvlText w:val=""/>
+      <w:lvlJc w:val="left"/>
+      <w:pPr>
+        <w:tabs>
+          <w:tab w:val="num" w:pos="720"/>
+        </w:tabs>
+        <w:ind w:left="720" w:hanging="360"/>
+      </w:pPr>
+      <w:rPr>
+        <w:rFonts w:ascii="Symbol" w:hAnsi="Symbol" w:hint="default"/>
+      </w:rPr>
+    </w:lvl>
+  </w:abstractNum>
+  <w:abstractNum w:abstractNumId="20">
+    <w:nsid w:val="92BCC5FB"/>
+    <w:multiLevelType w:val="singleLevel"/>
+    <w:tmpl w:val="F3EAFDEC"/>
+    <w:lvl w:ilvl="0">
+      <w:start w:val="1"/>
+      <w:numFmt w:val="bullet"/>
+      <w:pStyle w:val="ListBullet3"/>
+      <w:lvlText w:val=""/>
+      <w:lvlJc w:val="left"/>
+      <w:pPr>
+        <w:tabs>
+          <w:tab w:val="num" w:pos="1080"/>
+        </w:tabs>
+        <w:ind w:left="1080" w:hanging="360"/>
+      </w:pPr>
+      <w:rPr>
+        <w:rFonts w:ascii="Symbol" w:hAnsi="Symbol" w:hint="default"/>
+      </w:rPr>
+    </w:lvl>
+  </w:abstractNum>
   <w:abstractNum w:abstractNumId="21">
-    <w:nsid w:val="AD18A0B1"/>
+    <w:nsid w:val="B89B68F4"/>
+    <w:multiLevelType w:val="singleLevel"/>
+    <w:tmpl w:val="D0A62B40"/>
+    <w:lvl w:ilvl="0">
+      <w:start w:val="1"/>
+      <w:numFmt w:val="decimal"/>
+      <w:pStyle w:val="ListNumber"/>
+      <w:lvlText w:val="%1."/>
+      <w:lvlJc w:val="left"/>
+      <w:pPr>
+        <w:tabs>
+          <w:tab w:val="num" w:pos="360"/>
+        </w:tabs>
+        <w:ind w:left="360" w:hanging="360"/>
+      </w:pPr>
+    </w:lvl>
+  </w:abstractNum>
+  <w:abstractNum w:abstractNumId="22">
+    <w:nsid w:val="940A9063"/>
     <w:multiLevelType w:val="singleLevel"/>
     <w:tmpl w:val="38441652"/>
     <w:lvl w:ilvl="0">
@@ -2853,8 +3792,8 @@
       </w:pPr>
     </w:lvl>
   </w:abstractNum>
-  <w:abstractNum w:abstractNumId="22">
-    <w:nsid w:val="76A350BF"/>
+  <w:abstractNum w:abstractNumId="23">
+    <w:nsid w:val="35709BC1"/>
     <w:multiLevelType w:val="singleLevel"/>
     <w:tmpl w:val="FB12693A"/>
     <w:lvl w:ilvl="0">
@@ -2871,8 +3810,8 @@
       </w:pPr>
     </w:lvl>
   </w:abstractNum>
-  <w:abstractNum w:abstractNumId="23">
-    <w:nsid w:val="58478D63"/>
+  <w:abstractNum w:abstractNumId="24">
+    <w:nsid w:val="94589360"/>
     <w:multiLevelType w:val="singleLevel"/>
     <w:tmpl w:val="29761A62"/>
     <w:lvl w:ilvl="0">
@@ -2892,8 +3831,8 @@
       </w:rPr>
     </w:lvl>
   </w:abstractNum>
-  <w:abstractNum w:abstractNumId="24">
-    <w:nsid w:val="1F27C80A"/>
+  <w:abstractNum w:abstractNumId="25">
+    <w:nsid w:val="145B51CB"/>
     <w:multiLevelType w:val="singleLevel"/>
     <w:tmpl w:val="38441652"/>
     <w:lvl w:ilvl="0">
@@ -2910,8 +3849,8 @@
       </w:pPr>
     </w:lvl>
   </w:abstractNum>
-  <w:abstractNum w:abstractNumId="25">
-    <w:nsid w:val="36788B1A"/>
+  <w:abstractNum w:abstractNumId="26">
+    <w:nsid w:val="2C64E906"/>
     <w:multiLevelType w:val="singleLevel"/>
     <w:tmpl w:val="FB12693A"/>
     <w:lvl w:ilvl="0">
@@ -2928,8 +3867,8 @@
       </w:pPr>
     </w:lvl>
   </w:abstractNum>
-  <w:abstractNum w:abstractNumId="26">
-    <w:nsid w:val="B661ACD2"/>
+  <w:abstractNum w:abstractNumId="27">
+    <w:nsid w:val="53E737A2"/>
     <w:multiLevelType w:val="singleLevel"/>
     <w:tmpl w:val="D0A62B40"/>
     <w:lvl w:ilvl="0">
@@ -2946,8 +3885,8 @@
       </w:pPr>
     </w:lvl>
   </w:abstractNum>
-  <w:abstractNum w:abstractNumId="27">
-    <w:nsid w:val="4BBC6FC1"/>
+  <w:abstractNum w:abstractNumId="28">
+    <w:nsid w:val="9A689CFB"/>
     <w:multiLevelType w:val="singleLevel"/>
     <w:tmpl w:val="3D1EFFD4"/>
     <w:lvl w:ilvl="0">
@@ -2967,8 +3906,8 @@
       </w:rPr>
     </w:lvl>
   </w:abstractNum>
-  <w:abstractNum w:abstractNumId="28">
-    <w:nsid w:val="AE522809"/>
+  <w:abstractNum w:abstractNumId="29">
+    <w:nsid w:val="D1F6FA02"/>
     <w:multiLevelType w:val="singleLevel"/>
     <w:tmpl w:val="F3EAFDEC"/>
     <w:lvl w:ilvl="0">
@@ -2982,6 +3921,84 @@
           <w:tab w:val="num" w:pos="1080"/>
         </w:tabs>
         <w:ind w:left="1080" w:hanging="360"/>
+      </w:pPr>
+      <w:rPr>
+        <w:rFonts w:ascii="Symbol" w:hAnsi="Symbol" w:hint="default"/>
+      </w:rPr>
+    </w:lvl>
+  </w:abstractNum>
+  <w:abstractNum w:abstractNumId="30">
+    <w:nsid w:val="EBCC2F5C"/>
+    <w:multiLevelType w:val="singleLevel"/>
+    <w:tmpl w:val="D0A62B40"/>
+    <w:lvl w:ilvl="0">
+      <w:start w:val="1"/>
+      <w:numFmt w:val="decimal"/>
+      <w:pStyle w:val="ListNumber"/>
+      <w:lvlText w:val="%1."/>
+      <w:lvlJc w:val="left"/>
+      <w:pPr>
+        <w:tabs>
+          <w:tab w:val="num" w:pos="360"/>
+        </w:tabs>
+        <w:ind w:left="360" w:hanging="360"/>
+      </w:pPr>
+    </w:lvl>
+  </w:abstractNum>
+  <w:abstractNum w:abstractNumId="31">
+    <w:nsid w:val="BFEABEC4"/>
+    <w:multiLevelType w:val="singleLevel"/>
+    <w:tmpl w:val="29761A62"/>
+    <w:lvl w:ilvl="0">
+      <w:start w:val="1"/>
+      <w:numFmt w:val="bullet"/>
+      <w:pStyle w:val="ListBullet"/>
+      <w:lvlText w:val=""/>
+      <w:lvlJc w:val="left"/>
+      <w:pPr>
+        <w:tabs>
+          <w:tab w:val="num" w:pos="360"/>
+        </w:tabs>
+        <w:ind w:left="360" w:hanging="360"/>
+      </w:pPr>
+      <w:rPr>
+        <w:rFonts w:ascii="Symbol" w:hAnsi="Symbol" w:hint="default"/>
+      </w:rPr>
+    </w:lvl>
+  </w:abstractNum>
+  <w:abstractNum w:abstractNumId="32">
+    <w:nsid w:val="EF1400A3"/>
+    <w:multiLevelType w:val="singleLevel"/>
+    <w:tmpl w:val="D0A62B40"/>
+    <w:lvl w:ilvl="0">
+      <w:start w:val="1"/>
+      <w:numFmt w:val="decimal"/>
+      <w:pStyle w:val="ListNumber"/>
+      <w:lvlText w:val="%1."/>
+      <w:lvlJc w:val="left"/>
+      <w:pPr>
+        <w:tabs>
+          <w:tab w:val="num" w:pos="360"/>
+        </w:tabs>
+        <w:ind w:left="360" w:hanging="360"/>
+      </w:pPr>
+    </w:lvl>
+  </w:abstractNum>
+  <w:abstractNum w:abstractNumId="33">
+    <w:nsid w:val="61E34FA7"/>
+    <w:multiLevelType w:val="singleLevel"/>
+    <w:tmpl w:val="29761A62"/>
+    <w:lvl w:ilvl="0">
+      <w:start w:val="1"/>
+      <w:numFmt w:val="bullet"/>
+      <w:pStyle w:val="ListBullet"/>
+      <w:lvlText w:val=""/>
+      <w:lvlJc w:val="left"/>
+      <w:pPr>
+        <w:tabs>
+          <w:tab w:val="num" w:pos="360"/>
+        </w:tabs>
+        <w:ind w:left="360" w:hanging="360"/>
       </w:pPr>
       <w:rPr>
         <w:rFonts w:ascii="Symbol" w:hAnsi="Symbol" w:hint="default"/>
@@ -3054,13 +4071,13 @@
   <w:num w:numId="16">
     <w:abstractNumId w:val="15"/>
     <w:lvlOverride w:ilvl="0">
-      <w:startOverride w:val="3"/>
+      <w:startOverride w:val="1"/>
     </w:lvlOverride>
   </w:num>
   <w:num w:numId="17">
     <w:abstractNumId w:val="16"/>
     <w:lvlOverride w:ilvl="0">
-      <w:startOverride w:val="1"/>
+      <w:startOverride w:val="3"/>
     </w:lvlOverride>
   </w:num>
   <w:num w:numId="18">
@@ -3131,6 +4148,36 @@
   </w:num>
   <w:num w:numId="29">
     <w:abstractNumId w:val="28"/>
+    <w:lvlOverride w:ilvl="0">
+      <w:startOverride w:val="1"/>
+    </w:lvlOverride>
+  </w:num>
+  <w:num w:numId="30">
+    <w:abstractNumId w:val="29"/>
+    <w:lvlOverride w:ilvl="0">
+      <w:startOverride w:val="1"/>
+    </w:lvlOverride>
+  </w:num>
+  <w:num w:numId="31">
+    <w:abstractNumId w:val="30"/>
+    <w:lvlOverride w:ilvl="0">
+      <w:startOverride w:val="1"/>
+    </w:lvlOverride>
+  </w:num>
+  <w:num w:numId="32">
+    <w:abstractNumId w:val="31"/>
+    <w:lvlOverride w:ilvl="0">
+      <w:startOverride w:val="1"/>
+    </w:lvlOverride>
+  </w:num>
+  <w:num w:numId="33">
+    <w:abstractNumId w:val="32"/>
+    <w:lvlOverride w:ilvl="0">
+      <w:startOverride w:val="1"/>
+    </w:lvlOverride>
+  </w:num>
+  <w:num w:numId="34">
+    <w:abstractNumId w:val="33"/>
     <w:lvlOverride w:ilvl="0">
       <w:startOverride w:val="1"/>
     </w:lvlOverride>

</xml_diff>

<commit_message>
Add common language highlighting gallery to showcase
</commit_message>
<xml_diff>
--- a/sample/showcase.docx
+++ b/sample/showcase.docx
@@ -3236,6 +3236,1652 @@
         <w:t>, and the source template stays unchanged.</w:t>
       </w:r>
     </w:p>
+    <w:p>
+      <w:r>
+        <w:br w:type="page"/>
+      </w:r>
+    </w:p>
+    <w:p>
+      <w:pPr>
+        <w:pStyle w:val="Heading1"/>
+      </w:pPr>
+      <w:bookmarkStart w:id="27" w:name="md_405a2a09468512564f0ffac0912c"/>
+      <w:bookmarkEnd w:id="27"/>
+      <w:r>
+        <w:rPr/>
+        <w:t>Syntax Highlighting Gallery</w:t>
+      </w:r>
+    </w:p>
+    <w:p>
+      <w:pPr/>
+      <w:r>
+        <w:rPr/>
+        <w:t>Each code fence names a Pygments language. The colored code remains editable text in Word.</w:t>
+      </w:r>
+    </w:p>
+    <w:p>
+      <w:pPr>
+        <w:pStyle w:val="Heading2"/>
+      </w:pPr>
+      <w:bookmarkStart w:id="28" w:name="md_e5e239560bc125a20ff2ac1fea50"/>
+      <w:bookmarkEnd w:id="28"/>
+      <w:r>
+        <w:rPr/>
+        <w:t>HTML</w:t>
+      </w:r>
+    </w:p>
+    <w:p>
+      <w:pPr>
+        <w:pStyle w:val="CodeBlock"/>
+      </w:pPr>
+      <w:r>
+        <w:t>&lt;</w:t>
+      </w:r>
+      <w:r>
+        <w:rPr>
+          <w:b/>
+          <w:color w:val="008000"/>
+        </w:rPr>
+        <w:t>main</w:t>
+      </w:r>
+      <w:r>
+        <w:t xml:space="preserve"> </w:t>
+      </w:r>
+      <w:r>
+        <w:rPr>
+          <w:color w:val="687822"/>
+        </w:rPr>
+        <w:t>class</w:t>
+      </w:r>
+      <w:r>
+        <w:rPr>
+          <w:color w:val="666666"/>
+        </w:rPr>
+        <w:t>=</w:t>
+      </w:r>
+      <w:r>
+        <w:rPr>
+          <w:color w:val="BA2121"/>
+        </w:rPr>
+        <w:t>"card"</w:t>
+      </w:r>
+      <w:r>
+        <w:t>&gt;</w:t>
+      </w:r>
+      <w:r>
+        <w:br/>
+        <w:t xml:space="preserve">  </w:t>
+      </w:r>
+      <w:r>
+        <w:t>&lt;</w:t>
+      </w:r>
+      <w:r>
+        <w:rPr>
+          <w:b/>
+          <w:color w:val="008000"/>
+        </w:rPr>
+        <w:t>h1</w:t>
+      </w:r>
+      <w:r>
+        <w:t>&gt;</w:t>
+      </w:r>
+      <w:r>
+        <w:t>Hello, Word</w:t>
+      </w:r>
+      <w:r>
+        <w:t>&lt;</w:t>
+      </w:r>
+      <w:r>
+        <w:t>/</w:t>
+      </w:r>
+      <w:r>
+        <w:rPr>
+          <w:b/>
+          <w:color w:val="008000"/>
+        </w:rPr>
+        <w:t>h1</w:t>
+      </w:r>
+      <w:r>
+        <w:t>&gt;</w:t>
+      </w:r>
+      <w:r>
+        <w:br/>
+      </w:r>
+      <w:r>
+        <w:t>&lt;</w:t>
+      </w:r>
+      <w:r>
+        <w:t>/</w:t>
+      </w:r>
+      <w:r>
+        <w:rPr>
+          <w:b/>
+          <w:color w:val="008000"/>
+        </w:rPr>
+        <w:t>main</w:t>
+      </w:r>
+      <w:r>
+        <w:t>&gt;</w:t>
+      </w:r>
+    </w:p>
+    <w:p>
+      <w:pPr>
+        <w:pStyle w:val="Heading2"/>
+      </w:pPr>
+      <w:bookmarkStart w:id="29" w:name="md_36e64f19f57a05c8cd5b6bf7eff7"/>
+      <w:bookmarkEnd w:id="29"/>
+      <w:r>
+        <w:rPr/>
+        <w:t>CSS</w:t>
+      </w:r>
+    </w:p>
+    <w:p>
+      <w:pPr>
+        <w:pStyle w:val="CodeBlock"/>
+      </w:pPr>
+      <w:r>
+        <w:t>.</w:t>
+      </w:r>
+      <w:r>
+        <w:rPr>
+          <w:b/>
+          <w:color w:val="0000FF"/>
+        </w:rPr>
+        <w:t>card</w:t>
+      </w:r>
+      <w:r>
+        <w:t xml:space="preserve"> </w:t>
+      </w:r>
+      <w:r>
+        <w:t>{</w:t>
+      </w:r>
+      <w:r>
+        <w:br/>
+        <w:t xml:space="preserve">  </w:t>
+      </w:r>
+      <w:r>
+        <w:rPr>
+          <w:b/>
+          <w:color w:val="008000"/>
+        </w:rPr>
+        <w:t>color</w:t>
+      </w:r>
+      <w:r>
+        <w:t>:</w:t>
+      </w:r>
+      <w:r>
+        <w:t xml:space="preserve"> </w:t>
+      </w:r>
+      <w:r>
+        <w:rPr>
+          <w:color w:val="666666"/>
+        </w:rPr>
+        <w:t>#2464a4</w:t>
+      </w:r>
+      <w:r>
+        <w:t>;</w:t>
+      </w:r>
+      <w:r>
+        <w:br/>
+        <w:t xml:space="preserve">  </w:t>
+      </w:r>
+      <w:r>
+        <w:rPr>
+          <w:b/>
+          <w:color w:val="008000"/>
+        </w:rPr>
+        <w:t>padding</w:t>
+      </w:r>
+      <w:r>
+        <w:t>:</w:t>
+      </w:r>
+      <w:r>
+        <w:t xml:space="preserve"> </w:t>
+      </w:r>
+      <w:r>
+        <w:rPr>
+          <w:color w:val="666666"/>
+        </w:rPr>
+        <w:t>1</w:t>
+      </w:r>
+      <w:r>
+        <w:rPr>
+          <w:color w:val="B00040"/>
+        </w:rPr>
+        <w:t>rem</w:t>
+      </w:r>
+      <w:r>
+        <w:t>;</w:t>
+      </w:r>
+      <w:r>
+        <w:br/>
+      </w:r>
+      <w:r>
+        <w:t>}</w:t>
+      </w:r>
+    </w:p>
+    <w:p>
+      <w:pPr>
+        <w:pStyle w:val="Heading2"/>
+      </w:pPr>
+      <w:bookmarkStart w:id="30" w:name="md_eda71746c01c3f465ffd02b6da15"/>
+      <w:bookmarkEnd w:id="30"/>
+      <w:r>
+        <w:rPr/>
+        <w:t>JavaScript</w:t>
+      </w:r>
+    </w:p>
+    <w:p>
+      <w:pPr>
+        <w:pStyle w:val="CodeBlock"/>
+      </w:pPr>
+      <w:r>
+        <w:rPr>
+          <w:b/>
+          <w:color w:val="008000"/>
+        </w:rPr>
+        <w:t>const</w:t>
+      </w:r>
+      <w:r>
+        <w:t xml:space="preserve"> </w:t>
+      </w:r>
+      <w:r>
+        <w:t>greet</w:t>
+      </w:r>
+      <w:r>
+        <w:t xml:space="preserve"> </w:t>
+      </w:r>
+      <w:r>
+        <w:rPr>
+          <w:color w:val="666666"/>
+        </w:rPr>
+        <w:t>=</w:t>
+      </w:r>
+      <w:r>
+        <w:t xml:space="preserve"> </w:t>
+      </w:r>
+      <w:r>
+        <w:t>name</w:t>
+      </w:r>
+      <w:r>
+        <w:t xml:space="preserve"> </w:t>
+      </w:r>
+      <w:r>
+        <w:t>=&gt;</w:t>
+      </w:r>
+      <w:r>
+        <w:t xml:space="preserve"> </w:t>
+      </w:r>
+      <w:r>
+        <w:rPr>
+          <w:color w:val="BA2121"/>
+        </w:rPr>
+        <w:t>`</w:t>
+      </w:r>
+      <w:r>
+        <w:rPr>
+          <w:color w:val="BA2121"/>
+        </w:rPr>
+        <w:t xml:space="preserve">Hello, </w:t>
+      </w:r>
+      <w:r>
+        <w:rPr>
+          <w:b/>
+          <w:color w:val="A45A77"/>
+        </w:rPr>
+        <w:t>${</w:t>
+      </w:r>
+      <w:r>
+        <w:t>name</w:t>
+      </w:r>
+      <w:r>
+        <w:rPr>
+          <w:b/>
+          <w:color w:val="A45A77"/>
+        </w:rPr>
+        <w:t>}</w:t>
+      </w:r>
+      <w:r>
+        <w:rPr>
+          <w:color w:val="BA2121"/>
+        </w:rPr>
+        <w:t>`</w:t>
+      </w:r>
+      <w:r>
+        <w:br/>
+      </w:r>
+      <w:r>
+        <w:t>console</w:t>
+      </w:r>
+      <w:r>
+        <w:t>.</w:t>
+      </w:r>
+      <w:r>
+        <w:t>log</w:t>
+      </w:r>
+      <w:r>
+        <w:t>(</w:t>
+      </w:r>
+      <w:r>
+        <w:t>greet</w:t>
+      </w:r>
+      <w:r>
+        <w:t>(</w:t>
+      </w:r>
+      <w:r>
+        <w:rPr>
+          <w:color w:val="BA2121"/>
+        </w:rPr>
+        <w:t>"Word"</w:t>
+      </w:r>
+      <w:r>
+        <w:t>)</w:t>
+      </w:r>
+      <w:r>
+        <w:t>)</w:t>
+      </w:r>
+    </w:p>
+    <w:p>
+      <w:pPr>
+        <w:pStyle w:val="Heading2"/>
+      </w:pPr>
+      <w:bookmarkStart w:id="31" w:name="md_969545dde1584d88227517c6a0c9"/>
+      <w:bookmarkEnd w:id="31"/>
+      <w:r>
+        <w:rPr/>
+        <w:t>TypeScript</w:t>
+      </w:r>
+    </w:p>
+    <w:p>
+      <w:pPr>
+        <w:pStyle w:val="CodeBlock"/>
+      </w:pPr>
+      <w:r>
+        <w:rPr>
+          <w:b/>
+          <w:color w:val="008000"/>
+        </w:rPr>
+        <w:t>function</w:t>
+      </w:r>
+      <w:r>
+        <w:t xml:space="preserve"> </w:t>
+      </w:r>
+      <w:r>
+        <w:t>greet</w:t>
+      </w:r>
+      <w:r>
+        <w:t>(</w:t>
+      </w:r>
+      <w:r>
+        <w:t>name</w:t>
+      </w:r>
+      <w:r>
+        <w:rPr>
+          <w:color w:val="666666"/>
+        </w:rPr>
+        <w:t>:</w:t>
+      </w:r>
+      <w:r>
+        <w:t xml:space="preserve"> </w:t>
+      </w:r>
+      <w:r>
+        <w:rPr>
+          <w:color w:val="B00040"/>
+        </w:rPr>
+        <w:t>string</w:t>
+      </w:r>
+      <w:r>
+        <w:t>)</w:t>
+      </w:r>
+      <w:r>
+        <w:rPr>
+          <w:color w:val="666666"/>
+        </w:rPr>
+        <w:t>:</w:t>
+      </w:r>
+      <w:r>
+        <w:t xml:space="preserve"> </w:t>
+      </w:r>
+      <w:r>
+        <w:rPr>
+          <w:color w:val="B00040"/>
+        </w:rPr>
+        <w:t>string</w:t>
+      </w:r>
+      <w:r>
+        <w:t xml:space="preserve"> </w:t>
+      </w:r>
+      <w:r>
+        <w:t>{</w:t>
+      </w:r>
+      <w:r>
+        <w:br/>
+        <w:t xml:space="preserve">  </w:t>
+      </w:r>
+      <w:r>
+        <w:rPr>
+          <w:b/>
+          <w:color w:val="008000"/>
+        </w:rPr>
+        <w:t>return</w:t>
+      </w:r>
+      <w:r>
+        <w:t xml:space="preserve"> </w:t>
+      </w:r>
+      <w:r>
+        <w:rPr>
+          <w:color w:val="BA2121"/>
+        </w:rPr>
+        <w:t>`</w:t>
+      </w:r>
+      <w:r>
+        <w:rPr>
+          <w:color w:val="BA2121"/>
+        </w:rPr>
+        <w:t xml:space="preserve">Hello, </w:t>
+      </w:r>
+      <w:r>
+        <w:rPr>
+          <w:b/>
+          <w:color w:val="A45A77"/>
+        </w:rPr>
+        <w:t>${</w:t>
+      </w:r>
+      <w:r>
+        <w:t>name</w:t>
+      </w:r>
+      <w:r>
+        <w:rPr>
+          <w:b/>
+          <w:color w:val="A45A77"/>
+        </w:rPr>
+        <w:t>}</w:t>
+      </w:r>
+      <w:r>
+        <w:rPr>
+          <w:color w:val="BA2121"/>
+        </w:rPr>
+        <w:t>`</w:t>
+      </w:r>
+      <w:r>
+        <w:br/>
+      </w:r>
+      <w:r>
+        <w:t>}</w:t>
+      </w:r>
+    </w:p>
+    <w:p>
+      <w:pPr>
+        <w:pStyle w:val="Heading2"/>
+      </w:pPr>
+      <w:bookmarkStart w:id="32" w:name="md_11a4a60b518bf24989d481468076"/>
+      <w:bookmarkEnd w:id="32"/>
+      <w:r>
+        <w:rPr/>
+        <w:t>Python</w:t>
+      </w:r>
+    </w:p>
+    <w:p>
+      <w:pPr>
+        <w:pStyle w:val="CodeBlock"/>
+      </w:pPr>
+      <w:r>
+        <w:rPr>
+          <w:b/>
+          <w:color w:val="008000"/>
+        </w:rPr>
+        <w:t>def</w:t>
+      </w:r>
+      <w:r>
+        <w:t xml:space="preserve"> </w:t>
+      </w:r>
+      <w:r>
+        <w:rPr>
+          <w:color w:val="0000FF"/>
+        </w:rPr>
+        <w:t>greet</w:t>
+      </w:r>
+      <w:r>
+        <w:t>(</w:t>
+      </w:r>
+      <w:r>
+        <w:t>name</w:t>
+      </w:r>
+      <w:r>
+        <w:t>:</w:t>
+      </w:r>
+      <w:r>
+        <w:t xml:space="preserve"> </w:t>
+      </w:r>
+      <w:r>
+        <w:rPr>
+          <w:color w:val="008000"/>
+        </w:rPr>
+        <w:t>str</w:t>
+      </w:r>
+      <w:r>
+        <w:t>)</w:t>
+      </w:r>
+      <w:r>
+        <w:t xml:space="preserve"> </w:t>
+      </w:r>
+      <w:r>
+        <w:rPr>
+          <w:color w:val="666666"/>
+        </w:rPr>
+        <w:t>-</w:t>
+      </w:r>
+      <w:r>
+        <w:rPr>
+          <w:color w:val="666666"/>
+        </w:rPr>
+        <w:t>&gt;</w:t>
+      </w:r>
+      <w:r>
+        <w:t xml:space="preserve"> </w:t>
+      </w:r>
+      <w:r>
+        <w:rPr>
+          <w:color w:val="008000"/>
+        </w:rPr>
+        <w:t>str</w:t>
+      </w:r>
+      <w:r>
+        <w:t>:</w:t>
+      </w:r>
+      <w:r>
+        <w:br/>
+      </w:r>
+      <w:r>
+        <w:t xml:space="preserve">    </w:t>
+      </w:r>
+      <w:r>
+        <w:rPr>
+          <w:b/>
+          <w:color w:val="008000"/>
+        </w:rPr>
+        <w:t>return</w:t>
+      </w:r>
+      <w:r>
+        <w:t xml:space="preserve"> </w:t>
+      </w:r>
+      <w:r>
+        <w:rPr>
+          <w:color w:val="BA2121"/>
+        </w:rPr>
+        <w:t>f</w:t>
+      </w:r>
+      <w:r>
+        <w:rPr>
+          <w:color w:val="BA2121"/>
+        </w:rPr>
+        <w:t>"</w:t>
+      </w:r>
+      <w:r>
+        <w:rPr>
+          <w:color w:val="BA2121"/>
+        </w:rPr>
+        <w:t xml:space="preserve">Hello, </w:t>
+      </w:r>
+      <w:r>
+        <w:rPr>
+          <w:b/>
+          <w:color w:val="A45A77"/>
+        </w:rPr>
+        <w:t>{</w:t>
+      </w:r>
+      <w:r>
+        <w:t>name</w:t>
+      </w:r>
+      <w:r>
+        <w:rPr>
+          <w:b/>
+          <w:color w:val="A45A77"/>
+        </w:rPr>
+        <w:t>}</w:t>
+      </w:r>
+      <w:r>
+        <w:rPr>
+          <w:color w:val="BA2121"/>
+        </w:rPr>
+        <w:t>"</w:t>
+      </w:r>
+    </w:p>
+    <w:p>
+      <w:pPr>
+        <w:pStyle w:val="Heading2"/>
+      </w:pPr>
+      <w:bookmarkStart w:id="33" w:name="md_12a5d18ee896e59954bdce0f4acc"/>
+      <w:bookmarkEnd w:id="33"/>
+      <w:r>
+        <w:rPr/>
+        <w:t>PHP</w:t>
+      </w:r>
+    </w:p>
+    <w:p>
+      <w:pPr>
+        <w:pStyle w:val="CodeBlock"/>
+      </w:pPr>
+      <w:r>
+        <w:rPr>
+          <w:color w:val="9C6500"/>
+        </w:rPr>
+        <w:t>&lt;?php</w:t>
+      </w:r>
+      <w:r>
+        <w:br/>
+      </w:r>
+      <w:r>
+        <w:rPr>
+          <w:b/>
+          <w:color w:val="008000"/>
+        </w:rPr>
+        <w:t>function</w:t>
+      </w:r>
+      <w:r>
+        <w:t xml:space="preserve"> </w:t>
+      </w:r>
+      <w:r>
+        <w:rPr>
+          <w:color w:val="0000FF"/>
+        </w:rPr>
+        <w:t>greet</w:t>
+      </w:r>
+      <w:r>
+        <w:t>(</w:t>
+      </w:r>
+      <w:r>
+        <w:t>string</w:t>
+      </w:r>
+      <w:r>
+        <w:t xml:space="preserve"> </w:t>
+      </w:r>
+      <w:r>
+        <w:rPr>
+          <w:color w:val="19177C"/>
+        </w:rPr>
+        <w:t>$name</w:t>
+      </w:r>
+      <w:r>
+        <w:t>)</w:t>
+      </w:r>
+      <w:r>
+        <w:rPr>
+          <w:color w:val="666666"/>
+        </w:rPr>
+        <w:t>:</w:t>
+      </w:r>
+      <w:r>
+        <w:t xml:space="preserve"> </w:t>
+      </w:r>
+      <w:r>
+        <w:t>string</w:t>
+      </w:r>
+      <w:r>
+        <w:t xml:space="preserve"> </w:t>
+      </w:r>
+      <w:r>
+        <w:t>{</w:t>
+      </w:r>
+      <w:r>
+        <w:br/>
+        <w:t xml:space="preserve">    </w:t>
+      </w:r>
+      <w:r>
+        <w:rPr>
+          <w:b/>
+          <w:color w:val="008000"/>
+        </w:rPr>
+        <w:t>return</w:t>
+      </w:r>
+      <w:r>
+        <w:t xml:space="preserve"> </w:t>
+      </w:r>
+      <w:r>
+        <w:rPr>
+          <w:color w:val="BA2121"/>
+        </w:rPr>
+        <w:t>"</w:t>
+      </w:r>
+      <w:r>
+        <w:rPr>
+          <w:color w:val="BA2121"/>
+        </w:rPr>
+        <w:t xml:space="preserve">Hello, </w:t>
+      </w:r>
+      <w:r>
+        <w:rPr>
+          <w:color w:val="BA2121"/>
+        </w:rPr>
+        <w:t>"</w:t>
+      </w:r>
+      <w:r>
+        <w:t xml:space="preserve"> </w:t>
+      </w:r>
+      <w:r>
+        <w:rPr>
+          <w:color w:val="666666"/>
+        </w:rPr>
+        <w:t>.</w:t>
+      </w:r>
+      <w:r>
+        <w:t xml:space="preserve"> </w:t>
+      </w:r>
+      <w:r>
+        <w:rPr>
+          <w:color w:val="19177C"/>
+        </w:rPr>
+        <w:t>$name</w:t>
+      </w:r>
+      <w:r>
+        <w:t>;</w:t>
+      </w:r>
+      <w:r>
+        <w:br/>
+      </w:r>
+      <w:r>
+        <w:t>}</w:t>
+      </w:r>
+    </w:p>
+    <w:p>
+      <w:pPr>
+        <w:pStyle w:val="Heading2"/>
+      </w:pPr>
+      <w:bookmarkStart w:id="34" w:name="md_2e7d2c03a9507ae265ecf5b53568"/>
+      <w:bookmarkEnd w:id="34"/>
+      <w:r>
+        <w:rPr/>
+        <w:t>C#</w:t>
+      </w:r>
+    </w:p>
+    <w:p>
+      <w:pPr>
+        <w:pStyle w:val="CodeBlock"/>
+      </w:pPr>
+      <w:r>
+        <w:rPr>
+          <w:b/>
+          <w:color w:val="008000"/>
+        </w:rPr>
+        <w:t>class</w:t>
+      </w:r>
+      <w:r>
+        <w:t xml:space="preserve"> </w:t>
+      </w:r>
+      <w:r>
+        <w:rPr>
+          <w:b/>
+          <w:color w:val="0000FF"/>
+        </w:rPr>
+        <w:t>Greeter</w:t>
+      </w:r>
+      <w:r>
+        <w:t xml:space="preserve"> </w:t>
+      </w:r>
+      <w:r>
+        <w:t>{</w:t>
+      </w:r>
+      <w:r>
+        <w:br/>
+      </w:r>
+      <w:r>
+        <w:t xml:space="preserve">    </w:t>
+      </w:r>
+      <w:r>
+        <w:rPr>
+          <w:b/>
+          <w:color w:val="008000"/>
+        </w:rPr>
+        <w:t>public</w:t>
+      </w:r>
+      <w:r>
+        <w:t xml:space="preserve"> </w:t>
+      </w:r>
+      <w:r>
+        <w:rPr>
+          <w:b/>
+          <w:color w:val="008000"/>
+        </w:rPr>
+        <w:t>static</w:t>
+      </w:r>
+      <w:r>
+        <w:t xml:space="preserve"> </w:t>
+      </w:r>
+      <w:r>
+        <w:rPr>
+          <w:color w:val="B00040"/>
+        </w:rPr>
+        <w:t>string</w:t>
+      </w:r>
+      <w:r>
+        <w:t xml:space="preserve"> </w:t>
+      </w:r>
+      <w:r>
+        <w:rPr>
+          <w:color w:val="0000FF"/>
+        </w:rPr>
+        <w:t>Hello</w:t>
+      </w:r>
+      <w:r>
+        <w:t>(</w:t>
+      </w:r>
+      <w:r>
+        <w:rPr>
+          <w:color w:val="B00040"/>
+        </w:rPr>
+        <w:t>string</w:t>
+      </w:r>
+      <w:r>
+        <w:t xml:space="preserve"> </w:t>
+      </w:r>
+      <w:r>
+        <w:t>name</w:t>
+      </w:r>
+      <w:r>
+        <w:t>)</w:t>
+      </w:r>
+      <w:r>
+        <w:t xml:space="preserve"> </w:t>
+      </w:r>
+      <w:r>
+        <w:rPr>
+          <w:color w:val="666666"/>
+        </w:rPr>
+        <w:t>=&gt;</w:t>
+      </w:r>
+      <w:r>
+        <w:t xml:space="preserve"> </w:t>
+      </w:r>
+      <w:r>
+        <w:rPr>
+          <w:color w:val="BA2121"/>
+        </w:rPr>
+        <w:t>$"Hello, {name}"</w:t>
+      </w:r>
+      <w:r>
+        <w:t>;</w:t>
+      </w:r>
+      <w:r>
+        <w:br/>
+      </w:r>
+      <w:r>
+        <w:t>}</w:t>
+      </w:r>
+    </w:p>
+    <w:p>
+      <w:pPr>
+        <w:pStyle w:val="Heading2"/>
+      </w:pPr>
+      <w:bookmarkStart w:id="35" w:name="md_38a0963a6364b09ad867aa9a66c6"/>
+      <w:bookmarkEnd w:id="35"/>
+      <w:r>
+        <w:rPr/>
+        <w:t>Java</w:t>
+      </w:r>
+    </w:p>
+    <w:p>
+      <w:pPr>
+        <w:pStyle w:val="CodeBlock"/>
+      </w:pPr>
+      <w:r>
+        <w:rPr>
+          <w:b/>
+          <w:color w:val="008000"/>
+        </w:rPr>
+        <w:t>class</w:t>
+      </w:r>
+      <w:r>
+        <w:t xml:space="preserve"> </w:t>
+      </w:r>
+      <w:r>
+        <w:rPr>
+          <w:b/>
+          <w:color w:val="0000FF"/>
+        </w:rPr>
+        <w:t>Greeter</w:t>
+      </w:r>
+      <w:r>
+        <w:t xml:space="preserve"> </w:t>
+      </w:r>
+      <w:r>
+        <w:t>{</w:t>
+      </w:r>
+      <w:r>
+        <w:br/>
+      </w:r>
+      <w:r>
+        <w:t xml:space="preserve">    </w:t>
+      </w:r>
+      <w:r>
+        <w:rPr>
+          <w:b/>
+          <w:color w:val="008000"/>
+        </w:rPr>
+        <w:t>static</w:t>
+      </w:r>
+      <w:r>
+        <w:t xml:space="preserve"> </w:t>
+      </w:r>
+      <w:r>
+        <w:t>String</w:t>
+      </w:r>
+      <w:r>
+        <w:t xml:space="preserve"> </w:t>
+      </w:r>
+      <w:r>
+        <w:rPr>
+          <w:color w:val="0000FF"/>
+        </w:rPr>
+        <w:t>hello</w:t>
+      </w:r>
+      <w:r>
+        <w:t>(</w:t>
+      </w:r>
+      <w:r>
+        <w:t>String</w:t>
+      </w:r>
+      <w:r>
+        <w:t xml:space="preserve"> </w:t>
+      </w:r>
+      <w:r>
+        <w:t>name</w:t>
+      </w:r>
+      <w:r>
+        <w:t>)</w:t>
+      </w:r>
+      <w:r>
+        <w:t xml:space="preserve"> </w:t>
+      </w:r>
+      <w:r>
+        <w:t>{</w:t>
+      </w:r>
+      <w:r>
+        <w:br/>
+      </w:r>
+      <w:r>
+        <w:t xml:space="preserve">        </w:t>
+      </w:r>
+      <w:r>
+        <w:rPr>
+          <w:b/>
+          <w:color w:val="008000"/>
+        </w:rPr>
+        <w:t>return</w:t>
+      </w:r>
+      <w:r>
+        <w:t xml:space="preserve"> </w:t>
+      </w:r>
+      <w:r>
+        <w:rPr>
+          <w:color w:val="BA2121"/>
+        </w:rPr>
+        <w:t>"</w:t>
+      </w:r>
+      <w:r>
+        <w:rPr>
+          <w:color w:val="BA2121"/>
+        </w:rPr>
+        <w:t xml:space="preserve">Hello, </w:t>
+      </w:r>
+      <w:r>
+        <w:rPr>
+          <w:color w:val="BA2121"/>
+        </w:rPr>
+        <w:t>"</w:t>
+      </w:r>
+      <w:r>
+        <w:t xml:space="preserve"> </w:t>
+      </w:r>
+      <w:r>
+        <w:rPr>
+          <w:color w:val="666666"/>
+        </w:rPr>
+        <w:t>+</w:t>
+      </w:r>
+      <w:r>
+        <w:t xml:space="preserve"> </w:t>
+      </w:r>
+      <w:r>
+        <w:t>name</w:t>
+      </w:r>
+      <w:r>
+        <w:t>;</w:t>
+      </w:r>
+      <w:r>
+        <w:br/>
+      </w:r>
+      <w:r>
+        <w:t xml:space="preserve">    </w:t>
+      </w:r>
+      <w:r>
+        <w:t>}</w:t>
+      </w:r>
+      <w:r>
+        <w:br/>
+      </w:r>
+      <w:r>
+        <w:t>}</w:t>
+      </w:r>
+    </w:p>
+    <w:p>
+      <w:r>
+        <w:br w:type="page"/>
+      </w:r>
+    </w:p>
+    <w:p>
+      <w:pPr>
+        <w:pStyle w:val="Heading2"/>
+      </w:pPr>
+      <w:bookmarkStart w:id="36" w:name="md_a6f7ef47ee8dc84af9056a3051dd"/>
+      <w:bookmarkEnd w:id="36"/>
+      <w:r>
+        <w:rPr/>
+        <w:t>C</w:t>
+      </w:r>
+    </w:p>
+    <w:p>
+      <w:pPr>
+        <w:pStyle w:val="CodeBlock"/>
+      </w:pPr>
+      <w:r>
+        <w:rPr>
+          <w:color w:val="9C6500"/>
+        </w:rPr>
+        <w:t>#</w:t>
+      </w:r>
+      <w:r>
+        <w:rPr>
+          <w:color w:val="9C6500"/>
+        </w:rPr>
+        <w:t>include</w:t>
+      </w:r>
+      <w:r>
+        <w:t xml:space="preserve"> </w:t>
+      </w:r>
+      <w:r>
+        <w:rPr>
+          <w:i/>
+          <w:color w:val="3D7B7B"/>
+        </w:rPr>
+        <w:t>&lt;stdio.h&gt;</w:t>
+      </w:r>
+      <w:r>
+        <w:br/>
+      </w:r>
+      <w:r>
+        <w:rPr>
+          <w:color w:val="B00040"/>
+        </w:rPr>
+        <w:t>int</w:t>
+      </w:r>
+      <w:r>
+        <w:t xml:space="preserve"> </w:t>
+      </w:r>
+      <w:r>
+        <w:rPr>
+          <w:color w:val="0000FF"/>
+        </w:rPr>
+        <w:t>main</w:t>
+      </w:r>
+      <w:r>
+        <w:t>(</w:t>
+      </w:r>
+      <w:r>
+        <w:rPr>
+          <w:color w:val="B00040"/>
+        </w:rPr>
+        <w:t>void</w:t>
+      </w:r>
+      <w:r>
+        <w:t>)</w:t>
+      </w:r>
+      <w:r>
+        <w:t xml:space="preserve"> </w:t>
+      </w:r>
+      <w:r>
+        <w:t>{</w:t>
+      </w:r>
+      <w:r>
+        <w:br/>
+      </w:r>
+      <w:r>
+        <w:t xml:space="preserve">    </w:t>
+      </w:r>
+      <w:r>
+        <w:t>puts</w:t>
+      </w:r>
+      <w:r>
+        <w:t>(</w:t>
+      </w:r>
+      <w:r>
+        <w:rPr>
+          <w:color w:val="BA2121"/>
+        </w:rPr>
+        <w:t>"</w:t>
+      </w:r>
+      <w:r>
+        <w:rPr>
+          <w:color w:val="BA2121"/>
+        </w:rPr>
+        <w:t>Hello, Word</w:t>
+      </w:r>
+      <w:r>
+        <w:rPr>
+          <w:color w:val="BA2121"/>
+        </w:rPr>
+        <w:t>"</w:t>
+      </w:r>
+      <w:r>
+        <w:t>)</w:t>
+      </w:r>
+      <w:r>
+        <w:t>;</w:t>
+      </w:r>
+      <w:r>
+        <w:br/>
+      </w:r>
+      <w:r>
+        <w:t xml:space="preserve">    </w:t>
+      </w:r>
+      <w:r>
+        <w:rPr>
+          <w:b/>
+          <w:color w:val="008000"/>
+        </w:rPr>
+        <w:t>return</w:t>
+      </w:r>
+      <w:r>
+        <w:t xml:space="preserve"> </w:t>
+      </w:r>
+      <w:r>
+        <w:rPr>
+          <w:color w:val="666666"/>
+        </w:rPr>
+        <w:t>0</w:t>
+      </w:r>
+      <w:r>
+        <w:t>;</w:t>
+      </w:r>
+      <w:r>
+        <w:br/>
+      </w:r>
+      <w:r>
+        <w:t>}</w:t>
+      </w:r>
+    </w:p>
+    <w:p>
+      <w:pPr>
+        <w:pStyle w:val="Heading2"/>
+      </w:pPr>
+      <w:bookmarkStart w:id="37" w:name="md_a33603bf79f74b056172d43b7835"/>
+      <w:bookmarkEnd w:id="37"/>
+      <w:r>
+        <w:rPr/>
+        <w:t>Swift</w:t>
+      </w:r>
+    </w:p>
+    <w:p>
+      <w:pPr>
+        <w:pStyle w:val="CodeBlock"/>
+      </w:pPr>
+      <w:r>
+        <w:rPr>
+          <w:b/>
+          <w:color w:val="008000"/>
+        </w:rPr>
+        <w:t>func</w:t>
+      </w:r>
+      <w:r>
+        <w:t xml:space="preserve"> </w:t>
+      </w:r>
+      <w:r>
+        <w:rPr>
+          <w:color w:val="0000FF"/>
+        </w:rPr>
+        <w:t>greet</w:t>
+      </w:r>
+      <w:r>
+        <w:t>(</w:t>
+      </w:r>
+      <w:r>
+        <w:rPr>
+          <w:b/>
+          <w:color w:val="008000"/>
+        </w:rPr>
+        <w:t>_</w:t>
+      </w:r>
+      <w:r>
+        <w:t xml:space="preserve"> </w:t>
+      </w:r>
+      <w:r>
+        <w:t>name</w:t>
+      </w:r>
+      <w:r>
+        <w:t>:</w:t>
+      </w:r>
+      <w:r>
+        <w:t xml:space="preserve"> </w:t>
+      </w:r>
+      <w:r>
+        <w:rPr>
+          <w:color w:val="008000"/>
+        </w:rPr>
+        <w:t>String</w:t>
+      </w:r>
+      <w:r>
+        <w:t>)</w:t>
+      </w:r>
+      <w:r>
+        <w:t xml:space="preserve"> </w:t>
+      </w:r>
+      <w:r>
+        <w:t>-&gt;</w:t>
+      </w:r>
+      <w:r>
+        <w:t xml:space="preserve"> </w:t>
+      </w:r>
+      <w:r>
+        <w:rPr>
+          <w:color w:val="008000"/>
+        </w:rPr>
+        <w:t>String</w:t>
+      </w:r>
+      <w:r>
+        <w:t xml:space="preserve"> </w:t>
+      </w:r>
+      <w:r>
+        <w:t>{</w:t>
+      </w:r>
+      <w:r>
+        <w:br/>
+      </w:r>
+      <w:r>
+        <w:t xml:space="preserve">    </w:t>
+      </w:r>
+      <w:r>
+        <w:rPr>
+          <w:color w:val="BA2121"/>
+        </w:rPr>
+        <w:t>"</w:t>
+      </w:r>
+      <w:r>
+        <w:rPr>
+          <w:color w:val="BA2121"/>
+        </w:rPr>
+        <w:t xml:space="preserve">Hello, </w:t>
+      </w:r>
+      <w:r>
+        <w:rPr>
+          <w:b/>
+          <w:color w:val="A45A77"/>
+        </w:rPr>
+        <w:t>\(</w:t>
+      </w:r>
+      <w:r>
+        <w:t>name</w:t>
+      </w:r>
+      <w:r>
+        <w:rPr>
+          <w:b/>
+          <w:color w:val="A45A77"/>
+        </w:rPr>
+        <w:t>)</w:t>
+      </w:r>
+      <w:r>
+        <w:rPr>
+          <w:color w:val="BA2121"/>
+        </w:rPr>
+        <w:t>"</w:t>
+      </w:r>
+      <w:r>
+        <w:br/>
+      </w:r>
+      <w:r>
+        <w:t>}</w:t>
+      </w:r>
+    </w:p>
+    <w:p>
+      <w:pPr>
+        <w:pStyle w:val="Heading2"/>
+      </w:pPr>
+      <w:bookmarkStart w:id="38" w:name="md_4cd0e21a9a0795a14ec9aa5f0e7d"/>
+      <w:bookmarkEnd w:id="38"/>
+      <w:r>
+        <w:rPr/>
+        <w:t>Go</w:t>
+      </w:r>
+    </w:p>
+    <w:p>
+      <w:pPr>
+        <w:pStyle w:val="CodeBlock"/>
+      </w:pPr>
+      <w:r>
+        <w:rPr>
+          <w:b/>
+          <w:color w:val="008000"/>
+        </w:rPr>
+        <w:t>package</w:t>
+      </w:r>
+      <w:r>
+        <w:t xml:space="preserve"> </w:t>
+      </w:r>
+      <w:r>
+        <w:t>main</w:t>
+      </w:r>
+      <w:r>
+        <w:br/>
+      </w:r>
+      <w:r>
+        <w:rPr>
+          <w:b/>
+          <w:color w:val="008000"/>
+        </w:rPr>
+        <w:t>import</w:t>
+      </w:r>
+      <w:r>
+        <w:t xml:space="preserve"> </w:t>
+      </w:r>
+      <w:r>
+        <w:rPr>
+          <w:color w:val="BA2121"/>
+        </w:rPr>
+        <w:t>"fmt"</w:t>
+      </w:r>
+      <w:r>
+        <w:br/>
+      </w:r>
+      <w:r>
+        <w:rPr>
+          <w:b/>
+          <w:color w:val="008000"/>
+        </w:rPr>
+        <w:t>func</w:t>
+      </w:r>
+      <w:r>
+        <w:t xml:space="preserve"> </w:t>
+      </w:r>
+      <w:r>
+        <w:t>main</w:t>
+      </w:r>
+      <w:r>
+        <w:t>(</w:t>
+      </w:r>
+      <w:r>
+        <w:t>)</w:t>
+      </w:r>
+      <w:r>
+        <w:t xml:space="preserve"> </w:t>
+      </w:r>
+      <w:r>
+        <w:t>{</w:t>
+      </w:r>
+      <w:r>
+        <w:br/>
+      </w:r>
+      <w:r>
+        <w:t xml:space="preserve">    </w:t>
+      </w:r>
+      <w:r>
+        <w:t>fmt</w:t>
+      </w:r>
+      <w:r>
+        <w:t>.</w:t>
+      </w:r>
+      <w:r>
+        <w:t>Println</w:t>
+      </w:r>
+      <w:r>
+        <w:t>(</w:t>
+      </w:r>
+      <w:r>
+        <w:rPr>
+          <w:color w:val="BA2121"/>
+        </w:rPr>
+        <w:t>"Hello, Word"</w:t>
+      </w:r>
+      <w:r>
+        <w:t>)</w:t>
+      </w:r>
+      <w:r>
+        <w:br/>
+      </w:r>
+      <w:r>
+        <w:t>}</w:t>
+      </w:r>
+    </w:p>
+    <w:p>
+      <w:pPr>
+        <w:pStyle w:val="Heading2"/>
+      </w:pPr>
+      <w:bookmarkStart w:id="39" w:name="md_6260cd1bca682c8e6d53f7bd4808"/>
+      <w:bookmarkEnd w:id="39"/>
+      <w:r>
+        <w:rPr/>
+        <w:t>C++</w:t>
+      </w:r>
+    </w:p>
+    <w:p>
+      <w:pPr>
+        <w:pStyle w:val="CodeBlock"/>
+      </w:pPr>
+      <w:r>
+        <w:rPr>
+          <w:color w:val="9C6500"/>
+        </w:rPr>
+        <w:t>#</w:t>
+      </w:r>
+      <w:r>
+        <w:rPr>
+          <w:color w:val="9C6500"/>
+        </w:rPr>
+        <w:t>include</w:t>
+      </w:r>
+      <w:r>
+        <w:t xml:space="preserve"> </w:t>
+      </w:r>
+      <w:r>
+        <w:rPr>
+          <w:i/>
+          <w:color w:val="3D7B7B"/>
+        </w:rPr>
+        <w:t>&lt;iostream&gt;</w:t>
+      </w:r>
+      <w:r>
+        <w:br/>
+      </w:r>
+      <w:r>
+        <w:rPr>
+          <w:color w:val="B00040"/>
+        </w:rPr>
+        <w:t>int</w:t>
+      </w:r>
+      <w:r>
+        <w:t xml:space="preserve"> </w:t>
+      </w:r>
+      <w:r>
+        <w:rPr>
+          <w:color w:val="0000FF"/>
+        </w:rPr>
+        <w:t>main</w:t>
+      </w:r>
+      <w:r>
+        <w:t>(</w:t>
+      </w:r>
+      <w:r>
+        <w:t>)</w:t>
+      </w:r>
+      <w:r>
+        <w:t xml:space="preserve"> </w:t>
+      </w:r>
+      <w:r>
+        <w:t>{</w:t>
+      </w:r>
+      <w:r>
+        <w:br/>
+      </w:r>
+      <w:r>
+        <w:t xml:space="preserve">    </w:t>
+      </w:r>
+      <w:r>
+        <w:t>std</w:t>
+      </w:r>
+      <w:r>
+        <w:rPr>
+          <w:color w:val="666666"/>
+        </w:rPr>
+        <w:t>:</w:t>
+      </w:r>
+      <w:r>
+        <w:rPr>
+          <w:color w:val="666666"/>
+        </w:rPr>
+        <w:t>:</w:t>
+      </w:r>
+      <w:r>
+        <w:t>cout</w:t>
+      </w:r>
+      <w:r>
+        <w:t xml:space="preserve"> </w:t>
+      </w:r>
+      <w:r>
+        <w:rPr>
+          <w:color w:val="666666"/>
+        </w:rPr>
+        <w:t>&lt;</w:t>
+      </w:r>
+      <w:r>
+        <w:rPr>
+          <w:color w:val="666666"/>
+        </w:rPr>
+        <w:t>&lt;</w:t>
+      </w:r>
+      <w:r>
+        <w:t xml:space="preserve"> </w:t>
+      </w:r>
+      <w:r>
+        <w:rPr>
+          <w:color w:val="BA2121"/>
+        </w:rPr>
+        <w:t>"</w:t>
+      </w:r>
+      <w:r>
+        <w:rPr>
+          <w:color w:val="BA2121"/>
+        </w:rPr>
+        <w:t>Hello, Word</w:t>
+      </w:r>
+      <w:r>
+        <w:rPr>
+          <w:b/>
+          <w:color w:val="AA5D1F"/>
+        </w:rPr>
+        <w:t>\n</w:t>
+      </w:r>
+      <w:r>
+        <w:rPr>
+          <w:color w:val="BA2121"/>
+        </w:rPr>
+        <w:t>"</w:t>
+      </w:r>
+      <w:r>
+        <w:t>;</w:t>
+      </w:r>
+      <w:r>
+        <w:br/>
+      </w:r>
+      <w:r>
+        <w:t>}</w:t>
+      </w:r>
+    </w:p>
+    <w:p>
+      <w:pPr>
+        <w:pStyle w:val="Heading2"/>
+      </w:pPr>
+      <w:bookmarkStart w:id="40" w:name="md_521fe5c9ece1aa1f8b6622817159"/>
+      <w:bookmarkEnd w:id="40"/>
+      <w:r>
+        <w:rPr/>
+        <w:t>Rust</w:t>
+      </w:r>
+    </w:p>
+    <w:p>
+      <w:pPr>
+        <w:pStyle w:val="CodeBlock"/>
+      </w:pPr>
+      <w:r>
+        <w:rPr>
+          <w:b/>
+          <w:color w:val="008000"/>
+        </w:rPr>
+        <w:t>fn</w:t>
+      </w:r>
+      <w:r>
+        <w:t xml:space="preserve"> </w:t>
+      </w:r>
+      <w:r>
+        <w:rPr>
+          <w:color w:val="0000FF"/>
+        </w:rPr>
+        <w:t>main</w:t>
+      </w:r>
+      <w:r>
+        <w:t>(</w:t>
+      </w:r>
+      <w:r>
+        <w:t>)</w:t>
+      </w:r>
+      <w:r>
+        <w:t xml:space="preserve"> </w:t>
+      </w:r>
+      <w:r>
+        <w:t>{</w:t>
+      </w:r>
+      <w:r>
+        <w:br/>
+      </w:r>
+      <w:r>
+        <w:t xml:space="preserve">    </w:t>
+      </w:r>
+      <w:r>
+        <w:rPr>
+          <w:color w:val="0000FF"/>
+        </w:rPr>
+        <w:t>println!</w:t>
+      </w:r>
+      <w:r>
+        <w:t>(</w:t>
+      </w:r>
+      <w:r>
+        <w:rPr>
+          <w:color w:val="BA2121"/>
+        </w:rPr>
+        <w:t>"</w:t>
+      </w:r>
+      <w:r>
+        <w:rPr>
+          <w:color w:val="BA2121"/>
+        </w:rPr>
+        <w:t>Hello, Word</w:t>
+      </w:r>
+      <w:r>
+        <w:rPr>
+          <w:color w:val="BA2121"/>
+        </w:rPr>
+        <w:t>"</w:t>
+      </w:r>
+      <w:r>
+        <w:t>)</w:t>
+      </w:r>
+      <w:r>
+        <w:t>;</w:t>
+      </w:r>
+      <w:r>
+        <w:br/>
+      </w:r>
+      <w:r>
+        <w:t>}</w:t>
+      </w:r>
+    </w:p>
     <w:sectPr>
       <w:pgSz w:w="12240" w:h="15840"/>
       <w:pgMar w:top="1224" w:right="1296" w:bottom="1224" w:left="1296" w:header="708" w:footer="708" w:gutter="0"/>
@@ -3511,7 +5157,7 @@
     </w:lvl>
   </w:abstractNum>
   <w:abstractNum w:abstractNumId="9">
-    <w:nsid w:val="7730B4D9"/>
+    <w:nsid w:val="0948A7C4"/>
     <w:multiLevelType w:val="singleLevel"/>
     <w:tmpl w:val="29761A62"/>
     <w:lvl w:ilvl="0">
@@ -3532,7 +5178,7 @@
     </w:lvl>
   </w:abstractNum>
   <w:abstractNum w:abstractNumId="10">
-    <w:nsid w:val="9E6132FE"/>
+    <w:nsid w:val="591F3E4E"/>
     <w:multiLevelType w:val="singleLevel"/>
     <w:tmpl w:val="29761A62"/>
     <w:lvl w:ilvl="0">
@@ -3553,7 +5199,7 @@
     </w:lvl>
   </w:abstractNum>
   <w:abstractNum w:abstractNumId="11">
-    <w:nsid w:val="A81A9034"/>
+    <w:nsid w:val="EBE3199A"/>
     <w:multiLevelType w:val="singleLevel"/>
     <w:tmpl w:val="3D1EFFD4"/>
     <w:lvl w:ilvl="0">
@@ -3574,7 +5220,7 @@
     </w:lvl>
   </w:abstractNum>
   <w:abstractNum w:abstractNumId="12">
-    <w:nsid w:val="1F913175"/>
+    <w:nsid w:val="226EE7D0"/>
     <w:multiLevelType w:val="singleLevel"/>
     <w:tmpl w:val="F3EAFDEC"/>
     <w:lvl w:ilvl="0">
@@ -3595,7 +5241,7 @@
     </w:lvl>
   </w:abstractNum>
   <w:abstractNum w:abstractNumId="13">
-    <w:nsid w:val="9C781D57"/>
+    <w:nsid w:val="C64262C3"/>
     <w:multiLevelType w:val="singleLevel"/>
     <w:tmpl w:val="3D1EFFD4"/>
     <w:lvl w:ilvl="0">
@@ -3616,7 +5262,7 @@
     </w:lvl>
   </w:abstractNum>
   <w:abstractNum w:abstractNumId="14">
-    <w:nsid w:val="FC9B84B9"/>
+    <w:nsid w:val="E65CEDF5"/>
     <w:multiLevelType w:val="singleLevel"/>
     <w:tmpl w:val="F3EAFDEC"/>
     <w:lvl w:ilvl="0">
@@ -3637,7 +5283,7 @@
     </w:lvl>
   </w:abstractNum>
   <w:abstractNum w:abstractNumId="15">
-    <w:nsid w:val="9A2A702F"/>
+    <w:nsid w:val="34B7D2E6"/>
     <w:multiLevelType w:val="singleLevel"/>
     <w:tmpl w:val="29761A62"/>
     <w:lvl w:ilvl="0">
@@ -3658,7 +5304,7 @@
     </w:lvl>
   </w:abstractNum>
   <w:abstractNum w:abstractNumId="16">
-    <w:nsid w:val="0D4C155C"/>
+    <w:nsid w:val="E2F40EBC"/>
     <w:multiLevelType w:val="singleLevel"/>
     <w:tmpl w:val="D0A62B40"/>
     <w:lvl w:ilvl="0">
@@ -3676,7 +5322,7 @@
     </w:lvl>
   </w:abstractNum>
   <w:abstractNum w:abstractNumId="17">
-    <w:nsid w:val="5AE34D59"/>
+    <w:nsid w:val="9D0AF909"/>
     <w:multiLevelType w:val="singleLevel"/>
     <w:tmpl w:val="D0A62B40"/>
     <w:lvl w:ilvl="0">
@@ -3694,7 +5340,7 @@
     </w:lvl>
   </w:abstractNum>
   <w:abstractNum w:abstractNumId="18">
-    <w:nsid w:val="1BE27D60"/>
+    <w:nsid w:val="88B1E55F"/>
     <w:multiLevelType w:val="singleLevel"/>
     <w:tmpl w:val="29761A62"/>
     <w:lvl w:ilvl="0">
@@ -3715,7 +5361,7 @@
     </w:lvl>
   </w:abstractNum>
   <w:abstractNum w:abstractNumId="19">
-    <w:nsid w:val="149258D0"/>
+    <w:nsid w:val="F138A6C4"/>
     <w:multiLevelType w:val="singleLevel"/>
     <w:tmpl w:val="3D1EFFD4"/>
     <w:lvl w:ilvl="0">
@@ -3736,7 +5382,7 @@
     </w:lvl>
   </w:abstractNum>
   <w:abstractNum w:abstractNumId="20">
-    <w:nsid w:val="92BCC5FB"/>
+    <w:nsid w:val="65AA5F6F"/>
     <w:multiLevelType w:val="singleLevel"/>
     <w:tmpl w:val="F3EAFDEC"/>
     <w:lvl w:ilvl="0">
@@ -3757,7 +5403,7 @@
     </w:lvl>
   </w:abstractNum>
   <w:abstractNum w:abstractNumId="21">
-    <w:nsid w:val="B89B68F4"/>
+    <w:nsid w:val="8FCF2988"/>
     <w:multiLevelType w:val="singleLevel"/>
     <w:tmpl w:val="D0A62B40"/>
     <w:lvl w:ilvl="0">
@@ -3775,7 +5421,7 @@
     </w:lvl>
   </w:abstractNum>
   <w:abstractNum w:abstractNumId="22">
-    <w:nsid w:val="940A9063"/>
+    <w:nsid w:val="CA5B9F84"/>
     <w:multiLevelType w:val="singleLevel"/>
     <w:tmpl w:val="38441652"/>
     <w:lvl w:ilvl="0">
@@ -3793,7 +5439,7 @@
     </w:lvl>
   </w:abstractNum>
   <w:abstractNum w:abstractNumId="23">
-    <w:nsid w:val="35709BC1"/>
+    <w:nsid w:val="38EE60B8"/>
     <w:multiLevelType w:val="singleLevel"/>
     <w:tmpl w:val="FB12693A"/>
     <w:lvl w:ilvl="0">
@@ -3811,7 +5457,7 @@
     </w:lvl>
   </w:abstractNum>
   <w:abstractNum w:abstractNumId="24">
-    <w:nsid w:val="94589360"/>
+    <w:nsid w:val="A3373760"/>
     <w:multiLevelType w:val="singleLevel"/>
     <w:tmpl w:val="29761A62"/>
     <w:lvl w:ilvl="0">
@@ -3832,7 +5478,7 @@
     </w:lvl>
   </w:abstractNum>
   <w:abstractNum w:abstractNumId="25">
-    <w:nsid w:val="145B51CB"/>
+    <w:nsid w:val="EA852C65"/>
     <w:multiLevelType w:val="singleLevel"/>
     <w:tmpl w:val="38441652"/>
     <w:lvl w:ilvl="0">
@@ -3850,7 +5496,7 @@
     </w:lvl>
   </w:abstractNum>
   <w:abstractNum w:abstractNumId="26">
-    <w:nsid w:val="2C64E906"/>
+    <w:nsid w:val="4A033600"/>
     <w:multiLevelType w:val="singleLevel"/>
     <w:tmpl w:val="FB12693A"/>
     <w:lvl w:ilvl="0">
@@ -3868,7 +5514,7 @@
     </w:lvl>
   </w:abstractNum>
   <w:abstractNum w:abstractNumId="27">
-    <w:nsid w:val="53E737A2"/>
+    <w:nsid w:val="6797F3EB"/>
     <w:multiLevelType w:val="singleLevel"/>
     <w:tmpl w:val="D0A62B40"/>
     <w:lvl w:ilvl="0">
@@ -3886,7 +5532,7 @@
     </w:lvl>
   </w:abstractNum>
   <w:abstractNum w:abstractNumId="28">
-    <w:nsid w:val="9A689CFB"/>
+    <w:nsid w:val="0EA873B3"/>
     <w:multiLevelType w:val="singleLevel"/>
     <w:tmpl w:val="3D1EFFD4"/>
     <w:lvl w:ilvl="0">
@@ -3907,7 +5553,7 @@
     </w:lvl>
   </w:abstractNum>
   <w:abstractNum w:abstractNumId="29">
-    <w:nsid w:val="D1F6FA02"/>
+    <w:nsid w:val="D2F98BE4"/>
     <w:multiLevelType w:val="singleLevel"/>
     <w:tmpl w:val="F3EAFDEC"/>
     <w:lvl w:ilvl="0">
@@ -3928,7 +5574,7 @@
     </w:lvl>
   </w:abstractNum>
   <w:abstractNum w:abstractNumId="30">
-    <w:nsid w:val="EBCC2F5C"/>
+    <w:nsid w:val="16BE0678"/>
     <w:multiLevelType w:val="singleLevel"/>
     <w:tmpl w:val="D0A62B40"/>
     <w:lvl w:ilvl="0">
@@ -3946,7 +5592,7 @@
     </w:lvl>
   </w:abstractNum>
   <w:abstractNum w:abstractNumId="31">
-    <w:nsid w:val="BFEABEC4"/>
+    <w:nsid w:val="667885A0"/>
     <w:multiLevelType w:val="singleLevel"/>
     <w:tmpl w:val="29761A62"/>
     <w:lvl w:ilvl="0">
@@ -3967,7 +5613,7 @@
     </w:lvl>
   </w:abstractNum>
   <w:abstractNum w:abstractNumId="32">
-    <w:nsid w:val="EF1400A3"/>
+    <w:nsid w:val="C4A1A2FC"/>
     <w:multiLevelType w:val="singleLevel"/>
     <w:tmpl w:val="D0A62B40"/>
     <w:lvl w:ilvl="0">
@@ -3985,7 +5631,7 @@
     </w:lvl>
   </w:abstractNum>
   <w:abstractNum w:abstractNumId="33">
-    <w:nsid w:val="61E34FA7"/>
+    <w:nsid w:val="E5C29256"/>
     <w:multiLevelType w:val="singleLevel"/>
     <w:tmpl w:val="29761A62"/>
     <w:lvl w:ilvl="0">

</xml_diff>

<commit_message>
Support empty image placeholders and nine-level Word lists
</commit_message>
<xml_diff>
--- a/sample/showcase.docx
+++ b/sample/showcase.docx
@@ -379,8 +379,8 @@
       <w:pPr>
         <w:pStyle w:val="ListBullet2"/>
         <w:numPr>
-          <w:ilvl w:val="0"/>
-          <w:numId w:val="12"/>
+          <w:ilvl w:val="1"/>
+          <w:numId w:val="11"/>
         </w:numPr>
       </w:pPr>
       <w:r>
@@ -392,8 +392,8 @@
       <w:pPr>
         <w:pStyle w:val="ListBullet3"/>
         <w:numPr>
-          <w:ilvl w:val="0"/>
-          <w:numId w:val="13"/>
+          <w:ilvl w:val="2"/>
+          <w:numId w:val="11"/>
         </w:numPr>
       </w:pPr>
       <w:r>
@@ -418,8 +418,8 @@
       <w:pPr>
         <w:pStyle w:val="ListBullet2"/>
         <w:numPr>
-          <w:ilvl w:val="0"/>
-          <w:numId w:val="14"/>
+          <w:ilvl w:val="1"/>
+          <w:numId w:val="11"/>
         </w:numPr>
       </w:pPr>
       <w:r>
@@ -431,8 +431,8 @@
       <w:pPr>
         <w:pStyle w:val="ListBullet3"/>
         <w:numPr>
-          <w:ilvl w:val="0"/>
-          <w:numId w:val="15"/>
+          <w:ilvl w:val="2"/>
+          <w:numId w:val="11"/>
         </w:numPr>
       </w:pPr>
       <w:r>
@@ -1119,7 +1119,7 @@
         <w:pStyle w:val="ListBullet"/>
         <w:numPr>
           <w:ilvl w:val="0"/>
-          <w:numId w:val="16"/>
+          <w:numId w:val="12"/>
         </w:numPr>
         <w:ind w:left="1080"/>
       </w:pPr>
@@ -1547,7 +1547,7 @@
         <w:pStyle w:val="ListNumber"/>
         <w:numPr>
           <w:ilvl w:val="0"/>
-          <w:numId w:val="17"/>
+          <w:numId w:val="13"/>
         </w:numPr>
       </w:pPr>
       <w:r>
@@ -1576,7 +1576,7 @@
         <w:pStyle w:val="ListNumber"/>
         <w:numPr>
           <w:ilvl w:val="0"/>
-          <w:numId w:val="17"/>
+          <w:numId w:val="13"/>
         </w:numPr>
       </w:pPr>
       <w:r>
@@ -1596,28 +1596,145 @@
         <w:pStyle w:val="ListNumber"/>
         <w:numPr>
           <w:ilvl w:val="0"/>
+          <w:numId w:val="14"/>
+        </w:numPr>
+      </w:pPr>
+      <w:r>
+        <w:rPr/>
+        <w:t>This independent list starts again at one.</w:t>
+      </w:r>
+    </w:p>
+    <w:p>
+      <w:pPr>
+        <w:pStyle w:val="Heading2"/>
+      </w:pPr>
+      <w:bookmarkStart w:id="15" w:name="md_64d072884695e541eaca3f6db85c"/>
+      <w:bookmarkEnd w:id="15"/>
+      <w:r>
+        <w:rPr/>
+        <w:t>List kinds and depths</w:t>
+      </w:r>
+    </w:p>
+    <w:p>
+      <w:pPr>
+        <w:pStyle w:val="ListBullet"/>
+        <w:numPr>
+          <w:ilvl w:val="0"/>
+          <w:numId w:val="15"/>
+        </w:numPr>
+      </w:pPr>
+      <w:r>
+        <w:rPr/>
+        <w:t>Unordered level one</w:t>
+      </w:r>
+    </w:p>
+    <w:p>
+      <w:pPr>
+        <w:pStyle w:val="ListBullet2"/>
+        <w:numPr>
+          <w:ilvl w:val="1"/>
+          <w:numId w:val="15"/>
+        </w:numPr>
+      </w:pPr>
+      <w:r>
+        <w:rPr/>
+        <w:t>Unordered level two</w:t>
+      </w:r>
+    </w:p>
+    <w:p>
+      <w:pPr>
+        <w:pStyle w:val="ListBullet3"/>
+        <w:numPr>
+          <w:ilvl w:val="2"/>
+          <w:numId w:val="15"/>
+        </w:numPr>
+      </w:pPr>
+      <w:r>
+        <w:rPr/>
+        <w:t>Unordered level three</w:t>
+      </w:r>
+    </w:p>
+    <w:p>
+      <w:pPr>
+        <w:pStyle w:val="ListNumber"/>
+        <w:numPr>
+          <w:ilvl w:val="0"/>
+          <w:numId w:val="16"/>
+        </w:numPr>
+      </w:pPr>
+      <w:r>
+        <w:rPr/>
+        <w:t>Ordered level one</w:t>
+      </w:r>
+    </w:p>
+    <w:p>
+      <w:pPr>
+        <w:pStyle w:val="ListNumber2"/>
+        <w:numPr>
+          <w:ilvl w:val="1"/>
+          <w:numId w:val="16"/>
+        </w:numPr>
+      </w:pPr>
+      <w:r>
+        <w:rPr/>
+        <w:t>Ordered level two</w:t>
+      </w:r>
+    </w:p>
+    <w:p>
+      <w:pPr>
+        <w:pStyle w:val="ListNumber3"/>
+        <w:numPr>
+          <w:ilvl w:val="2"/>
+          <w:numId w:val="16"/>
+        </w:numPr>
+      </w:pPr>
+      <w:r>
+        <w:rPr/>
+        <w:t>Ordered level three</w:t>
+      </w:r>
+    </w:p>
+    <w:p>
+      <w:pPr>
+        <w:pStyle w:val="ListBullet"/>
+        <w:numPr>
+          <w:ilvl w:val="0"/>
+          <w:numId w:val="17"/>
+        </w:numPr>
+      </w:pPr>
+      <w:r>
+        <w:rPr/>
+        <w:t>Mixed unordered parent</w:t>
+      </w:r>
+    </w:p>
+    <w:p>
+      <w:pPr>
+        <w:pStyle w:val="ListNumber2"/>
+        <w:numPr>
+          <w:ilvl w:val="1"/>
           <w:numId w:val="18"/>
         </w:numPr>
       </w:pPr>
       <w:r>
         <w:rPr/>
-        <w:t>This independent list starts again at one.</w:t>
+        <w:t>Ordered child</w:t>
       </w:r>
     </w:p>
     <w:p>
       <w:pPr>
-        <w:pStyle w:val="Heading2"/>
-      </w:pPr>
-      <w:bookmarkStart w:id="15" w:name="md_64d072884695e541eaca3f6db85c"/>
-      <w:bookmarkEnd w:id="15"/>
+        <w:pStyle w:val="ListNumber3"/>
+        <w:numPr>
+          <w:ilvl w:val="2"/>
+          <w:numId w:val="18"/>
+        </w:numPr>
+      </w:pPr>
       <w:r>
         <w:rPr/>
-        <w:t>List kinds and depths</w:t>
+        <w:t>Ordered grandchild</w:t>
       </w:r>
     </w:p>
     <w:p>
       <w:pPr>
-        <w:pStyle w:val="ListBullet"/>
+        <w:pStyle w:val="ListNumber"/>
         <w:numPr>
           <w:ilvl w:val="0"/>
           <w:numId w:val="19"/>
@@ -1625,25 +1742,45 @@
       </w:pPr>
       <w:r>
         <w:rPr/>
-        <w:t>Unordered level one</w:t>
+        <w:t>Mixed ordered parent</w:t>
       </w:r>
     </w:p>
     <w:p>
       <w:pPr>
         <w:pStyle w:val="ListBullet2"/>
         <w:numPr>
-          <w:ilvl w:val="0"/>
+          <w:ilvl w:val="1"/>
           <w:numId w:val="20"/>
         </w:numPr>
       </w:pPr>
       <w:r>
         <w:rPr/>
-        <w:t>Unordered level two</w:t>
+        <w:t>Unordered child</w:t>
       </w:r>
     </w:p>
     <w:p>
       <w:pPr>
         <w:pStyle w:val="ListBullet3"/>
+        <w:numPr>
+          <w:ilvl w:val="2"/>
+          <w:numId w:val="20"/>
+        </w:numPr>
+      </w:pPr>
+      <w:r>
+        <w:rPr/>
+        <w:t>Unordered grandchild</w:t>
+      </w:r>
+    </w:p>
+    <w:p>
+      <w:pPr/>
+      <w:r>
+        <w:rPr/>
+        <w:t>The next two lists use all nine native Word levels.</w:t>
+      </w:r>
+    </w:p>
+    <w:p>
+      <w:pPr>
+        <w:pStyle w:val="ListNumber"/>
         <w:numPr>
           <w:ilvl w:val="0"/>
           <w:numId w:val="21"/>
@@ -1651,12 +1788,116 @@
       </w:pPr>
       <w:r>
         <w:rPr/>
-        <w:t>Unordered level three</w:t>
+        <w:t>Ordered level one</w:t>
       </w:r>
     </w:p>
     <w:p>
       <w:pPr>
-        <w:pStyle w:val="ListNumber"/>
+        <w:pStyle w:val="ListNumber2"/>
+        <w:numPr>
+          <w:ilvl w:val="1"/>
+          <w:numId w:val="21"/>
+        </w:numPr>
+      </w:pPr>
+      <w:r>
+        <w:rPr/>
+        <w:t>Ordered level two</w:t>
+      </w:r>
+    </w:p>
+    <w:p>
+      <w:pPr>
+        <w:pStyle w:val="ListNumber3"/>
+        <w:numPr>
+          <w:ilvl w:val="2"/>
+          <w:numId w:val="21"/>
+        </w:numPr>
+      </w:pPr>
+      <w:r>
+        <w:rPr/>
+        <w:t>Ordered level three</w:t>
+      </w:r>
+    </w:p>
+    <w:p>
+      <w:pPr>
+        <w:pStyle w:val="ListNumber4"/>
+        <w:numPr>
+          <w:ilvl w:val="3"/>
+          <w:numId w:val="21"/>
+        </w:numPr>
+      </w:pPr>
+      <w:r>
+        <w:rPr/>
+        <w:t>Ordered level four</w:t>
+      </w:r>
+    </w:p>
+    <w:p>
+      <w:pPr>
+        <w:pStyle w:val="ListNumber5"/>
+        <w:numPr>
+          <w:ilvl w:val="4"/>
+          <w:numId w:val="21"/>
+        </w:numPr>
+      </w:pPr>
+      <w:r>
+        <w:rPr/>
+        <w:t>Ordered level five</w:t>
+      </w:r>
+    </w:p>
+    <w:p>
+      <w:pPr>
+        <w:pStyle w:val="ListNumber6"/>
+        <w:numPr>
+          <w:ilvl w:val="5"/>
+          <w:numId w:val="21"/>
+        </w:numPr>
+      </w:pPr>
+      <w:r>
+        <w:rPr/>
+        <w:t>Ordered level six</w:t>
+      </w:r>
+    </w:p>
+    <w:p>
+      <w:pPr>
+        <w:pStyle w:val="ListNumber7"/>
+        <w:numPr>
+          <w:ilvl w:val="6"/>
+          <w:numId w:val="21"/>
+        </w:numPr>
+      </w:pPr>
+      <w:r>
+        <w:rPr/>
+        <w:t>Ordered level seven</w:t>
+      </w:r>
+    </w:p>
+    <w:p>
+      <w:pPr>
+        <w:pStyle w:val="ListNumber8"/>
+        <w:numPr>
+          <w:ilvl w:val="7"/>
+          <w:numId w:val="21"/>
+        </w:numPr>
+      </w:pPr>
+      <w:r>
+        <w:rPr/>
+        <w:t>Ordered level eight</w:t>
+      </w:r>
+    </w:p>
+    <w:p>
+      <w:pPr>
+        <w:pStyle w:val="ListNumber9"/>
+        <w:numPr>
+          <w:ilvl w:val="8"/>
+          <w:numId w:val="21"/>
+        </w:numPr>
+      </w:pPr>
+      <w:r>
+        <w:rPr/>
+        <w:t>Ordered level nine</w:t>
+      </w:r>
+    </w:p>
+    <w:p>
+      <w:pPr>
+        <w:pStyle w:val="ListBullet"/>
         <w:numPr>
           <w:ilvl w:val="0"/>
           <w:numId w:val="22"/>
@@ -1664,130 +1905,130 @@
       </w:pPr>
       <w:r>
         <w:rPr/>
-        <w:t>Ordered level one</w:t>
+        <w:t>Bullet level one</w:t>
       </w:r>
     </w:p>
     <w:p>
       <w:pPr>
-        <w:pStyle w:val="ListNumber2"/>
+        <w:pStyle w:val="ListBullet2"/>
+        <w:numPr>
+          <w:ilvl w:val="1"/>
+          <w:numId w:val="22"/>
+        </w:numPr>
+      </w:pPr>
+      <w:r>
+        <w:rPr/>
+        <w:t>Bullet level two</w:t>
+      </w:r>
+    </w:p>
+    <w:p>
+      <w:pPr>
+        <w:pStyle w:val="ListBullet3"/>
+        <w:numPr>
+          <w:ilvl w:val="2"/>
+          <w:numId w:val="22"/>
+        </w:numPr>
+      </w:pPr>
+      <w:r>
+        <w:rPr/>
+        <w:t>Bullet level three</w:t>
+      </w:r>
+    </w:p>
+    <w:p>
+      <w:pPr>
+        <w:pStyle w:val="ListBullet4"/>
+        <w:numPr>
+          <w:ilvl w:val="3"/>
+          <w:numId w:val="22"/>
+        </w:numPr>
+      </w:pPr>
+      <w:r>
+        <w:rPr/>
+        <w:t>Bullet level four</w:t>
+      </w:r>
+    </w:p>
+    <w:p>
+      <w:pPr>
+        <w:pStyle w:val="ListBullet5"/>
+        <w:numPr>
+          <w:ilvl w:val="4"/>
+          <w:numId w:val="22"/>
+        </w:numPr>
+      </w:pPr>
+      <w:r>
+        <w:rPr/>
+        <w:t>Bullet level five</w:t>
+      </w:r>
+    </w:p>
+    <w:p>
+      <w:pPr>
+        <w:pStyle w:val="ListBullet6"/>
+        <w:numPr>
+          <w:ilvl w:val="5"/>
+          <w:numId w:val="22"/>
+        </w:numPr>
+      </w:pPr>
+      <w:r>
+        <w:rPr/>
+        <w:t>Bullet level six</w:t>
+      </w:r>
+    </w:p>
+    <w:p>
+      <w:pPr>
+        <w:pStyle w:val="ListBullet7"/>
+        <w:numPr>
+          <w:ilvl w:val="6"/>
+          <w:numId w:val="22"/>
+        </w:numPr>
+      </w:pPr>
+      <w:r>
+        <w:rPr/>
+        <w:t>Bullet level seven</w:t>
+      </w:r>
+    </w:p>
+    <w:p>
+      <w:pPr>
+        <w:pStyle w:val="ListBullet8"/>
+        <w:numPr>
+          <w:ilvl w:val="7"/>
+          <w:numId w:val="22"/>
+        </w:numPr>
+      </w:pPr>
+      <w:r>
+        <w:rPr/>
+        <w:t>Bullet level eight</w:t>
+      </w:r>
+    </w:p>
+    <w:p>
+      <w:pPr>
+        <w:pStyle w:val="ListBullet9"/>
+        <w:numPr>
+          <w:ilvl w:val="8"/>
+          <w:numId w:val="22"/>
+        </w:numPr>
+      </w:pPr>
+      <w:r>
+        <w:rPr/>
+        <w:t>Bullet level nine</w:t>
+      </w:r>
+    </w:p>
+    <w:p>
+      <w:pPr>
+        <w:pStyle w:val="Heading2"/>
+      </w:pPr>
+      <w:bookmarkStart w:id="16" w:name="md_540996c52d6982291dfbaf78a79f"/>
+      <w:bookmarkEnd w:id="16"/>
+      <w:r>
+        <w:rPr/>
+        <w:t>Rich list items</w:t>
+      </w:r>
+    </w:p>
+    <w:p>
+      <w:pPr>
+        <w:pStyle w:val="ListNumber"/>
         <w:numPr>
           <w:ilvl w:val="0"/>
           <w:numId w:val="23"/>
-        </w:numPr>
-      </w:pPr>
-      <w:r>
-        <w:rPr/>
-        <w:t>Ordered level two</w:t>
-      </w:r>
-    </w:p>
-    <w:p>
-      <w:pPr>
-        <w:pStyle w:val="ListNumber3"/>
-        <w:numPr>
-          <w:ilvl w:val="0"/>
-          <w:numId w:val="24"/>
-        </w:numPr>
-      </w:pPr>
-      <w:r>
-        <w:rPr/>
-        <w:t>Ordered level three</w:t>
-      </w:r>
-    </w:p>
-    <w:p>
-      <w:pPr>
-        <w:pStyle w:val="ListBullet"/>
-        <w:numPr>
-          <w:ilvl w:val="0"/>
-          <w:numId w:val="25"/>
-        </w:numPr>
-      </w:pPr>
-      <w:r>
-        <w:rPr/>
-        <w:t>Mixed unordered parent</w:t>
-      </w:r>
-    </w:p>
-    <w:p>
-      <w:pPr>
-        <w:pStyle w:val="ListNumber2"/>
-        <w:numPr>
-          <w:ilvl w:val="0"/>
-          <w:numId w:val="26"/>
-        </w:numPr>
-      </w:pPr>
-      <w:r>
-        <w:rPr/>
-        <w:t>Ordered child</w:t>
-      </w:r>
-    </w:p>
-    <w:p>
-      <w:pPr>
-        <w:pStyle w:val="ListNumber3"/>
-        <w:numPr>
-          <w:ilvl w:val="0"/>
-          <w:numId w:val="27"/>
-        </w:numPr>
-      </w:pPr>
-      <w:r>
-        <w:rPr/>
-        <w:t>Ordered grandchild</w:t>
-      </w:r>
-    </w:p>
-    <w:p>
-      <w:pPr>
-        <w:pStyle w:val="ListNumber"/>
-        <w:numPr>
-          <w:ilvl w:val="0"/>
-          <w:numId w:val="28"/>
-        </w:numPr>
-      </w:pPr>
-      <w:r>
-        <w:rPr/>
-        <w:t>Mixed ordered parent</w:t>
-      </w:r>
-    </w:p>
-    <w:p>
-      <w:pPr>
-        <w:pStyle w:val="ListBullet2"/>
-        <w:numPr>
-          <w:ilvl w:val="0"/>
-          <w:numId w:val="29"/>
-        </w:numPr>
-      </w:pPr>
-      <w:r>
-        <w:rPr/>
-        <w:t>Unordered child</w:t>
-      </w:r>
-    </w:p>
-    <w:p>
-      <w:pPr>
-        <w:pStyle w:val="ListBullet3"/>
-        <w:numPr>
-          <w:ilvl w:val="0"/>
-          <w:numId w:val="30"/>
-        </w:numPr>
-      </w:pPr>
-      <w:r>
-        <w:rPr/>
-        <w:t>Unordered grandchild</w:t>
-      </w:r>
-    </w:p>
-    <w:p>
-      <w:pPr>
-        <w:pStyle w:val="Heading2"/>
-      </w:pPr>
-      <w:bookmarkStart w:id="16" w:name="md_540996c52d6982291dfbaf78a79f"/>
-      <w:bookmarkEnd w:id="16"/>
-      <w:r>
-        <w:rPr/>
-        <w:t>Rich list items</w:t>
-      </w:r>
-    </w:p>
-    <w:p>
-      <w:pPr>
-        <w:pStyle w:val="ListNumber"/>
-        <w:numPr>
-          <w:ilvl w:val="0"/>
-          <w:numId w:val="31"/>
         </w:numPr>
       </w:pPr>
       <w:r>
@@ -1996,7 +2237,7 @@
         <w:pStyle w:val="ListNumber"/>
         <w:numPr>
           <w:ilvl w:val="0"/>
-          <w:numId w:val="31"/>
+          <w:numId w:val="23"/>
         </w:numPr>
       </w:pPr>
       <w:r>
@@ -2114,7 +2355,7 @@
         <w:pStyle w:val="ListBullet"/>
         <w:numPr>
           <w:ilvl w:val="0"/>
-          <w:numId w:val="32"/>
+          <w:numId w:val="24"/>
         </w:numPr>
       </w:pPr>
       <w:r>
@@ -2127,7 +2368,7 @@
         <w:pStyle w:val="ListNumber"/>
         <w:numPr>
           <w:ilvl w:val="0"/>
-          <w:numId w:val="33"/>
+          <w:numId w:val="25"/>
         </w:numPr>
       </w:pPr>
       <w:sdt>
@@ -2192,7 +2433,7 @@
         <w:pStyle w:val="ListBullet"/>
         <w:numPr>
           <w:ilvl w:val="0"/>
-          <w:numId w:val="34"/>
+          <w:numId w:val="26"/>
         </w:numPr>
       </w:pPr>
       <w:r>
@@ -2205,7 +2446,7 @@
         <w:pStyle w:val="ListBullet"/>
         <w:numPr>
           <w:ilvl w:val="0"/>
-          <w:numId w:val="34"/>
+          <w:numId w:val="26"/>
         </w:numPr>
       </w:pPr>
     </w:p>
@@ -2214,7 +2455,7 @@
         <w:pStyle w:val="ListBullet"/>
         <w:numPr>
           <w:ilvl w:val="0"/>
-          <w:numId w:val="34"/>
+          <w:numId w:val="26"/>
         </w:numPr>
       </w:pPr>
       <w:r>
@@ -2523,6 +2764,64 @@
     </w:p>
     <w:p>
       <w:pPr>
+        <w:pStyle w:val="Heading2"/>
+      </w:pPr>
+      <w:bookmarkStart w:id="20" w:name="md_02b66c43244dce2855480ea88de7"/>
+      <w:bookmarkEnd w:id="20"/>
+      <w:r>
+        <w:rPr/>
+        <w:t>Empty image destinations</w:t>
+      </w:r>
+    </w:p>
+    <w:p>
+      <w:pPr/>
+      <w:r>
+        <w:rPr/>
+        <w:t xml:space="preserve">An image with no destination becomes a visible placeholder: </w:t>
+      </w:r>
+      <w:r>
+        <w:rPr/>
+        <w:t>[Image: Network diagram]</w:t>
+      </w:r>
+      <w:r>
+        <w:rPr/>
+        <w:t xml:space="preserve">. An image with no alt text becomes </w:t>
+      </w:r>
+      <w:r>
+        <w:rPr/>
+        <w:t>[Image]</w:t>
+      </w:r>
+      <w:r>
+        <w:rPr/>
+        <w:t xml:space="preserve">. The placeholder also works inside </w:t>
+      </w:r>
+      <w:hyperlink r:id="rId20">
+        <w:r>
+          <w:rPr>
+            <w:rStyle w:val="Hyperlink"/>
+          </w:rPr>
+          <w:t>a linked image label</w:t>
+        </w:r>
+      </w:hyperlink>
+      <w:r>
+        <w:rPr/>
+        <w:t xml:space="preserve"> such as </w:t>
+      </w:r>
+      <w:hyperlink r:id="rId20">
+        <w:r>
+          <w:rPr>
+            <w:rStyle w:val="Hyperlink"/>
+          </w:rPr>
+          <w:t>[Image: Linked diagram]</w:t>
+        </w:r>
+      </w:hyperlink>
+      <w:r>
+        <w:rPr/>
+        <w:t>.</w:t>
+      </w:r>
+    </w:p>
+    <w:p>
+      <w:pPr>
         <w:sectPr>
           <w:pgSz w:w="11906" w:h="16838"/>
           <w:pgMar w:top="1020" w:right="1020" w:bottom="1020" w:left="1020" w:header="708" w:footer="708" w:gutter="0"/>
@@ -2535,8 +2834,8 @@
       <w:pPr>
         <w:pStyle w:val="Heading1"/>
       </w:pPr>
-      <w:bookmarkStart w:id="20" w:name="md_1bf6c18defbb212aebe8b6ce6927"/>
-      <w:bookmarkEnd w:id="20"/>
+      <w:bookmarkStart w:id="21" w:name="md_1bf6c18defbb212aebe8b6ce6927"/>
+      <w:bookmarkEnd w:id="21"/>
       <w:r>
         <w:rPr/>
         <w:t>Legal Landscape Lab</w:t>
@@ -2801,8 +3100,8 @@
       <w:pPr>
         <w:pStyle w:val="Heading1"/>
       </w:pPr>
-      <w:bookmarkStart w:id="21" w:name="md_a009503c39a92748e3d467d7c61a"/>
-      <w:bookmarkEnd w:id="21"/>
+      <w:bookmarkStart w:id="22" w:name="md_a009503c39a92748e3d467d7c61a"/>
+      <w:bookmarkEnd w:id="22"/>
       <w:r>
         <w:rPr/>
         <w:t>Custom Page Lab</w:t>
@@ -2858,8 +3157,8 @@
       <w:pPr>
         <w:pStyle w:val="Heading2"/>
       </w:pPr>
-      <w:bookmarkStart w:id="22" w:name="md_f383a0d0b844d9b00681969c334c"/>
-      <w:bookmarkEnd w:id="22"/>
+      <w:bookmarkStart w:id="23" w:name="md_f383a0d0b844d9b00681969c334c"/>
+      <w:bookmarkEnd w:id="23"/>
       <w:r>
         <w:rPr/>
         <w:t>Environment-dependent coverage</w:t>
@@ -2992,8 +3291,8 @@
       <w:pPr>
         <w:pStyle w:val="Heading1"/>
       </w:pPr>
-      <w:bookmarkStart w:id="23" w:name="md_ac49b03d58a09e1d112171499dfe"/>
-      <w:bookmarkEnd w:id="23"/>
+      <w:bookmarkStart w:id="24" w:name="md_ac49b03d58a09e1d112171499dfe"/>
+      <w:bookmarkEnd w:id="24"/>
       <w:r>
         <w:rPr/>
         <w:t>Back to Document Defaults</w:t>
@@ -3039,8 +3338,8 @@
       <w:pPr>
         <w:pStyle w:val="Heading2"/>
       </w:pPr>
-      <w:bookmarkStart w:id="24" w:name="md_9652f0b201e92db1e8d62a4c5b77"/>
-      <w:bookmarkEnd w:id="24"/>
+      <w:bookmarkStart w:id="25" w:name="md_9652f0b201e92db1e8d62a4c5b77"/>
+      <w:bookmarkEnd w:id="25"/>
       <w:r>
         <w:rPr/>
         <w:t>Native footnotes</w:t>
@@ -3068,8 +3367,8 @@
       <w:pPr>
         <w:pStyle w:val="Heading2"/>
       </w:pPr>
-      <w:bookmarkStart w:id="25" w:name="md_03a6d15b03b1c0e43eb5c060ff2b"/>
-      <w:bookmarkEnd w:id="25"/>
+      <w:bookmarkStart w:id="26" w:name="md_03a6d15b03b1c0e43eb5c060ff2b"/>
+      <w:bookmarkEnd w:id="26"/>
       <w:r>
         <w:rPr/>
         <w:t>Repeating table headers</w:t>
@@ -3192,8 +3491,8 @@
       <w:pPr>
         <w:pStyle w:val="Heading2"/>
       </w:pPr>
-      <w:bookmarkStart w:id="26" w:name="md_21d73fac803abc9fd064976aa2c3"/>
-      <w:bookmarkEnd w:id="26"/>
+      <w:bookmarkStart w:id="27" w:name="md_21d73fac803abc9fd064976aa2c3"/>
+      <w:bookmarkEnd w:id="27"/>
       <w:r>
         <w:rPr/>
         <w:t>DOTX formatting templates</w:t>
@@ -3245,8 +3544,8 @@
       <w:pPr>
         <w:pStyle w:val="Heading1"/>
       </w:pPr>
-      <w:bookmarkStart w:id="27" w:name="md_405a2a09468512564f0ffac0912c"/>
-      <w:bookmarkEnd w:id="27"/>
+      <w:bookmarkStart w:id="28" w:name="md_405a2a09468512564f0ffac0912c"/>
+      <w:bookmarkEnd w:id="28"/>
       <w:r>
         <w:rPr/>
         <w:t>Syntax Highlighting Gallery</w:t>
@@ -3263,8 +3562,8 @@
       <w:pPr>
         <w:pStyle w:val="Heading2"/>
       </w:pPr>
-      <w:bookmarkStart w:id="28" w:name="md_e5e239560bc125a20ff2ac1fea50"/>
-      <w:bookmarkEnd w:id="28"/>
+      <w:bookmarkStart w:id="29" w:name="md_e5e239560bc125a20ff2ac1fea50"/>
+      <w:bookmarkEnd w:id="29"/>
       <w:r>
         <w:rPr/>
         <w:t>HTML</w:t>
@@ -3368,8 +3667,8 @@
       <w:pPr>
         <w:pStyle w:val="Heading2"/>
       </w:pPr>
-      <w:bookmarkStart w:id="29" w:name="md_36e64f19f57a05c8cd5b6bf7eff7"/>
-      <w:bookmarkEnd w:id="29"/>
+      <w:bookmarkStart w:id="30" w:name="md_36e64f19f57a05c8cd5b6bf7eff7"/>
+      <w:bookmarkEnd w:id="30"/>
       <w:r>
         <w:rPr/>
         <w:t>CSS</w:t>
@@ -3464,8 +3763,8 @@
       <w:pPr>
         <w:pStyle w:val="Heading2"/>
       </w:pPr>
-      <w:bookmarkStart w:id="30" w:name="md_eda71746c01c3f465ffd02b6da15"/>
-      <w:bookmarkEnd w:id="30"/>
+      <w:bookmarkStart w:id="31" w:name="md_eda71746c01c3f465ffd02b6da15"/>
+      <w:bookmarkEnd w:id="31"/>
       <w:r>
         <w:rPr/>
         <w:t>JavaScript</w:t>
@@ -3585,8 +3884,8 @@
       <w:pPr>
         <w:pStyle w:val="Heading2"/>
       </w:pPr>
-      <w:bookmarkStart w:id="31" w:name="md_969545dde1584d88227517c6a0c9"/>
-      <w:bookmarkEnd w:id="31"/>
+      <w:bookmarkStart w:id="32" w:name="md_969545dde1584d88227517c6a0c9"/>
+      <w:bookmarkEnd w:id="32"/>
       <w:r>
         <w:rPr/>
         <w:t>TypeScript</w:t>
@@ -3714,8 +4013,8 @@
       <w:pPr>
         <w:pStyle w:val="Heading2"/>
       </w:pPr>
-      <w:bookmarkStart w:id="32" w:name="md_11a4a60b518bf24989d481468076"/>
-      <w:bookmarkEnd w:id="32"/>
+      <w:bookmarkStart w:id="33" w:name="md_11a4a60b518bf24989d481468076"/>
+      <w:bookmarkEnd w:id="33"/>
       <w:r>
         <w:rPr/>
         <w:t>Python</w:t>
@@ -3851,8 +4150,8 @@
       <w:pPr>
         <w:pStyle w:val="Heading2"/>
       </w:pPr>
-      <w:bookmarkStart w:id="33" w:name="md_12a5d18ee896e59954bdce0f4acc"/>
-      <w:bookmarkEnd w:id="33"/>
+      <w:bookmarkStart w:id="34" w:name="md_12a5d18ee896e59954bdce0f4acc"/>
+      <w:bookmarkEnd w:id="34"/>
       <w:r>
         <w:rPr/>
         <w:t>PHP</w:t>
@@ -3987,8 +4286,8 @@
       <w:pPr>
         <w:pStyle w:val="Heading2"/>
       </w:pPr>
-      <w:bookmarkStart w:id="34" w:name="md_2e7d2c03a9507ae265ecf5b53568"/>
-      <w:bookmarkEnd w:id="34"/>
+      <w:bookmarkStart w:id="35" w:name="md_2e7d2c03a9507ae265ecf5b53568"/>
+      <w:bookmarkEnd w:id="35"/>
       <w:r>
         <w:rPr/>
         <w:t>C#</w:t>
@@ -4112,8 +4411,8 @@
       <w:pPr>
         <w:pStyle w:val="Heading2"/>
       </w:pPr>
-      <w:bookmarkStart w:id="35" w:name="md_38a0963a6364b09ad867aa9a66c6"/>
-      <w:bookmarkEnd w:id="35"/>
+      <w:bookmarkStart w:id="36" w:name="md_38a0963a6364b09ad867aa9a66c6"/>
+      <w:bookmarkEnd w:id="36"/>
       <w:r>
         <w:rPr/>
         <w:t>Java</w:t>
@@ -4272,8 +4571,8 @@
       <w:pPr>
         <w:pStyle w:val="Heading2"/>
       </w:pPr>
-      <w:bookmarkStart w:id="36" w:name="md_a6f7ef47ee8dc84af9056a3051dd"/>
-      <w:bookmarkEnd w:id="36"/>
+      <w:bookmarkStart w:id="37" w:name="md_a6f7ef47ee8dc84af9056a3051dd"/>
+      <w:bookmarkEnd w:id="37"/>
       <w:r>
         <w:rPr/>
         <w:t>C</w:t>
@@ -4413,8 +4712,8 @@
       <w:pPr>
         <w:pStyle w:val="Heading2"/>
       </w:pPr>
-      <w:bookmarkStart w:id="37" w:name="md_a33603bf79f74b056172d43b7835"/>
-      <w:bookmarkEnd w:id="37"/>
+      <w:bookmarkStart w:id="38" w:name="md_a33603bf79f74b056172d43b7835"/>
+      <w:bookmarkEnd w:id="38"/>
       <w:r>
         <w:rPr/>
         <w:t>Swift</w:t>
@@ -4544,8 +4843,8 @@
       <w:pPr>
         <w:pStyle w:val="Heading2"/>
       </w:pPr>
-      <w:bookmarkStart w:id="38" w:name="md_4cd0e21a9a0795a14ec9aa5f0e7d"/>
-      <w:bookmarkEnd w:id="38"/>
+      <w:bookmarkStart w:id="39" w:name="md_4cd0e21a9a0795a14ec9aa5f0e7d"/>
+      <w:bookmarkEnd w:id="39"/>
       <w:r>
         <w:rPr/>
         <w:t>Go</w:t>
@@ -4653,8 +4952,8 @@
       <w:pPr>
         <w:pStyle w:val="Heading2"/>
       </w:pPr>
-      <w:bookmarkStart w:id="39" w:name="md_6260cd1bca682c8e6d53f7bd4808"/>
-      <w:bookmarkEnd w:id="39"/>
+      <w:bookmarkStart w:id="40" w:name="md_6260cd1bca682c8e6d53f7bd4808"/>
+      <w:bookmarkEnd w:id="40"/>
       <w:r>
         <w:rPr/>
         <w:t>C++</w:t>
@@ -4797,8 +5096,8 @@
       <w:pPr>
         <w:pStyle w:val="Heading2"/>
       </w:pPr>
-      <w:bookmarkStart w:id="40" w:name="md_521fe5c9ece1aa1f8b6622817159"/>
-      <w:bookmarkEnd w:id="40"/>
+      <w:bookmarkStart w:id="41" w:name="md_521fe5c9ece1aa1f8b6622817159"/>
+      <w:bookmarkEnd w:id="41"/>
       <w:r>
         <w:rPr/>
         <w:t>Rust</w:t>
@@ -5119,12 +5418,13 @@
   </w:abstractNum>
   <w:abstractNum w:abstractNumId="7">
     <w:nsid w:val="FFFFFF88"/>
-    <w:multiLevelType w:val="singleLevel"/>
+    <w:multiLevelType w:val="multilevel"/>
     <w:tmpl w:val="D0A62B40"/>
     <w:lvl w:ilvl="0">
       <w:start w:val="1"/>
       <w:numFmt w:val="decimal"/>
       <w:pStyle w:val="ListNumber"/>
+      <w:pStyle w:val="ListNumber"/>
       <w:lvlText w:val="%1."/>
       <w:lvlJc w:val="left"/>
       <w:pPr>
@@ -5134,15 +5434,128 @@
         <w:ind w:left="360" w:hanging="360"/>
       </w:pPr>
     </w:lvl>
+    <w:lvl w:ilvl="1">
+      <w:start w:val="1"/>
+      <w:numFmt w:val="lowerLetter"/>
+      <w:pStyle w:val="ListNumber2"/>
+      <w:pStyle w:val="ListNumber"/>
+      <w:lvlText w:val="%2."/>
+      <w:lvlJc w:val="left"/>
+      <w:pPr>
+        <w:tabs>
+          <w:tab w:val="num" w:pos="720"/>
+        </w:tabs>
+        <w:ind w:left="720" w:hanging="360"/>
+      </w:pPr>
+    </w:lvl>
+    <w:lvl w:ilvl="2">
+      <w:start w:val="1"/>
+      <w:numFmt w:val="lowerRoman"/>
+      <w:pStyle w:val="ListNumber3"/>
+      <w:pStyle w:val="ListNumber"/>
+      <w:lvlText w:val="%3."/>
+      <w:lvlJc w:val="left"/>
+      <w:pPr>
+        <w:tabs>
+          <w:tab w:val="num" w:pos="1080"/>
+        </w:tabs>
+        <w:ind w:left="1080" w:hanging="360"/>
+      </w:pPr>
+    </w:lvl>
+    <w:lvl w:ilvl="3">
+      <w:start w:val="1"/>
+      <w:numFmt w:val="decimal"/>
+      <w:pStyle w:val="ListNumber4"/>
+      <w:pStyle w:val="ListNumber"/>
+      <w:lvlText w:val="%4."/>
+      <w:lvlJc w:val="left"/>
+      <w:pPr>
+        <w:tabs>
+          <w:tab w:val="num" w:pos="1440"/>
+        </w:tabs>
+        <w:ind w:left="1440" w:hanging="360"/>
+      </w:pPr>
+    </w:lvl>
+    <w:lvl w:ilvl="4">
+      <w:start w:val="1"/>
+      <w:numFmt w:val="lowerLetter"/>
+      <w:pStyle w:val="ListNumber5"/>
+      <w:pStyle w:val="ListNumber"/>
+      <w:lvlText w:val="%5."/>
+      <w:lvlJc w:val="left"/>
+      <w:pPr>
+        <w:tabs>
+          <w:tab w:val="num" w:pos="1800"/>
+        </w:tabs>
+        <w:ind w:left="1800" w:hanging="360"/>
+      </w:pPr>
+    </w:lvl>
+    <w:lvl w:ilvl="5">
+      <w:start w:val="1"/>
+      <w:numFmt w:val="lowerRoman"/>
+      <w:pStyle w:val="ListNumber6"/>
+      <w:pStyle w:val="ListNumber"/>
+      <w:lvlText w:val="%6."/>
+      <w:lvlJc w:val="left"/>
+      <w:pPr>
+        <w:tabs>
+          <w:tab w:val="num" w:pos="2160"/>
+        </w:tabs>
+        <w:ind w:left="2160" w:hanging="360"/>
+      </w:pPr>
+    </w:lvl>
+    <w:lvl w:ilvl="6">
+      <w:start w:val="1"/>
+      <w:numFmt w:val="decimal"/>
+      <w:pStyle w:val="ListNumber7"/>
+      <w:pStyle w:val="ListNumber"/>
+      <w:lvlText w:val="%7."/>
+      <w:lvlJc w:val="left"/>
+      <w:pPr>
+        <w:tabs>
+          <w:tab w:val="num" w:pos="2520"/>
+        </w:tabs>
+        <w:ind w:left="2520" w:hanging="360"/>
+      </w:pPr>
+    </w:lvl>
+    <w:lvl w:ilvl="7">
+      <w:start w:val="1"/>
+      <w:numFmt w:val="lowerLetter"/>
+      <w:pStyle w:val="ListNumber8"/>
+      <w:pStyle w:val="ListNumber"/>
+      <w:lvlText w:val="%8."/>
+      <w:lvlJc w:val="left"/>
+      <w:pPr>
+        <w:tabs>
+          <w:tab w:val="num" w:pos="2880"/>
+        </w:tabs>
+        <w:ind w:left="2880" w:hanging="360"/>
+      </w:pPr>
+    </w:lvl>
+    <w:lvl w:ilvl="8">
+      <w:start w:val="1"/>
+      <w:numFmt w:val="lowerRoman"/>
+      <w:pStyle w:val="ListNumber9"/>
+      <w:pStyle w:val="ListNumber"/>
+      <w:lvlText w:val="%9."/>
+      <w:lvlJc w:val="left"/>
+      <w:pPr>
+        <w:tabs>
+          <w:tab w:val="num" w:pos="3240"/>
+        </w:tabs>
+        <w:ind w:left="3240" w:hanging="360"/>
+      </w:pPr>
+    </w:lvl>
   </w:abstractNum>
   <w:abstractNum w:abstractNumId="8">
     <w:nsid w:val="FFFFFF89"/>
-    <w:multiLevelType w:val="singleLevel"/>
+    <w:multiLevelType w:val="multilevel"/>
     <w:tmpl w:val="29761A62"/>
     <w:lvl w:ilvl="0">
       <w:start w:val="1"/>
       <w:numFmt w:val="bullet"/>
       <w:pStyle w:val="ListBullet"/>
+      <w:pStyle w:val="ListBullet"/>
       <w:lvlText w:val=""/>
       <w:lvlJc w:val="left"/>
       <w:pPr>
@@ -5155,15 +5568,152 @@
         <w:rFonts w:ascii="Symbol" w:hAnsi="Symbol" w:hint="default"/>
       </w:rPr>
     </w:lvl>
+    <w:lvl w:ilvl="1">
+      <w:start w:val="1"/>
+      <w:numFmt w:val="bullet"/>
+      <w:pStyle w:val="ListBullet2"/>
+      <w:pStyle w:val="ListBullet"/>
+      <w:lvlText w:val=""/>
+      <w:lvlJc w:val="left"/>
+      <w:pPr>
+        <w:tabs>
+          <w:tab w:val="num" w:pos="720"/>
+        </w:tabs>
+        <w:ind w:left="720" w:hanging="360"/>
+      </w:pPr>
+      <w:rPr>
+        <w:rFonts w:ascii="Symbol" w:hAnsi="Symbol" w:hint="default"/>
+      </w:rPr>
+    </w:lvl>
+    <w:lvl w:ilvl="2">
+      <w:start w:val="1"/>
+      <w:numFmt w:val="bullet"/>
+      <w:pStyle w:val="ListBullet3"/>
+      <w:pStyle w:val="ListBullet"/>
+      <w:lvlText w:val=""/>
+      <w:lvlJc w:val="left"/>
+      <w:pPr>
+        <w:tabs>
+          <w:tab w:val="num" w:pos="1080"/>
+        </w:tabs>
+        <w:ind w:left="1080" w:hanging="360"/>
+      </w:pPr>
+      <w:rPr>
+        <w:rFonts w:ascii="Symbol" w:hAnsi="Symbol" w:hint="default"/>
+      </w:rPr>
+    </w:lvl>
+    <w:lvl w:ilvl="3">
+      <w:start w:val="1"/>
+      <w:numFmt w:val="bullet"/>
+      <w:pStyle w:val="ListBullet4"/>
+      <w:pStyle w:val="ListBullet"/>
+      <w:lvlText w:val=""/>
+      <w:lvlJc w:val="left"/>
+      <w:pPr>
+        <w:tabs>
+          <w:tab w:val="num" w:pos="1440"/>
+        </w:tabs>
+        <w:ind w:left="1440" w:hanging="360"/>
+      </w:pPr>
+      <w:rPr>
+        <w:rFonts w:ascii="Symbol" w:hAnsi="Symbol" w:hint="default"/>
+      </w:rPr>
+    </w:lvl>
+    <w:lvl w:ilvl="4">
+      <w:start w:val="1"/>
+      <w:numFmt w:val="bullet"/>
+      <w:pStyle w:val="ListBullet5"/>
+      <w:pStyle w:val="ListBullet"/>
+      <w:lvlText w:val=""/>
+      <w:lvlJc w:val="left"/>
+      <w:pPr>
+        <w:tabs>
+          <w:tab w:val="num" w:pos="1800"/>
+        </w:tabs>
+        <w:ind w:left="1800" w:hanging="360"/>
+      </w:pPr>
+      <w:rPr>
+        <w:rFonts w:ascii="Symbol" w:hAnsi="Symbol" w:hint="default"/>
+      </w:rPr>
+    </w:lvl>
+    <w:lvl w:ilvl="5">
+      <w:start w:val="1"/>
+      <w:numFmt w:val="bullet"/>
+      <w:pStyle w:val="ListBullet6"/>
+      <w:pStyle w:val="ListBullet"/>
+      <w:lvlText w:val=""/>
+      <w:lvlJc w:val="left"/>
+      <w:pPr>
+        <w:tabs>
+          <w:tab w:val="num" w:pos="2160"/>
+        </w:tabs>
+        <w:ind w:left="2160" w:hanging="360"/>
+      </w:pPr>
+      <w:rPr>
+        <w:rFonts w:ascii="Symbol" w:hAnsi="Symbol" w:hint="default"/>
+      </w:rPr>
+    </w:lvl>
+    <w:lvl w:ilvl="6">
+      <w:start w:val="1"/>
+      <w:numFmt w:val="bullet"/>
+      <w:pStyle w:val="ListBullet7"/>
+      <w:pStyle w:val="ListBullet"/>
+      <w:lvlText w:val=""/>
+      <w:lvlJc w:val="left"/>
+      <w:pPr>
+        <w:tabs>
+          <w:tab w:val="num" w:pos="2520"/>
+        </w:tabs>
+        <w:ind w:left="2520" w:hanging="360"/>
+      </w:pPr>
+      <w:rPr>
+        <w:rFonts w:ascii="Symbol" w:hAnsi="Symbol" w:hint="default"/>
+      </w:rPr>
+    </w:lvl>
+    <w:lvl w:ilvl="7">
+      <w:start w:val="1"/>
+      <w:numFmt w:val="bullet"/>
+      <w:pStyle w:val="ListBullet8"/>
+      <w:pStyle w:val="ListBullet"/>
+      <w:lvlText w:val=""/>
+      <w:lvlJc w:val="left"/>
+      <w:pPr>
+        <w:tabs>
+          <w:tab w:val="num" w:pos="2880"/>
+        </w:tabs>
+        <w:ind w:left="2880" w:hanging="360"/>
+      </w:pPr>
+      <w:rPr>
+        <w:rFonts w:ascii="Symbol" w:hAnsi="Symbol" w:hint="default"/>
+      </w:rPr>
+    </w:lvl>
+    <w:lvl w:ilvl="8">
+      <w:start w:val="1"/>
+      <w:numFmt w:val="bullet"/>
+      <w:pStyle w:val="ListBullet9"/>
+      <w:pStyle w:val="ListBullet"/>
+      <w:lvlText w:val=""/>
+      <w:lvlJc w:val="left"/>
+      <w:pPr>
+        <w:tabs>
+          <w:tab w:val="num" w:pos="3240"/>
+        </w:tabs>
+        <w:ind w:left="3240" w:hanging="360"/>
+      </w:pPr>
+      <w:rPr>
+        <w:rFonts w:ascii="Symbol" w:hAnsi="Symbol" w:hint="default"/>
+      </w:rPr>
+    </w:lvl>
   </w:abstractNum>
   <w:abstractNum w:abstractNumId="9">
-    <w:nsid w:val="0948A7C4"/>
-    <w:multiLevelType w:val="singleLevel"/>
+    <w:nsid w:val="4CDEBB88"/>
+    <w:multiLevelType w:val="multilevel"/>
     <w:tmpl w:val="29761A62"/>
     <w:lvl w:ilvl="0">
       <w:start w:val="1"/>
       <w:numFmt w:val="bullet"/>
       <w:pStyle w:val="ListBullet"/>
+      <w:pStyle w:val="ListBullet"/>
       <w:lvlText w:val=""/>
       <w:lvlJc w:val="left"/>
       <w:pPr>
@@ -5176,15 +5726,152 @@
         <w:rFonts w:ascii="Symbol" w:hAnsi="Symbol" w:hint="default"/>
       </w:rPr>
     </w:lvl>
+    <w:lvl w:ilvl="1">
+      <w:start w:val="1"/>
+      <w:numFmt w:val="bullet"/>
+      <w:pStyle w:val="ListBullet2"/>
+      <w:pStyle w:val="ListBullet"/>
+      <w:lvlText w:val=""/>
+      <w:lvlJc w:val="left"/>
+      <w:pPr>
+        <w:tabs>
+          <w:tab w:val="num" w:pos="720"/>
+        </w:tabs>
+        <w:ind w:left="720" w:hanging="360"/>
+      </w:pPr>
+      <w:rPr>
+        <w:rFonts w:ascii="Symbol" w:hAnsi="Symbol" w:hint="default"/>
+      </w:rPr>
+    </w:lvl>
+    <w:lvl w:ilvl="2">
+      <w:start w:val="1"/>
+      <w:numFmt w:val="bullet"/>
+      <w:pStyle w:val="ListBullet3"/>
+      <w:pStyle w:val="ListBullet"/>
+      <w:lvlText w:val=""/>
+      <w:lvlJc w:val="left"/>
+      <w:pPr>
+        <w:tabs>
+          <w:tab w:val="num" w:pos="1080"/>
+        </w:tabs>
+        <w:ind w:left="1080" w:hanging="360"/>
+      </w:pPr>
+      <w:rPr>
+        <w:rFonts w:ascii="Symbol" w:hAnsi="Symbol" w:hint="default"/>
+      </w:rPr>
+    </w:lvl>
+    <w:lvl w:ilvl="3">
+      <w:start w:val="1"/>
+      <w:numFmt w:val="bullet"/>
+      <w:pStyle w:val="ListBullet4"/>
+      <w:pStyle w:val="ListBullet"/>
+      <w:lvlText w:val=""/>
+      <w:lvlJc w:val="left"/>
+      <w:pPr>
+        <w:tabs>
+          <w:tab w:val="num" w:pos="1440"/>
+        </w:tabs>
+        <w:ind w:left="1440" w:hanging="360"/>
+      </w:pPr>
+      <w:rPr>
+        <w:rFonts w:ascii="Symbol" w:hAnsi="Symbol" w:hint="default"/>
+      </w:rPr>
+    </w:lvl>
+    <w:lvl w:ilvl="4">
+      <w:start w:val="1"/>
+      <w:numFmt w:val="bullet"/>
+      <w:pStyle w:val="ListBullet5"/>
+      <w:pStyle w:val="ListBullet"/>
+      <w:lvlText w:val=""/>
+      <w:lvlJc w:val="left"/>
+      <w:pPr>
+        <w:tabs>
+          <w:tab w:val="num" w:pos="1800"/>
+        </w:tabs>
+        <w:ind w:left="1800" w:hanging="360"/>
+      </w:pPr>
+      <w:rPr>
+        <w:rFonts w:ascii="Symbol" w:hAnsi="Symbol" w:hint="default"/>
+      </w:rPr>
+    </w:lvl>
+    <w:lvl w:ilvl="5">
+      <w:start w:val="1"/>
+      <w:numFmt w:val="bullet"/>
+      <w:pStyle w:val="ListBullet6"/>
+      <w:pStyle w:val="ListBullet"/>
+      <w:lvlText w:val=""/>
+      <w:lvlJc w:val="left"/>
+      <w:pPr>
+        <w:tabs>
+          <w:tab w:val="num" w:pos="2160"/>
+        </w:tabs>
+        <w:ind w:left="2160" w:hanging="360"/>
+      </w:pPr>
+      <w:rPr>
+        <w:rFonts w:ascii="Symbol" w:hAnsi="Symbol" w:hint="default"/>
+      </w:rPr>
+    </w:lvl>
+    <w:lvl w:ilvl="6">
+      <w:start w:val="1"/>
+      <w:numFmt w:val="bullet"/>
+      <w:pStyle w:val="ListBullet7"/>
+      <w:pStyle w:val="ListBullet"/>
+      <w:lvlText w:val=""/>
+      <w:lvlJc w:val="left"/>
+      <w:pPr>
+        <w:tabs>
+          <w:tab w:val="num" w:pos="2520"/>
+        </w:tabs>
+        <w:ind w:left="2520" w:hanging="360"/>
+      </w:pPr>
+      <w:rPr>
+        <w:rFonts w:ascii="Symbol" w:hAnsi="Symbol" w:hint="default"/>
+      </w:rPr>
+    </w:lvl>
+    <w:lvl w:ilvl="7">
+      <w:start w:val="1"/>
+      <w:numFmt w:val="bullet"/>
+      <w:pStyle w:val="ListBullet8"/>
+      <w:pStyle w:val="ListBullet"/>
+      <w:lvlText w:val=""/>
+      <w:lvlJc w:val="left"/>
+      <w:pPr>
+        <w:tabs>
+          <w:tab w:val="num" w:pos="2880"/>
+        </w:tabs>
+        <w:ind w:left="2880" w:hanging="360"/>
+      </w:pPr>
+      <w:rPr>
+        <w:rFonts w:ascii="Symbol" w:hAnsi="Symbol" w:hint="default"/>
+      </w:rPr>
+    </w:lvl>
+    <w:lvl w:ilvl="8">
+      <w:start w:val="1"/>
+      <w:numFmt w:val="bullet"/>
+      <w:pStyle w:val="ListBullet9"/>
+      <w:pStyle w:val="ListBullet"/>
+      <w:lvlText w:val=""/>
+      <w:lvlJc w:val="left"/>
+      <w:pPr>
+        <w:tabs>
+          <w:tab w:val="num" w:pos="3240"/>
+        </w:tabs>
+        <w:ind w:left="3240" w:hanging="360"/>
+      </w:pPr>
+      <w:rPr>
+        <w:rFonts w:ascii="Symbol" w:hAnsi="Symbol" w:hint="default"/>
+      </w:rPr>
+    </w:lvl>
   </w:abstractNum>
   <w:abstractNum w:abstractNumId="10">
-    <w:nsid w:val="591F3E4E"/>
-    <w:multiLevelType w:val="singleLevel"/>
+    <w:nsid w:val="27D72A27"/>
+    <w:multiLevelType w:val="multilevel"/>
     <w:tmpl w:val="29761A62"/>
     <w:lvl w:ilvl="0">
       <w:start w:val="1"/>
       <w:numFmt w:val="bullet"/>
       <w:pStyle w:val="ListBullet"/>
+      <w:pStyle w:val="ListBullet"/>
       <w:lvlText w:val=""/>
       <w:lvlJc w:val="left"/>
       <w:pPr>
@@ -5197,15 +5884,11 @@
         <w:rFonts w:ascii="Symbol" w:hAnsi="Symbol" w:hint="default"/>
       </w:rPr>
     </w:lvl>
-  </w:abstractNum>
-  <w:abstractNum w:abstractNumId="11">
-    <w:nsid w:val="EBE3199A"/>
-    <w:multiLevelType w:val="singleLevel"/>
-    <w:tmpl w:val="3D1EFFD4"/>
-    <w:lvl w:ilvl="0">
+    <w:lvl w:ilvl="1">
       <w:start w:val="1"/>
       <w:numFmt w:val="bullet"/>
       <w:pStyle w:val="ListBullet2"/>
+      <w:pStyle w:val="ListBullet"/>
       <w:lvlText w:val=""/>
       <w:lvlJc w:val="left"/>
       <w:pPr>
@@ -5218,15 +5901,11 @@
         <w:rFonts w:ascii="Symbol" w:hAnsi="Symbol" w:hint="default"/>
       </w:rPr>
     </w:lvl>
-  </w:abstractNum>
-  <w:abstractNum w:abstractNumId="12">
-    <w:nsid w:val="226EE7D0"/>
-    <w:multiLevelType w:val="singleLevel"/>
-    <w:tmpl w:val="F3EAFDEC"/>
-    <w:lvl w:ilvl="0">
+    <w:lvl w:ilvl="2">
       <w:start w:val="1"/>
       <w:numFmt w:val="bullet"/>
       <w:pStyle w:val="ListBullet3"/>
+      <w:pStyle w:val="ListBullet"/>
       <w:lvlText w:val=""/>
       <w:lvlJc w:val="left"/>
       <w:pPr>
@@ -5239,57 +5918,118 @@
         <w:rFonts w:ascii="Symbol" w:hAnsi="Symbol" w:hint="default"/>
       </w:rPr>
     </w:lvl>
-  </w:abstractNum>
-  <w:abstractNum w:abstractNumId="13">
-    <w:nsid w:val="C64262C3"/>
-    <w:multiLevelType w:val="singleLevel"/>
-    <w:tmpl w:val="3D1EFFD4"/>
-    <w:lvl w:ilvl="0">
+    <w:lvl w:ilvl="3">
       <w:start w:val="1"/>
       <w:numFmt w:val="bullet"/>
-      <w:pStyle w:val="ListBullet2"/>
+      <w:pStyle w:val="ListBullet4"/>
+      <w:pStyle w:val="ListBullet"/>
       <w:lvlText w:val=""/>
       <w:lvlJc w:val="left"/>
       <w:pPr>
         <w:tabs>
-          <w:tab w:val="num" w:pos="720"/>
+          <w:tab w:val="num" w:pos="1440"/>
         </w:tabs>
-        <w:ind w:left="720" w:hanging="360"/>
+        <w:ind w:left="1440" w:hanging="360"/>
+      </w:pPr>
+      <w:rPr>
+        <w:rFonts w:ascii="Symbol" w:hAnsi="Symbol" w:hint="default"/>
+      </w:rPr>
+    </w:lvl>
+    <w:lvl w:ilvl="4">
+      <w:start w:val="1"/>
+      <w:numFmt w:val="bullet"/>
+      <w:pStyle w:val="ListBullet5"/>
+      <w:pStyle w:val="ListBullet"/>
+      <w:lvlText w:val=""/>
+      <w:lvlJc w:val="left"/>
+      <w:pPr>
+        <w:tabs>
+          <w:tab w:val="num" w:pos="1800"/>
+        </w:tabs>
+        <w:ind w:left="1800" w:hanging="360"/>
+      </w:pPr>
+      <w:rPr>
+        <w:rFonts w:ascii="Symbol" w:hAnsi="Symbol" w:hint="default"/>
+      </w:rPr>
+    </w:lvl>
+    <w:lvl w:ilvl="5">
+      <w:start w:val="1"/>
+      <w:numFmt w:val="bullet"/>
+      <w:pStyle w:val="ListBullet6"/>
+      <w:pStyle w:val="ListBullet"/>
+      <w:lvlText w:val=""/>
+      <w:lvlJc w:val="left"/>
+      <w:pPr>
+        <w:tabs>
+          <w:tab w:val="num" w:pos="2160"/>
+        </w:tabs>
+        <w:ind w:left="2160" w:hanging="360"/>
+      </w:pPr>
+      <w:rPr>
+        <w:rFonts w:ascii="Symbol" w:hAnsi="Symbol" w:hint="default"/>
+      </w:rPr>
+    </w:lvl>
+    <w:lvl w:ilvl="6">
+      <w:start w:val="1"/>
+      <w:numFmt w:val="bullet"/>
+      <w:pStyle w:val="ListBullet7"/>
+      <w:pStyle w:val="ListBullet"/>
+      <w:lvlText w:val=""/>
+      <w:lvlJc w:val="left"/>
+      <w:pPr>
+        <w:tabs>
+          <w:tab w:val="num" w:pos="2520"/>
+        </w:tabs>
+        <w:ind w:left="2520" w:hanging="360"/>
+      </w:pPr>
+      <w:rPr>
+        <w:rFonts w:ascii="Symbol" w:hAnsi="Symbol" w:hint="default"/>
+      </w:rPr>
+    </w:lvl>
+    <w:lvl w:ilvl="7">
+      <w:start w:val="1"/>
+      <w:numFmt w:val="bullet"/>
+      <w:pStyle w:val="ListBullet8"/>
+      <w:pStyle w:val="ListBullet"/>
+      <w:lvlText w:val=""/>
+      <w:lvlJc w:val="left"/>
+      <w:pPr>
+        <w:tabs>
+          <w:tab w:val="num" w:pos="2880"/>
+        </w:tabs>
+        <w:ind w:left="2880" w:hanging="360"/>
+      </w:pPr>
+      <w:rPr>
+        <w:rFonts w:ascii="Symbol" w:hAnsi="Symbol" w:hint="default"/>
+      </w:rPr>
+    </w:lvl>
+    <w:lvl w:ilvl="8">
+      <w:start w:val="1"/>
+      <w:numFmt w:val="bullet"/>
+      <w:pStyle w:val="ListBullet9"/>
+      <w:pStyle w:val="ListBullet"/>
+      <w:lvlText w:val=""/>
+      <w:lvlJc w:val="left"/>
+      <w:pPr>
+        <w:tabs>
+          <w:tab w:val="num" w:pos="3240"/>
+        </w:tabs>
+        <w:ind w:left="3240" w:hanging="360"/>
       </w:pPr>
       <w:rPr>
         <w:rFonts w:ascii="Symbol" w:hAnsi="Symbol" w:hint="default"/>
       </w:rPr>
     </w:lvl>
   </w:abstractNum>
-  <w:abstractNum w:abstractNumId="14">
-    <w:nsid w:val="E65CEDF5"/>
-    <w:multiLevelType w:val="singleLevel"/>
-    <w:tmpl w:val="F3EAFDEC"/>
-    <w:lvl w:ilvl="0">
-      <w:start w:val="1"/>
-      <w:numFmt w:val="bullet"/>
-      <w:pStyle w:val="ListBullet3"/>
-      <w:lvlText w:val=""/>
-      <w:lvlJc w:val="left"/>
-      <w:pPr>
-        <w:tabs>
-          <w:tab w:val="num" w:pos="1080"/>
-        </w:tabs>
-        <w:ind w:left="1080" w:hanging="360"/>
-      </w:pPr>
-      <w:rPr>
-        <w:rFonts w:ascii="Symbol" w:hAnsi="Symbol" w:hint="default"/>
-      </w:rPr>
-    </w:lvl>
-  </w:abstractNum>
-  <w:abstractNum w:abstractNumId="15">
-    <w:nsid w:val="34B7D2E6"/>
-    <w:multiLevelType w:val="singleLevel"/>
+  <w:abstractNum w:abstractNumId="11">
+    <w:nsid w:val="6EF391C5"/>
+    <w:multiLevelType w:val="multilevel"/>
     <w:tmpl w:val="29761A62"/>
     <w:lvl w:ilvl="0">
       <w:start w:val="1"/>
       <w:numFmt w:val="bullet"/>
       <w:pStyle w:val="ListBullet"/>
+      <w:pStyle w:val="ListBullet"/>
       <w:lvlText w:val=""/>
       <w:lvlJc w:val="left"/>
       <w:pPr>
@@ -5302,15 +6042,152 @@
         <w:rFonts w:ascii="Symbol" w:hAnsi="Symbol" w:hint="default"/>
       </w:rPr>
     </w:lvl>
+    <w:lvl w:ilvl="1">
+      <w:start w:val="1"/>
+      <w:numFmt w:val="bullet"/>
+      <w:pStyle w:val="ListBullet2"/>
+      <w:pStyle w:val="ListBullet"/>
+      <w:lvlText w:val=""/>
+      <w:lvlJc w:val="left"/>
+      <w:pPr>
+        <w:tabs>
+          <w:tab w:val="num" w:pos="720"/>
+        </w:tabs>
+        <w:ind w:left="720" w:hanging="360"/>
+      </w:pPr>
+      <w:rPr>
+        <w:rFonts w:ascii="Symbol" w:hAnsi="Symbol" w:hint="default"/>
+      </w:rPr>
+    </w:lvl>
+    <w:lvl w:ilvl="2">
+      <w:start w:val="1"/>
+      <w:numFmt w:val="bullet"/>
+      <w:pStyle w:val="ListBullet3"/>
+      <w:pStyle w:val="ListBullet"/>
+      <w:lvlText w:val=""/>
+      <w:lvlJc w:val="left"/>
+      <w:pPr>
+        <w:tabs>
+          <w:tab w:val="num" w:pos="1080"/>
+        </w:tabs>
+        <w:ind w:left="1080" w:hanging="360"/>
+      </w:pPr>
+      <w:rPr>
+        <w:rFonts w:ascii="Symbol" w:hAnsi="Symbol" w:hint="default"/>
+      </w:rPr>
+    </w:lvl>
+    <w:lvl w:ilvl="3">
+      <w:start w:val="1"/>
+      <w:numFmt w:val="bullet"/>
+      <w:pStyle w:val="ListBullet4"/>
+      <w:pStyle w:val="ListBullet"/>
+      <w:lvlText w:val=""/>
+      <w:lvlJc w:val="left"/>
+      <w:pPr>
+        <w:tabs>
+          <w:tab w:val="num" w:pos="1440"/>
+        </w:tabs>
+        <w:ind w:left="1440" w:hanging="360"/>
+      </w:pPr>
+      <w:rPr>
+        <w:rFonts w:ascii="Symbol" w:hAnsi="Symbol" w:hint="default"/>
+      </w:rPr>
+    </w:lvl>
+    <w:lvl w:ilvl="4">
+      <w:start w:val="1"/>
+      <w:numFmt w:val="bullet"/>
+      <w:pStyle w:val="ListBullet5"/>
+      <w:pStyle w:val="ListBullet"/>
+      <w:lvlText w:val=""/>
+      <w:lvlJc w:val="left"/>
+      <w:pPr>
+        <w:tabs>
+          <w:tab w:val="num" w:pos="1800"/>
+        </w:tabs>
+        <w:ind w:left="1800" w:hanging="360"/>
+      </w:pPr>
+      <w:rPr>
+        <w:rFonts w:ascii="Symbol" w:hAnsi="Symbol" w:hint="default"/>
+      </w:rPr>
+    </w:lvl>
+    <w:lvl w:ilvl="5">
+      <w:start w:val="1"/>
+      <w:numFmt w:val="bullet"/>
+      <w:pStyle w:val="ListBullet6"/>
+      <w:pStyle w:val="ListBullet"/>
+      <w:lvlText w:val=""/>
+      <w:lvlJc w:val="left"/>
+      <w:pPr>
+        <w:tabs>
+          <w:tab w:val="num" w:pos="2160"/>
+        </w:tabs>
+        <w:ind w:left="2160" w:hanging="360"/>
+      </w:pPr>
+      <w:rPr>
+        <w:rFonts w:ascii="Symbol" w:hAnsi="Symbol" w:hint="default"/>
+      </w:rPr>
+    </w:lvl>
+    <w:lvl w:ilvl="6">
+      <w:start w:val="1"/>
+      <w:numFmt w:val="bullet"/>
+      <w:pStyle w:val="ListBullet7"/>
+      <w:pStyle w:val="ListBullet"/>
+      <w:lvlText w:val=""/>
+      <w:lvlJc w:val="left"/>
+      <w:pPr>
+        <w:tabs>
+          <w:tab w:val="num" w:pos="2520"/>
+        </w:tabs>
+        <w:ind w:left="2520" w:hanging="360"/>
+      </w:pPr>
+      <w:rPr>
+        <w:rFonts w:ascii="Symbol" w:hAnsi="Symbol" w:hint="default"/>
+      </w:rPr>
+    </w:lvl>
+    <w:lvl w:ilvl="7">
+      <w:start w:val="1"/>
+      <w:numFmt w:val="bullet"/>
+      <w:pStyle w:val="ListBullet8"/>
+      <w:pStyle w:val="ListBullet"/>
+      <w:lvlText w:val=""/>
+      <w:lvlJc w:val="left"/>
+      <w:pPr>
+        <w:tabs>
+          <w:tab w:val="num" w:pos="2880"/>
+        </w:tabs>
+        <w:ind w:left="2880" w:hanging="360"/>
+      </w:pPr>
+      <w:rPr>
+        <w:rFonts w:ascii="Symbol" w:hAnsi="Symbol" w:hint="default"/>
+      </w:rPr>
+    </w:lvl>
+    <w:lvl w:ilvl="8">
+      <w:start w:val="1"/>
+      <w:numFmt w:val="bullet"/>
+      <w:pStyle w:val="ListBullet9"/>
+      <w:pStyle w:val="ListBullet"/>
+      <w:lvlText w:val=""/>
+      <w:lvlJc w:val="left"/>
+      <w:pPr>
+        <w:tabs>
+          <w:tab w:val="num" w:pos="3240"/>
+        </w:tabs>
+        <w:ind w:left="3240" w:hanging="360"/>
+      </w:pPr>
+      <w:rPr>
+        <w:rFonts w:ascii="Symbol" w:hAnsi="Symbol" w:hint="default"/>
+      </w:rPr>
+    </w:lvl>
   </w:abstractNum>
-  <w:abstractNum w:abstractNumId="16">
-    <w:nsid w:val="E2F40EBC"/>
-    <w:multiLevelType w:val="singleLevel"/>
+  <w:abstractNum w:abstractNumId="12">
+    <w:nsid w:val="2BCCD67A"/>
+    <w:multiLevelType w:val="multilevel"/>
     <w:tmpl w:val="D0A62B40"/>
     <w:lvl w:ilvl="0">
       <w:start w:val="1"/>
       <w:numFmt w:val="decimal"/>
       <w:pStyle w:val="ListNumber"/>
+      <w:pStyle w:val="ListNumber"/>
       <w:lvlText w:val="%1."/>
       <w:lvlJc w:val="left"/>
       <w:pPr>
@@ -5320,15 +6197,128 @@
         <w:ind w:left="360" w:hanging="360"/>
       </w:pPr>
     </w:lvl>
+    <w:lvl w:ilvl="1">
+      <w:start w:val="1"/>
+      <w:numFmt w:val="lowerLetter"/>
+      <w:pStyle w:val="ListNumber2"/>
+      <w:pStyle w:val="ListNumber"/>
+      <w:lvlText w:val="%2."/>
+      <w:lvlJc w:val="left"/>
+      <w:pPr>
+        <w:tabs>
+          <w:tab w:val="num" w:pos="720"/>
+        </w:tabs>
+        <w:ind w:left="720" w:hanging="360"/>
+      </w:pPr>
+    </w:lvl>
+    <w:lvl w:ilvl="2">
+      <w:start w:val="1"/>
+      <w:numFmt w:val="lowerRoman"/>
+      <w:pStyle w:val="ListNumber3"/>
+      <w:pStyle w:val="ListNumber"/>
+      <w:lvlText w:val="%3."/>
+      <w:lvlJc w:val="left"/>
+      <w:pPr>
+        <w:tabs>
+          <w:tab w:val="num" w:pos="1080"/>
+        </w:tabs>
+        <w:ind w:left="1080" w:hanging="360"/>
+      </w:pPr>
+    </w:lvl>
+    <w:lvl w:ilvl="3">
+      <w:start w:val="1"/>
+      <w:numFmt w:val="decimal"/>
+      <w:pStyle w:val="ListNumber4"/>
+      <w:pStyle w:val="ListNumber"/>
+      <w:lvlText w:val="%4."/>
+      <w:lvlJc w:val="left"/>
+      <w:pPr>
+        <w:tabs>
+          <w:tab w:val="num" w:pos="1440"/>
+        </w:tabs>
+        <w:ind w:left="1440" w:hanging="360"/>
+      </w:pPr>
+    </w:lvl>
+    <w:lvl w:ilvl="4">
+      <w:start w:val="1"/>
+      <w:numFmt w:val="lowerLetter"/>
+      <w:pStyle w:val="ListNumber5"/>
+      <w:pStyle w:val="ListNumber"/>
+      <w:lvlText w:val="%5."/>
+      <w:lvlJc w:val="left"/>
+      <w:pPr>
+        <w:tabs>
+          <w:tab w:val="num" w:pos="1800"/>
+        </w:tabs>
+        <w:ind w:left="1800" w:hanging="360"/>
+      </w:pPr>
+    </w:lvl>
+    <w:lvl w:ilvl="5">
+      <w:start w:val="1"/>
+      <w:numFmt w:val="lowerRoman"/>
+      <w:pStyle w:val="ListNumber6"/>
+      <w:pStyle w:val="ListNumber"/>
+      <w:lvlText w:val="%6."/>
+      <w:lvlJc w:val="left"/>
+      <w:pPr>
+        <w:tabs>
+          <w:tab w:val="num" w:pos="2160"/>
+        </w:tabs>
+        <w:ind w:left="2160" w:hanging="360"/>
+      </w:pPr>
+    </w:lvl>
+    <w:lvl w:ilvl="6">
+      <w:start w:val="1"/>
+      <w:numFmt w:val="decimal"/>
+      <w:pStyle w:val="ListNumber7"/>
+      <w:pStyle w:val="ListNumber"/>
+      <w:lvlText w:val="%7."/>
+      <w:lvlJc w:val="left"/>
+      <w:pPr>
+        <w:tabs>
+          <w:tab w:val="num" w:pos="2520"/>
+        </w:tabs>
+        <w:ind w:left="2520" w:hanging="360"/>
+      </w:pPr>
+    </w:lvl>
+    <w:lvl w:ilvl="7">
+      <w:start w:val="1"/>
+      <w:numFmt w:val="lowerLetter"/>
+      <w:pStyle w:val="ListNumber8"/>
+      <w:pStyle w:val="ListNumber"/>
+      <w:lvlText w:val="%8."/>
+      <w:lvlJc w:val="left"/>
+      <w:pPr>
+        <w:tabs>
+          <w:tab w:val="num" w:pos="2880"/>
+        </w:tabs>
+        <w:ind w:left="2880" w:hanging="360"/>
+      </w:pPr>
+    </w:lvl>
+    <w:lvl w:ilvl="8">
+      <w:start w:val="1"/>
+      <w:numFmt w:val="lowerRoman"/>
+      <w:pStyle w:val="ListNumber9"/>
+      <w:pStyle w:val="ListNumber"/>
+      <w:lvlText w:val="%9."/>
+      <w:lvlJc w:val="left"/>
+      <w:pPr>
+        <w:tabs>
+          <w:tab w:val="num" w:pos="3240"/>
+        </w:tabs>
+        <w:ind w:left="3240" w:hanging="360"/>
+      </w:pPr>
+    </w:lvl>
   </w:abstractNum>
-  <w:abstractNum w:abstractNumId="17">
-    <w:nsid w:val="9D0AF909"/>
-    <w:multiLevelType w:val="singleLevel"/>
+  <w:abstractNum w:abstractNumId="13">
+    <w:nsid w:val="83459BBD"/>
+    <w:multiLevelType w:val="multilevel"/>
     <w:tmpl w:val="D0A62B40"/>
     <w:lvl w:ilvl="0">
       <w:start w:val="1"/>
       <w:numFmt w:val="decimal"/>
       <w:pStyle w:val="ListNumber"/>
+      <w:pStyle w:val="ListNumber"/>
       <w:lvlText w:val="%1."/>
       <w:lvlJc w:val="left"/>
       <w:pPr>
@@ -5338,15 +6328,128 @@
         <w:ind w:left="360" w:hanging="360"/>
       </w:pPr>
     </w:lvl>
+    <w:lvl w:ilvl="1">
+      <w:start w:val="1"/>
+      <w:numFmt w:val="lowerLetter"/>
+      <w:pStyle w:val="ListNumber2"/>
+      <w:pStyle w:val="ListNumber"/>
+      <w:lvlText w:val="%2."/>
+      <w:lvlJc w:val="left"/>
+      <w:pPr>
+        <w:tabs>
+          <w:tab w:val="num" w:pos="720"/>
+        </w:tabs>
+        <w:ind w:left="720" w:hanging="360"/>
+      </w:pPr>
+    </w:lvl>
+    <w:lvl w:ilvl="2">
+      <w:start w:val="1"/>
+      <w:numFmt w:val="lowerRoman"/>
+      <w:pStyle w:val="ListNumber3"/>
+      <w:pStyle w:val="ListNumber"/>
+      <w:lvlText w:val="%3."/>
+      <w:lvlJc w:val="left"/>
+      <w:pPr>
+        <w:tabs>
+          <w:tab w:val="num" w:pos="1080"/>
+        </w:tabs>
+        <w:ind w:left="1080" w:hanging="360"/>
+      </w:pPr>
+    </w:lvl>
+    <w:lvl w:ilvl="3">
+      <w:start w:val="1"/>
+      <w:numFmt w:val="decimal"/>
+      <w:pStyle w:val="ListNumber4"/>
+      <w:pStyle w:val="ListNumber"/>
+      <w:lvlText w:val="%4."/>
+      <w:lvlJc w:val="left"/>
+      <w:pPr>
+        <w:tabs>
+          <w:tab w:val="num" w:pos="1440"/>
+        </w:tabs>
+        <w:ind w:left="1440" w:hanging="360"/>
+      </w:pPr>
+    </w:lvl>
+    <w:lvl w:ilvl="4">
+      <w:start w:val="1"/>
+      <w:numFmt w:val="lowerLetter"/>
+      <w:pStyle w:val="ListNumber5"/>
+      <w:pStyle w:val="ListNumber"/>
+      <w:lvlText w:val="%5."/>
+      <w:lvlJc w:val="left"/>
+      <w:pPr>
+        <w:tabs>
+          <w:tab w:val="num" w:pos="1800"/>
+        </w:tabs>
+        <w:ind w:left="1800" w:hanging="360"/>
+      </w:pPr>
+    </w:lvl>
+    <w:lvl w:ilvl="5">
+      <w:start w:val="1"/>
+      <w:numFmt w:val="lowerRoman"/>
+      <w:pStyle w:val="ListNumber6"/>
+      <w:pStyle w:val="ListNumber"/>
+      <w:lvlText w:val="%6."/>
+      <w:lvlJc w:val="left"/>
+      <w:pPr>
+        <w:tabs>
+          <w:tab w:val="num" w:pos="2160"/>
+        </w:tabs>
+        <w:ind w:left="2160" w:hanging="360"/>
+      </w:pPr>
+    </w:lvl>
+    <w:lvl w:ilvl="6">
+      <w:start w:val="1"/>
+      <w:numFmt w:val="decimal"/>
+      <w:pStyle w:val="ListNumber7"/>
+      <w:pStyle w:val="ListNumber"/>
+      <w:lvlText w:val="%7."/>
+      <w:lvlJc w:val="left"/>
+      <w:pPr>
+        <w:tabs>
+          <w:tab w:val="num" w:pos="2520"/>
+        </w:tabs>
+        <w:ind w:left="2520" w:hanging="360"/>
+      </w:pPr>
+    </w:lvl>
+    <w:lvl w:ilvl="7">
+      <w:start w:val="1"/>
+      <w:numFmt w:val="lowerLetter"/>
+      <w:pStyle w:val="ListNumber8"/>
+      <w:pStyle w:val="ListNumber"/>
+      <w:lvlText w:val="%8."/>
+      <w:lvlJc w:val="left"/>
+      <w:pPr>
+        <w:tabs>
+          <w:tab w:val="num" w:pos="2880"/>
+        </w:tabs>
+        <w:ind w:left="2880" w:hanging="360"/>
+      </w:pPr>
+    </w:lvl>
+    <w:lvl w:ilvl="8">
+      <w:start w:val="1"/>
+      <w:numFmt w:val="lowerRoman"/>
+      <w:pStyle w:val="ListNumber9"/>
+      <w:pStyle w:val="ListNumber"/>
+      <w:lvlText w:val="%9."/>
+      <w:lvlJc w:val="left"/>
+      <w:pPr>
+        <w:tabs>
+          <w:tab w:val="num" w:pos="3240"/>
+        </w:tabs>
+        <w:ind w:left="3240" w:hanging="360"/>
+      </w:pPr>
+    </w:lvl>
   </w:abstractNum>
-  <w:abstractNum w:abstractNumId="18">
-    <w:nsid w:val="88B1E55F"/>
-    <w:multiLevelType w:val="singleLevel"/>
+  <w:abstractNum w:abstractNumId="14">
+    <w:nsid w:val="034748F2"/>
+    <w:multiLevelType w:val="multilevel"/>
     <w:tmpl w:val="29761A62"/>
     <w:lvl w:ilvl="0">
       <w:start w:val="1"/>
       <w:numFmt w:val="bullet"/>
       <w:pStyle w:val="ListBullet"/>
+      <w:pStyle w:val="ListBullet"/>
       <w:lvlText w:val=""/>
       <w:lvlJc w:val="left"/>
       <w:pPr>
@@ -5359,15 +6462,11 @@
         <w:rFonts w:ascii="Symbol" w:hAnsi="Symbol" w:hint="default"/>
       </w:rPr>
     </w:lvl>
-  </w:abstractNum>
-  <w:abstractNum w:abstractNumId="19">
-    <w:nsid w:val="F138A6C4"/>
-    <w:multiLevelType w:val="singleLevel"/>
-    <w:tmpl w:val="3D1EFFD4"/>
-    <w:lvl w:ilvl="0">
+    <w:lvl w:ilvl="1">
       <w:start w:val="1"/>
       <w:numFmt w:val="bullet"/>
       <w:pStyle w:val="ListBullet2"/>
+      <w:pStyle w:val="ListBullet"/>
       <w:lvlText w:val=""/>
       <w:lvlJc w:val="left"/>
       <w:pPr>
@@ -5380,15 +6479,11 @@
         <w:rFonts w:ascii="Symbol" w:hAnsi="Symbol" w:hint="default"/>
       </w:rPr>
     </w:lvl>
-  </w:abstractNum>
-  <w:abstractNum w:abstractNumId="20">
-    <w:nsid w:val="65AA5F6F"/>
-    <w:multiLevelType w:val="singleLevel"/>
-    <w:tmpl w:val="F3EAFDEC"/>
-    <w:lvl w:ilvl="0">
+    <w:lvl w:ilvl="2">
       <w:start w:val="1"/>
       <w:numFmt w:val="bullet"/>
       <w:pStyle w:val="ListBullet3"/>
+      <w:pStyle w:val="ListBullet"/>
       <w:lvlText w:val=""/>
       <w:lvlJc w:val="left"/>
       <w:pPr>
@@ -5401,15 +6496,118 @@
         <w:rFonts w:ascii="Symbol" w:hAnsi="Symbol" w:hint="default"/>
       </w:rPr>
     </w:lvl>
+    <w:lvl w:ilvl="3">
+      <w:start w:val="1"/>
+      <w:numFmt w:val="bullet"/>
+      <w:pStyle w:val="ListBullet4"/>
+      <w:pStyle w:val="ListBullet"/>
+      <w:lvlText w:val=""/>
+      <w:lvlJc w:val="left"/>
+      <w:pPr>
+        <w:tabs>
+          <w:tab w:val="num" w:pos="1440"/>
+        </w:tabs>
+        <w:ind w:left="1440" w:hanging="360"/>
+      </w:pPr>
+      <w:rPr>
+        <w:rFonts w:ascii="Symbol" w:hAnsi="Symbol" w:hint="default"/>
+      </w:rPr>
+    </w:lvl>
+    <w:lvl w:ilvl="4">
+      <w:start w:val="1"/>
+      <w:numFmt w:val="bullet"/>
+      <w:pStyle w:val="ListBullet5"/>
+      <w:pStyle w:val="ListBullet"/>
+      <w:lvlText w:val=""/>
+      <w:lvlJc w:val="left"/>
+      <w:pPr>
+        <w:tabs>
+          <w:tab w:val="num" w:pos="1800"/>
+        </w:tabs>
+        <w:ind w:left="1800" w:hanging="360"/>
+      </w:pPr>
+      <w:rPr>
+        <w:rFonts w:ascii="Symbol" w:hAnsi="Symbol" w:hint="default"/>
+      </w:rPr>
+    </w:lvl>
+    <w:lvl w:ilvl="5">
+      <w:start w:val="1"/>
+      <w:numFmt w:val="bullet"/>
+      <w:pStyle w:val="ListBullet6"/>
+      <w:pStyle w:val="ListBullet"/>
+      <w:lvlText w:val=""/>
+      <w:lvlJc w:val="left"/>
+      <w:pPr>
+        <w:tabs>
+          <w:tab w:val="num" w:pos="2160"/>
+        </w:tabs>
+        <w:ind w:left="2160" w:hanging="360"/>
+      </w:pPr>
+      <w:rPr>
+        <w:rFonts w:ascii="Symbol" w:hAnsi="Symbol" w:hint="default"/>
+      </w:rPr>
+    </w:lvl>
+    <w:lvl w:ilvl="6">
+      <w:start w:val="1"/>
+      <w:numFmt w:val="bullet"/>
+      <w:pStyle w:val="ListBullet7"/>
+      <w:pStyle w:val="ListBullet"/>
+      <w:lvlText w:val=""/>
+      <w:lvlJc w:val="left"/>
+      <w:pPr>
+        <w:tabs>
+          <w:tab w:val="num" w:pos="2520"/>
+        </w:tabs>
+        <w:ind w:left="2520" w:hanging="360"/>
+      </w:pPr>
+      <w:rPr>
+        <w:rFonts w:ascii="Symbol" w:hAnsi="Symbol" w:hint="default"/>
+      </w:rPr>
+    </w:lvl>
+    <w:lvl w:ilvl="7">
+      <w:start w:val="1"/>
+      <w:numFmt w:val="bullet"/>
+      <w:pStyle w:val="ListBullet8"/>
+      <w:pStyle w:val="ListBullet"/>
+      <w:lvlText w:val=""/>
+      <w:lvlJc w:val="left"/>
+      <w:pPr>
+        <w:tabs>
+          <w:tab w:val="num" w:pos="2880"/>
+        </w:tabs>
+        <w:ind w:left="2880" w:hanging="360"/>
+      </w:pPr>
+      <w:rPr>
+        <w:rFonts w:ascii="Symbol" w:hAnsi="Symbol" w:hint="default"/>
+      </w:rPr>
+    </w:lvl>
+    <w:lvl w:ilvl="8">
+      <w:start w:val="1"/>
+      <w:numFmt w:val="bullet"/>
+      <w:pStyle w:val="ListBullet9"/>
+      <w:pStyle w:val="ListBullet"/>
+      <w:lvlText w:val=""/>
+      <w:lvlJc w:val="left"/>
+      <w:pPr>
+        <w:tabs>
+          <w:tab w:val="num" w:pos="3240"/>
+        </w:tabs>
+        <w:ind w:left="3240" w:hanging="360"/>
+      </w:pPr>
+      <w:rPr>
+        <w:rFonts w:ascii="Symbol" w:hAnsi="Symbol" w:hint="default"/>
+      </w:rPr>
+    </w:lvl>
   </w:abstractNum>
-  <w:abstractNum w:abstractNumId="21">
-    <w:nsid w:val="8FCF2988"/>
-    <w:multiLevelType w:val="singleLevel"/>
+  <w:abstractNum w:abstractNumId="15">
+    <w:nsid w:val="BB719544"/>
+    <w:multiLevelType w:val="multilevel"/>
     <w:tmpl w:val="D0A62B40"/>
     <w:lvl w:ilvl="0">
       <w:start w:val="1"/>
       <w:numFmt w:val="decimal"/>
       <w:pStyle w:val="ListNumber"/>
+      <w:pStyle w:val="ListNumber"/>
       <w:lvlText w:val="%1."/>
       <w:lvlJc w:val="left"/>
       <w:pPr>
@@ -5419,16 +6617,12 @@
         <w:ind w:left="360" w:hanging="360"/>
       </w:pPr>
     </w:lvl>
-  </w:abstractNum>
-  <w:abstractNum w:abstractNumId="22">
-    <w:nsid w:val="CA5B9F84"/>
-    <w:multiLevelType w:val="singleLevel"/>
-    <w:tmpl w:val="38441652"/>
-    <w:lvl w:ilvl="0">
+    <w:lvl w:ilvl="1">
       <w:start w:val="1"/>
-      <w:numFmt w:val="decimal"/>
+      <w:numFmt w:val="lowerLetter"/>
       <w:pStyle w:val="ListNumber2"/>
-      <w:lvlText w:val="%1."/>
+      <w:pStyle w:val="ListNumber"/>
+      <w:lvlText w:val="%2."/>
       <w:lvlJc w:val="left"/>
       <w:pPr>
         <w:tabs>
@@ -5437,16 +6631,12 @@
         <w:ind w:left="720" w:hanging="360"/>
       </w:pPr>
     </w:lvl>
-  </w:abstractNum>
-  <w:abstractNum w:abstractNumId="23">
-    <w:nsid w:val="38EE60B8"/>
-    <w:multiLevelType w:val="singleLevel"/>
-    <w:tmpl w:val="FB12693A"/>
-    <w:lvl w:ilvl="0">
+    <w:lvl w:ilvl="2">
       <w:start w:val="1"/>
-      <w:numFmt w:val="decimal"/>
+      <w:numFmt w:val="lowerRoman"/>
       <w:pStyle w:val="ListNumber3"/>
-      <w:lvlText w:val="%1."/>
+      <w:pStyle w:val="ListNumber"/>
+      <w:lvlText w:val="%3."/>
       <w:lvlJc w:val="left"/>
       <w:pPr>
         <w:tabs>
@@ -5455,15 +6645,100 @@
         <w:ind w:left="1080" w:hanging="360"/>
       </w:pPr>
     </w:lvl>
+    <w:lvl w:ilvl="3">
+      <w:start w:val="1"/>
+      <w:numFmt w:val="decimal"/>
+      <w:pStyle w:val="ListNumber4"/>
+      <w:pStyle w:val="ListNumber"/>
+      <w:lvlText w:val="%4."/>
+      <w:lvlJc w:val="left"/>
+      <w:pPr>
+        <w:tabs>
+          <w:tab w:val="num" w:pos="1440"/>
+        </w:tabs>
+        <w:ind w:left="1440" w:hanging="360"/>
+      </w:pPr>
+    </w:lvl>
+    <w:lvl w:ilvl="4">
+      <w:start w:val="1"/>
+      <w:numFmt w:val="lowerLetter"/>
+      <w:pStyle w:val="ListNumber5"/>
+      <w:pStyle w:val="ListNumber"/>
+      <w:lvlText w:val="%5."/>
+      <w:lvlJc w:val="left"/>
+      <w:pPr>
+        <w:tabs>
+          <w:tab w:val="num" w:pos="1800"/>
+        </w:tabs>
+        <w:ind w:left="1800" w:hanging="360"/>
+      </w:pPr>
+    </w:lvl>
+    <w:lvl w:ilvl="5">
+      <w:start w:val="1"/>
+      <w:numFmt w:val="lowerRoman"/>
+      <w:pStyle w:val="ListNumber6"/>
+      <w:pStyle w:val="ListNumber"/>
+      <w:lvlText w:val="%6."/>
+      <w:lvlJc w:val="left"/>
+      <w:pPr>
+        <w:tabs>
+          <w:tab w:val="num" w:pos="2160"/>
+        </w:tabs>
+        <w:ind w:left="2160" w:hanging="360"/>
+      </w:pPr>
+    </w:lvl>
+    <w:lvl w:ilvl="6">
+      <w:start w:val="1"/>
+      <w:numFmt w:val="decimal"/>
+      <w:pStyle w:val="ListNumber7"/>
+      <w:pStyle w:val="ListNumber"/>
+      <w:lvlText w:val="%7."/>
+      <w:lvlJc w:val="left"/>
+      <w:pPr>
+        <w:tabs>
+          <w:tab w:val="num" w:pos="2520"/>
+        </w:tabs>
+        <w:ind w:left="2520" w:hanging="360"/>
+      </w:pPr>
+    </w:lvl>
+    <w:lvl w:ilvl="7">
+      <w:start w:val="1"/>
+      <w:numFmt w:val="lowerLetter"/>
+      <w:pStyle w:val="ListNumber8"/>
+      <w:pStyle w:val="ListNumber"/>
+      <w:lvlText w:val="%8."/>
+      <w:lvlJc w:val="left"/>
+      <w:pPr>
+        <w:tabs>
+          <w:tab w:val="num" w:pos="2880"/>
+        </w:tabs>
+        <w:ind w:left="2880" w:hanging="360"/>
+      </w:pPr>
+    </w:lvl>
+    <w:lvl w:ilvl="8">
+      <w:start w:val="1"/>
+      <w:numFmt w:val="lowerRoman"/>
+      <w:pStyle w:val="ListNumber9"/>
+      <w:pStyle w:val="ListNumber"/>
+      <w:lvlText w:val="%9."/>
+      <w:lvlJc w:val="left"/>
+      <w:pPr>
+        <w:tabs>
+          <w:tab w:val="num" w:pos="3240"/>
+        </w:tabs>
+        <w:ind w:left="3240" w:hanging="360"/>
+      </w:pPr>
+    </w:lvl>
   </w:abstractNum>
-  <w:abstractNum w:abstractNumId="24">
-    <w:nsid w:val="A3373760"/>
-    <w:multiLevelType w:val="singleLevel"/>
+  <w:abstractNum w:abstractNumId="16">
+    <w:nsid w:val="D8050C04"/>
+    <w:multiLevelType w:val="multilevel"/>
     <w:tmpl w:val="29761A62"/>
     <w:lvl w:ilvl="0">
       <w:start w:val="1"/>
       <w:numFmt w:val="bullet"/>
       <w:pStyle w:val="ListBullet"/>
+      <w:pStyle w:val="ListBullet"/>
       <w:lvlText w:val=""/>
       <w:lvlJc w:val="left"/>
       <w:pPr>
@@ -5476,16 +6751,12 @@
         <w:rFonts w:ascii="Symbol" w:hAnsi="Symbol" w:hint="default"/>
       </w:rPr>
     </w:lvl>
-  </w:abstractNum>
-  <w:abstractNum w:abstractNumId="25">
-    <w:nsid w:val="EA852C65"/>
-    <w:multiLevelType w:val="singleLevel"/>
-    <w:tmpl w:val="38441652"/>
-    <w:lvl w:ilvl="0">
+    <w:lvl w:ilvl="1">
       <w:start w:val="1"/>
-      <w:numFmt w:val="decimal"/>
-      <w:pStyle w:val="ListNumber2"/>
-      <w:lvlText w:val="%1."/>
+      <w:numFmt w:val="bullet"/>
+      <w:pStyle w:val="ListBullet2"/>
+      <w:pStyle w:val="ListBullet"/>
+      <w:lvlText w:val=""/>
       <w:lvlJc w:val="left"/>
       <w:pPr>
         <w:tabs>
@@ -5493,17 +6764,16 @@
         </w:tabs>
         <w:ind w:left="720" w:hanging="360"/>
       </w:pPr>
+      <w:rPr>
+        <w:rFonts w:ascii="Symbol" w:hAnsi="Symbol" w:hint="default"/>
+      </w:rPr>
     </w:lvl>
-  </w:abstractNum>
-  <w:abstractNum w:abstractNumId="26">
-    <w:nsid w:val="4A033600"/>
-    <w:multiLevelType w:val="singleLevel"/>
-    <w:tmpl w:val="FB12693A"/>
-    <w:lvl w:ilvl="0">
+    <w:lvl w:ilvl="2">
       <w:start w:val="1"/>
-      <w:numFmt w:val="decimal"/>
-      <w:pStyle w:val="ListNumber3"/>
-      <w:lvlText w:val="%1."/>
+      <w:numFmt w:val="bullet"/>
+      <w:pStyle w:val="ListBullet3"/>
+      <w:pStyle w:val="ListBullet"/>
+      <w:lvlText w:val=""/>
       <w:lvlJc w:val="left"/>
       <w:pPr>
         <w:tabs>
@@ -5511,16 +6781,122 @@
         </w:tabs>
         <w:ind w:left="1080" w:hanging="360"/>
       </w:pPr>
+      <w:rPr>
+        <w:rFonts w:ascii="Symbol" w:hAnsi="Symbol" w:hint="default"/>
+      </w:rPr>
+    </w:lvl>
+    <w:lvl w:ilvl="3">
+      <w:start w:val="1"/>
+      <w:numFmt w:val="bullet"/>
+      <w:pStyle w:val="ListBullet4"/>
+      <w:pStyle w:val="ListBullet"/>
+      <w:lvlText w:val=""/>
+      <w:lvlJc w:val="left"/>
+      <w:pPr>
+        <w:tabs>
+          <w:tab w:val="num" w:pos="1440"/>
+        </w:tabs>
+        <w:ind w:left="1440" w:hanging="360"/>
+      </w:pPr>
+      <w:rPr>
+        <w:rFonts w:ascii="Symbol" w:hAnsi="Symbol" w:hint="default"/>
+      </w:rPr>
+    </w:lvl>
+    <w:lvl w:ilvl="4">
+      <w:start w:val="1"/>
+      <w:numFmt w:val="bullet"/>
+      <w:pStyle w:val="ListBullet5"/>
+      <w:pStyle w:val="ListBullet"/>
+      <w:lvlText w:val=""/>
+      <w:lvlJc w:val="left"/>
+      <w:pPr>
+        <w:tabs>
+          <w:tab w:val="num" w:pos="1800"/>
+        </w:tabs>
+        <w:ind w:left="1800" w:hanging="360"/>
+      </w:pPr>
+      <w:rPr>
+        <w:rFonts w:ascii="Symbol" w:hAnsi="Symbol" w:hint="default"/>
+      </w:rPr>
+    </w:lvl>
+    <w:lvl w:ilvl="5">
+      <w:start w:val="1"/>
+      <w:numFmt w:val="bullet"/>
+      <w:pStyle w:val="ListBullet6"/>
+      <w:pStyle w:val="ListBullet"/>
+      <w:lvlText w:val=""/>
+      <w:lvlJc w:val="left"/>
+      <w:pPr>
+        <w:tabs>
+          <w:tab w:val="num" w:pos="2160"/>
+        </w:tabs>
+        <w:ind w:left="2160" w:hanging="360"/>
+      </w:pPr>
+      <w:rPr>
+        <w:rFonts w:ascii="Symbol" w:hAnsi="Symbol" w:hint="default"/>
+      </w:rPr>
+    </w:lvl>
+    <w:lvl w:ilvl="6">
+      <w:start w:val="1"/>
+      <w:numFmt w:val="bullet"/>
+      <w:pStyle w:val="ListBullet7"/>
+      <w:pStyle w:val="ListBullet"/>
+      <w:lvlText w:val=""/>
+      <w:lvlJc w:val="left"/>
+      <w:pPr>
+        <w:tabs>
+          <w:tab w:val="num" w:pos="2520"/>
+        </w:tabs>
+        <w:ind w:left="2520" w:hanging="360"/>
+      </w:pPr>
+      <w:rPr>
+        <w:rFonts w:ascii="Symbol" w:hAnsi="Symbol" w:hint="default"/>
+      </w:rPr>
+    </w:lvl>
+    <w:lvl w:ilvl="7">
+      <w:start w:val="1"/>
+      <w:numFmt w:val="bullet"/>
+      <w:pStyle w:val="ListBullet8"/>
+      <w:pStyle w:val="ListBullet"/>
+      <w:lvlText w:val=""/>
+      <w:lvlJc w:val="left"/>
+      <w:pPr>
+        <w:tabs>
+          <w:tab w:val="num" w:pos="2880"/>
+        </w:tabs>
+        <w:ind w:left="2880" w:hanging="360"/>
+      </w:pPr>
+      <w:rPr>
+        <w:rFonts w:ascii="Symbol" w:hAnsi="Symbol" w:hint="default"/>
+      </w:rPr>
+    </w:lvl>
+    <w:lvl w:ilvl="8">
+      <w:start w:val="1"/>
+      <w:numFmt w:val="bullet"/>
+      <w:pStyle w:val="ListBullet9"/>
+      <w:pStyle w:val="ListBullet"/>
+      <w:lvlText w:val=""/>
+      <w:lvlJc w:val="left"/>
+      <w:pPr>
+        <w:tabs>
+          <w:tab w:val="num" w:pos="3240"/>
+        </w:tabs>
+        <w:ind w:left="3240" w:hanging="360"/>
+      </w:pPr>
+      <w:rPr>
+        <w:rFonts w:ascii="Symbol" w:hAnsi="Symbol" w:hint="default"/>
+      </w:rPr>
     </w:lvl>
   </w:abstractNum>
-  <w:abstractNum w:abstractNumId="27">
-    <w:nsid w:val="6797F3EB"/>
-    <w:multiLevelType w:val="singleLevel"/>
+  <w:abstractNum w:abstractNumId="17">
+    <w:nsid w:val="C804C71A"/>
+    <w:multiLevelType w:val="multilevel"/>
     <w:tmpl w:val="D0A62B40"/>
     <w:lvl w:ilvl="0">
       <w:start w:val="1"/>
       <w:numFmt w:val="decimal"/>
       <w:pStyle w:val="ListNumber"/>
+      <w:pStyle w:val="ListNumber"/>
       <w:lvlText w:val="%1."/>
       <w:lvlJc w:val="left"/>
       <w:pPr>
@@ -5530,16 +6906,12 @@
         <w:ind w:left="360" w:hanging="360"/>
       </w:pPr>
     </w:lvl>
-  </w:abstractNum>
-  <w:abstractNum w:abstractNumId="28">
-    <w:nsid w:val="0EA873B3"/>
-    <w:multiLevelType w:val="singleLevel"/>
-    <w:tmpl w:val="3D1EFFD4"/>
-    <w:lvl w:ilvl="0">
+    <w:lvl w:ilvl="1">
       <w:start w:val="1"/>
-      <w:numFmt w:val="bullet"/>
-      <w:pStyle w:val="ListBullet2"/>
-      <w:lvlText w:val=""/>
+      <w:numFmt w:val="lowerLetter"/>
+      <w:pStyle w:val="ListNumber2"/>
+      <w:pStyle w:val="ListNumber"/>
+      <w:lvlText w:val="%2."/>
       <w:lvlJc w:val="left"/>
       <w:pPr>
         <w:tabs>
@@ -5547,20 +6919,13 @@
         </w:tabs>
         <w:ind w:left="720" w:hanging="360"/>
       </w:pPr>
-      <w:rPr>
-        <w:rFonts w:ascii="Symbol" w:hAnsi="Symbol" w:hint="default"/>
-      </w:rPr>
     </w:lvl>
-  </w:abstractNum>
-  <w:abstractNum w:abstractNumId="29">
-    <w:nsid w:val="D2F98BE4"/>
-    <w:multiLevelType w:val="singleLevel"/>
-    <w:tmpl w:val="F3EAFDEC"/>
-    <w:lvl w:ilvl="0">
+    <w:lvl w:ilvl="2">
       <w:start w:val="1"/>
-      <w:numFmt w:val="bullet"/>
-      <w:pStyle w:val="ListBullet3"/>
-      <w:lvlText w:val=""/>
+      <w:numFmt w:val="lowerRoman"/>
+      <w:pStyle w:val="ListNumber3"/>
+      <w:pStyle w:val="ListNumber"/>
+      <w:lvlText w:val="%3."/>
       <w:lvlJc w:val="left"/>
       <w:pPr>
         <w:tabs>
@@ -5568,19 +6933,101 @@
         </w:tabs>
         <w:ind w:left="1080" w:hanging="360"/>
       </w:pPr>
-      <w:rPr>
-        <w:rFonts w:ascii="Symbol" w:hAnsi="Symbol" w:hint="default"/>
-      </w:rPr>
+    </w:lvl>
+    <w:lvl w:ilvl="3">
+      <w:start w:val="1"/>
+      <w:numFmt w:val="decimal"/>
+      <w:pStyle w:val="ListNumber4"/>
+      <w:pStyle w:val="ListNumber"/>
+      <w:lvlText w:val="%4."/>
+      <w:lvlJc w:val="left"/>
+      <w:pPr>
+        <w:tabs>
+          <w:tab w:val="num" w:pos="1440"/>
+        </w:tabs>
+        <w:ind w:left="1440" w:hanging="360"/>
+      </w:pPr>
+    </w:lvl>
+    <w:lvl w:ilvl="4">
+      <w:start w:val="1"/>
+      <w:numFmt w:val="lowerLetter"/>
+      <w:pStyle w:val="ListNumber5"/>
+      <w:pStyle w:val="ListNumber"/>
+      <w:lvlText w:val="%5."/>
+      <w:lvlJc w:val="left"/>
+      <w:pPr>
+        <w:tabs>
+          <w:tab w:val="num" w:pos="1800"/>
+        </w:tabs>
+        <w:ind w:left="1800" w:hanging="360"/>
+      </w:pPr>
+    </w:lvl>
+    <w:lvl w:ilvl="5">
+      <w:start w:val="1"/>
+      <w:numFmt w:val="lowerRoman"/>
+      <w:pStyle w:val="ListNumber6"/>
+      <w:pStyle w:val="ListNumber"/>
+      <w:lvlText w:val="%6."/>
+      <w:lvlJc w:val="left"/>
+      <w:pPr>
+        <w:tabs>
+          <w:tab w:val="num" w:pos="2160"/>
+        </w:tabs>
+        <w:ind w:left="2160" w:hanging="360"/>
+      </w:pPr>
+    </w:lvl>
+    <w:lvl w:ilvl="6">
+      <w:start w:val="1"/>
+      <w:numFmt w:val="decimal"/>
+      <w:pStyle w:val="ListNumber7"/>
+      <w:pStyle w:val="ListNumber"/>
+      <w:lvlText w:val="%7."/>
+      <w:lvlJc w:val="left"/>
+      <w:pPr>
+        <w:tabs>
+          <w:tab w:val="num" w:pos="2520"/>
+        </w:tabs>
+        <w:ind w:left="2520" w:hanging="360"/>
+      </w:pPr>
+    </w:lvl>
+    <w:lvl w:ilvl="7">
+      <w:start w:val="1"/>
+      <w:numFmt w:val="lowerLetter"/>
+      <w:pStyle w:val="ListNumber8"/>
+      <w:pStyle w:val="ListNumber"/>
+      <w:lvlText w:val="%8."/>
+      <w:lvlJc w:val="left"/>
+      <w:pPr>
+        <w:tabs>
+          <w:tab w:val="num" w:pos="2880"/>
+        </w:tabs>
+        <w:ind w:left="2880" w:hanging="360"/>
+      </w:pPr>
+    </w:lvl>
+    <w:lvl w:ilvl="8">
+      <w:start w:val="1"/>
+      <w:numFmt w:val="lowerRoman"/>
+      <w:pStyle w:val="ListNumber9"/>
+      <w:pStyle w:val="ListNumber"/>
+      <w:lvlText w:val="%9."/>
+      <w:lvlJc w:val="left"/>
+      <w:pPr>
+        <w:tabs>
+          <w:tab w:val="num" w:pos="3240"/>
+        </w:tabs>
+        <w:ind w:left="3240" w:hanging="360"/>
+      </w:pPr>
     </w:lvl>
   </w:abstractNum>
-  <w:abstractNum w:abstractNumId="30">
-    <w:nsid w:val="16BE0678"/>
-    <w:multiLevelType w:val="singleLevel"/>
+  <w:abstractNum w:abstractNumId="18">
+    <w:nsid w:val="1F4C7AB7"/>
+    <w:multiLevelType w:val="multilevel"/>
     <w:tmpl w:val="D0A62B40"/>
     <w:lvl w:ilvl="0">
       <w:start w:val="1"/>
       <w:numFmt w:val="decimal"/>
       <w:pStyle w:val="ListNumber"/>
+      <w:pStyle w:val="ListNumber"/>
       <w:lvlText w:val="%1."/>
       <w:lvlJc w:val="left"/>
       <w:pPr>
@@ -5590,15 +7037,128 @@
         <w:ind w:left="360" w:hanging="360"/>
       </w:pPr>
     </w:lvl>
+    <w:lvl w:ilvl="1">
+      <w:start w:val="1"/>
+      <w:numFmt w:val="lowerLetter"/>
+      <w:pStyle w:val="ListNumber2"/>
+      <w:pStyle w:val="ListNumber"/>
+      <w:lvlText w:val="%2."/>
+      <w:lvlJc w:val="left"/>
+      <w:pPr>
+        <w:tabs>
+          <w:tab w:val="num" w:pos="720"/>
+        </w:tabs>
+        <w:ind w:left="720" w:hanging="360"/>
+      </w:pPr>
+    </w:lvl>
+    <w:lvl w:ilvl="2">
+      <w:start w:val="1"/>
+      <w:numFmt w:val="lowerRoman"/>
+      <w:pStyle w:val="ListNumber3"/>
+      <w:pStyle w:val="ListNumber"/>
+      <w:lvlText w:val="%3."/>
+      <w:lvlJc w:val="left"/>
+      <w:pPr>
+        <w:tabs>
+          <w:tab w:val="num" w:pos="1080"/>
+        </w:tabs>
+        <w:ind w:left="1080" w:hanging="360"/>
+      </w:pPr>
+    </w:lvl>
+    <w:lvl w:ilvl="3">
+      <w:start w:val="1"/>
+      <w:numFmt w:val="decimal"/>
+      <w:pStyle w:val="ListNumber4"/>
+      <w:pStyle w:val="ListNumber"/>
+      <w:lvlText w:val="%4."/>
+      <w:lvlJc w:val="left"/>
+      <w:pPr>
+        <w:tabs>
+          <w:tab w:val="num" w:pos="1440"/>
+        </w:tabs>
+        <w:ind w:left="1440" w:hanging="360"/>
+      </w:pPr>
+    </w:lvl>
+    <w:lvl w:ilvl="4">
+      <w:start w:val="1"/>
+      <w:numFmt w:val="lowerLetter"/>
+      <w:pStyle w:val="ListNumber5"/>
+      <w:pStyle w:val="ListNumber"/>
+      <w:lvlText w:val="%5."/>
+      <w:lvlJc w:val="left"/>
+      <w:pPr>
+        <w:tabs>
+          <w:tab w:val="num" w:pos="1800"/>
+        </w:tabs>
+        <w:ind w:left="1800" w:hanging="360"/>
+      </w:pPr>
+    </w:lvl>
+    <w:lvl w:ilvl="5">
+      <w:start w:val="1"/>
+      <w:numFmt w:val="lowerRoman"/>
+      <w:pStyle w:val="ListNumber6"/>
+      <w:pStyle w:val="ListNumber"/>
+      <w:lvlText w:val="%6."/>
+      <w:lvlJc w:val="left"/>
+      <w:pPr>
+        <w:tabs>
+          <w:tab w:val="num" w:pos="2160"/>
+        </w:tabs>
+        <w:ind w:left="2160" w:hanging="360"/>
+      </w:pPr>
+    </w:lvl>
+    <w:lvl w:ilvl="6">
+      <w:start w:val="1"/>
+      <w:numFmt w:val="decimal"/>
+      <w:pStyle w:val="ListNumber7"/>
+      <w:pStyle w:val="ListNumber"/>
+      <w:lvlText w:val="%7."/>
+      <w:lvlJc w:val="left"/>
+      <w:pPr>
+        <w:tabs>
+          <w:tab w:val="num" w:pos="2520"/>
+        </w:tabs>
+        <w:ind w:left="2520" w:hanging="360"/>
+      </w:pPr>
+    </w:lvl>
+    <w:lvl w:ilvl="7">
+      <w:start w:val="1"/>
+      <w:numFmt w:val="lowerLetter"/>
+      <w:pStyle w:val="ListNumber8"/>
+      <w:pStyle w:val="ListNumber"/>
+      <w:lvlText w:val="%8."/>
+      <w:lvlJc w:val="left"/>
+      <w:pPr>
+        <w:tabs>
+          <w:tab w:val="num" w:pos="2880"/>
+        </w:tabs>
+        <w:ind w:left="2880" w:hanging="360"/>
+      </w:pPr>
+    </w:lvl>
+    <w:lvl w:ilvl="8">
+      <w:start w:val="1"/>
+      <w:numFmt w:val="lowerRoman"/>
+      <w:pStyle w:val="ListNumber9"/>
+      <w:pStyle w:val="ListNumber"/>
+      <w:lvlText w:val="%9."/>
+      <w:lvlJc w:val="left"/>
+      <w:pPr>
+        <w:tabs>
+          <w:tab w:val="num" w:pos="3240"/>
+        </w:tabs>
+        <w:ind w:left="3240" w:hanging="360"/>
+      </w:pPr>
+    </w:lvl>
   </w:abstractNum>
-  <w:abstractNum w:abstractNumId="31">
-    <w:nsid w:val="667885A0"/>
-    <w:multiLevelType w:val="singleLevel"/>
+  <w:abstractNum w:abstractNumId="19">
+    <w:nsid w:val="E248A267"/>
+    <w:multiLevelType w:val="multilevel"/>
     <w:tmpl w:val="29761A62"/>
     <w:lvl w:ilvl="0">
       <w:start w:val="1"/>
       <w:numFmt w:val="bullet"/>
       <w:pStyle w:val="ListBullet"/>
+      <w:pStyle w:val="ListBullet"/>
       <w:lvlText w:val=""/>
       <w:lvlJc w:val="left"/>
       <w:pPr>
@@ -5611,15 +7171,152 @@
         <w:rFonts w:ascii="Symbol" w:hAnsi="Symbol" w:hint="default"/>
       </w:rPr>
     </w:lvl>
+    <w:lvl w:ilvl="1">
+      <w:start w:val="1"/>
+      <w:numFmt w:val="bullet"/>
+      <w:pStyle w:val="ListBullet2"/>
+      <w:pStyle w:val="ListBullet"/>
+      <w:lvlText w:val=""/>
+      <w:lvlJc w:val="left"/>
+      <w:pPr>
+        <w:tabs>
+          <w:tab w:val="num" w:pos="720"/>
+        </w:tabs>
+        <w:ind w:left="720" w:hanging="360"/>
+      </w:pPr>
+      <w:rPr>
+        <w:rFonts w:ascii="Symbol" w:hAnsi="Symbol" w:hint="default"/>
+      </w:rPr>
+    </w:lvl>
+    <w:lvl w:ilvl="2">
+      <w:start w:val="1"/>
+      <w:numFmt w:val="bullet"/>
+      <w:pStyle w:val="ListBullet3"/>
+      <w:pStyle w:val="ListBullet"/>
+      <w:lvlText w:val=""/>
+      <w:lvlJc w:val="left"/>
+      <w:pPr>
+        <w:tabs>
+          <w:tab w:val="num" w:pos="1080"/>
+        </w:tabs>
+        <w:ind w:left="1080" w:hanging="360"/>
+      </w:pPr>
+      <w:rPr>
+        <w:rFonts w:ascii="Symbol" w:hAnsi="Symbol" w:hint="default"/>
+      </w:rPr>
+    </w:lvl>
+    <w:lvl w:ilvl="3">
+      <w:start w:val="1"/>
+      <w:numFmt w:val="bullet"/>
+      <w:pStyle w:val="ListBullet4"/>
+      <w:pStyle w:val="ListBullet"/>
+      <w:lvlText w:val=""/>
+      <w:lvlJc w:val="left"/>
+      <w:pPr>
+        <w:tabs>
+          <w:tab w:val="num" w:pos="1440"/>
+        </w:tabs>
+        <w:ind w:left="1440" w:hanging="360"/>
+      </w:pPr>
+      <w:rPr>
+        <w:rFonts w:ascii="Symbol" w:hAnsi="Symbol" w:hint="default"/>
+      </w:rPr>
+    </w:lvl>
+    <w:lvl w:ilvl="4">
+      <w:start w:val="1"/>
+      <w:numFmt w:val="bullet"/>
+      <w:pStyle w:val="ListBullet5"/>
+      <w:pStyle w:val="ListBullet"/>
+      <w:lvlText w:val=""/>
+      <w:lvlJc w:val="left"/>
+      <w:pPr>
+        <w:tabs>
+          <w:tab w:val="num" w:pos="1800"/>
+        </w:tabs>
+        <w:ind w:left="1800" w:hanging="360"/>
+      </w:pPr>
+      <w:rPr>
+        <w:rFonts w:ascii="Symbol" w:hAnsi="Symbol" w:hint="default"/>
+      </w:rPr>
+    </w:lvl>
+    <w:lvl w:ilvl="5">
+      <w:start w:val="1"/>
+      <w:numFmt w:val="bullet"/>
+      <w:pStyle w:val="ListBullet6"/>
+      <w:pStyle w:val="ListBullet"/>
+      <w:lvlText w:val=""/>
+      <w:lvlJc w:val="left"/>
+      <w:pPr>
+        <w:tabs>
+          <w:tab w:val="num" w:pos="2160"/>
+        </w:tabs>
+        <w:ind w:left="2160" w:hanging="360"/>
+      </w:pPr>
+      <w:rPr>
+        <w:rFonts w:ascii="Symbol" w:hAnsi="Symbol" w:hint="default"/>
+      </w:rPr>
+    </w:lvl>
+    <w:lvl w:ilvl="6">
+      <w:start w:val="1"/>
+      <w:numFmt w:val="bullet"/>
+      <w:pStyle w:val="ListBullet7"/>
+      <w:pStyle w:val="ListBullet"/>
+      <w:lvlText w:val=""/>
+      <w:lvlJc w:val="left"/>
+      <w:pPr>
+        <w:tabs>
+          <w:tab w:val="num" w:pos="2520"/>
+        </w:tabs>
+        <w:ind w:left="2520" w:hanging="360"/>
+      </w:pPr>
+      <w:rPr>
+        <w:rFonts w:ascii="Symbol" w:hAnsi="Symbol" w:hint="default"/>
+      </w:rPr>
+    </w:lvl>
+    <w:lvl w:ilvl="7">
+      <w:start w:val="1"/>
+      <w:numFmt w:val="bullet"/>
+      <w:pStyle w:val="ListBullet8"/>
+      <w:pStyle w:val="ListBullet"/>
+      <w:lvlText w:val=""/>
+      <w:lvlJc w:val="left"/>
+      <w:pPr>
+        <w:tabs>
+          <w:tab w:val="num" w:pos="2880"/>
+        </w:tabs>
+        <w:ind w:left="2880" w:hanging="360"/>
+      </w:pPr>
+      <w:rPr>
+        <w:rFonts w:ascii="Symbol" w:hAnsi="Symbol" w:hint="default"/>
+      </w:rPr>
+    </w:lvl>
+    <w:lvl w:ilvl="8">
+      <w:start w:val="1"/>
+      <w:numFmt w:val="bullet"/>
+      <w:pStyle w:val="ListBullet9"/>
+      <w:pStyle w:val="ListBullet"/>
+      <w:lvlText w:val=""/>
+      <w:lvlJc w:val="left"/>
+      <w:pPr>
+        <w:tabs>
+          <w:tab w:val="num" w:pos="3240"/>
+        </w:tabs>
+        <w:ind w:left="3240" w:hanging="360"/>
+      </w:pPr>
+      <w:rPr>
+        <w:rFonts w:ascii="Symbol" w:hAnsi="Symbol" w:hint="default"/>
+      </w:rPr>
+    </w:lvl>
   </w:abstractNum>
-  <w:abstractNum w:abstractNumId="32">
-    <w:nsid w:val="C4A1A2FC"/>
-    <w:multiLevelType w:val="singleLevel"/>
+  <w:abstractNum w:abstractNumId="20">
+    <w:nsid w:val="683AD77D"/>
+    <w:multiLevelType w:val="multilevel"/>
     <w:tmpl w:val="D0A62B40"/>
     <w:lvl w:ilvl="0">
       <w:start w:val="1"/>
       <w:numFmt w:val="decimal"/>
       <w:pStyle w:val="ListNumber"/>
+      <w:pStyle w:val="ListNumber"/>
       <w:lvlText w:val="%1."/>
       <w:lvlJc w:val="left"/>
       <w:pPr>
@@ -5629,15 +7326,128 @@
         <w:ind w:left="360" w:hanging="360"/>
       </w:pPr>
     </w:lvl>
+    <w:lvl w:ilvl="1">
+      <w:start w:val="1"/>
+      <w:numFmt w:val="lowerLetter"/>
+      <w:pStyle w:val="ListNumber2"/>
+      <w:pStyle w:val="ListNumber"/>
+      <w:lvlText w:val="%2."/>
+      <w:lvlJc w:val="left"/>
+      <w:pPr>
+        <w:tabs>
+          <w:tab w:val="num" w:pos="720"/>
+        </w:tabs>
+        <w:ind w:left="720" w:hanging="360"/>
+      </w:pPr>
+    </w:lvl>
+    <w:lvl w:ilvl="2">
+      <w:start w:val="1"/>
+      <w:numFmt w:val="lowerRoman"/>
+      <w:pStyle w:val="ListNumber3"/>
+      <w:pStyle w:val="ListNumber"/>
+      <w:lvlText w:val="%3."/>
+      <w:lvlJc w:val="left"/>
+      <w:pPr>
+        <w:tabs>
+          <w:tab w:val="num" w:pos="1080"/>
+        </w:tabs>
+        <w:ind w:left="1080" w:hanging="360"/>
+      </w:pPr>
+    </w:lvl>
+    <w:lvl w:ilvl="3">
+      <w:start w:val="1"/>
+      <w:numFmt w:val="decimal"/>
+      <w:pStyle w:val="ListNumber4"/>
+      <w:pStyle w:val="ListNumber"/>
+      <w:lvlText w:val="%4."/>
+      <w:lvlJc w:val="left"/>
+      <w:pPr>
+        <w:tabs>
+          <w:tab w:val="num" w:pos="1440"/>
+        </w:tabs>
+        <w:ind w:left="1440" w:hanging="360"/>
+      </w:pPr>
+    </w:lvl>
+    <w:lvl w:ilvl="4">
+      <w:start w:val="1"/>
+      <w:numFmt w:val="lowerLetter"/>
+      <w:pStyle w:val="ListNumber5"/>
+      <w:pStyle w:val="ListNumber"/>
+      <w:lvlText w:val="%5."/>
+      <w:lvlJc w:val="left"/>
+      <w:pPr>
+        <w:tabs>
+          <w:tab w:val="num" w:pos="1800"/>
+        </w:tabs>
+        <w:ind w:left="1800" w:hanging="360"/>
+      </w:pPr>
+    </w:lvl>
+    <w:lvl w:ilvl="5">
+      <w:start w:val="1"/>
+      <w:numFmt w:val="lowerRoman"/>
+      <w:pStyle w:val="ListNumber6"/>
+      <w:pStyle w:val="ListNumber"/>
+      <w:lvlText w:val="%6."/>
+      <w:lvlJc w:val="left"/>
+      <w:pPr>
+        <w:tabs>
+          <w:tab w:val="num" w:pos="2160"/>
+        </w:tabs>
+        <w:ind w:left="2160" w:hanging="360"/>
+      </w:pPr>
+    </w:lvl>
+    <w:lvl w:ilvl="6">
+      <w:start w:val="1"/>
+      <w:numFmt w:val="decimal"/>
+      <w:pStyle w:val="ListNumber7"/>
+      <w:pStyle w:val="ListNumber"/>
+      <w:lvlText w:val="%7."/>
+      <w:lvlJc w:val="left"/>
+      <w:pPr>
+        <w:tabs>
+          <w:tab w:val="num" w:pos="2520"/>
+        </w:tabs>
+        <w:ind w:left="2520" w:hanging="360"/>
+      </w:pPr>
+    </w:lvl>
+    <w:lvl w:ilvl="7">
+      <w:start w:val="1"/>
+      <w:numFmt w:val="lowerLetter"/>
+      <w:pStyle w:val="ListNumber8"/>
+      <w:pStyle w:val="ListNumber"/>
+      <w:lvlText w:val="%8."/>
+      <w:lvlJc w:val="left"/>
+      <w:pPr>
+        <w:tabs>
+          <w:tab w:val="num" w:pos="2880"/>
+        </w:tabs>
+        <w:ind w:left="2880" w:hanging="360"/>
+      </w:pPr>
+    </w:lvl>
+    <w:lvl w:ilvl="8">
+      <w:start w:val="1"/>
+      <w:numFmt w:val="lowerRoman"/>
+      <w:pStyle w:val="ListNumber9"/>
+      <w:pStyle w:val="ListNumber"/>
+      <w:lvlText w:val="%9."/>
+      <w:lvlJc w:val="left"/>
+      <w:pPr>
+        <w:tabs>
+          <w:tab w:val="num" w:pos="3240"/>
+        </w:tabs>
+        <w:ind w:left="3240" w:hanging="360"/>
+      </w:pPr>
+    </w:lvl>
   </w:abstractNum>
-  <w:abstractNum w:abstractNumId="33">
-    <w:nsid w:val="E5C29256"/>
-    <w:multiLevelType w:val="singleLevel"/>
+  <w:abstractNum w:abstractNumId="21">
+    <w:nsid w:val="8EDD1F43"/>
+    <w:multiLevelType w:val="multilevel"/>
     <w:tmpl w:val="29761A62"/>
     <w:lvl w:ilvl="0">
       <w:start w:val="1"/>
       <w:numFmt w:val="bullet"/>
       <w:pStyle w:val="ListBullet"/>
+      <w:pStyle w:val="ListBullet"/>
       <w:lvlText w:val=""/>
       <w:lvlJc w:val="left"/>
       <w:pPr>
@@ -5645,6 +7455,720 @@
           <w:tab w:val="num" w:pos="360"/>
         </w:tabs>
         <w:ind w:left="360" w:hanging="360"/>
+      </w:pPr>
+      <w:rPr>
+        <w:rFonts w:ascii="Symbol" w:hAnsi="Symbol" w:hint="default"/>
+      </w:rPr>
+    </w:lvl>
+    <w:lvl w:ilvl="1">
+      <w:start w:val="1"/>
+      <w:numFmt w:val="bullet"/>
+      <w:pStyle w:val="ListBullet2"/>
+      <w:pStyle w:val="ListBullet"/>
+      <w:lvlText w:val=""/>
+      <w:lvlJc w:val="left"/>
+      <w:pPr>
+        <w:tabs>
+          <w:tab w:val="num" w:pos="720"/>
+        </w:tabs>
+        <w:ind w:left="720" w:hanging="360"/>
+      </w:pPr>
+      <w:rPr>
+        <w:rFonts w:ascii="Symbol" w:hAnsi="Symbol" w:hint="default"/>
+      </w:rPr>
+    </w:lvl>
+    <w:lvl w:ilvl="2">
+      <w:start w:val="1"/>
+      <w:numFmt w:val="bullet"/>
+      <w:pStyle w:val="ListBullet3"/>
+      <w:pStyle w:val="ListBullet"/>
+      <w:lvlText w:val=""/>
+      <w:lvlJc w:val="left"/>
+      <w:pPr>
+        <w:tabs>
+          <w:tab w:val="num" w:pos="1080"/>
+        </w:tabs>
+        <w:ind w:left="1080" w:hanging="360"/>
+      </w:pPr>
+      <w:rPr>
+        <w:rFonts w:ascii="Symbol" w:hAnsi="Symbol" w:hint="default"/>
+      </w:rPr>
+    </w:lvl>
+    <w:lvl w:ilvl="3">
+      <w:start w:val="1"/>
+      <w:numFmt w:val="bullet"/>
+      <w:pStyle w:val="ListBullet4"/>
+      <w:pStyle w:val="ListBullet"/>
+      <w:lvlText w:val=""/>
+      <w:lvlJc w:val="left"/>
+      <w:pPr>
+        <w:tabs>
+          <w:tab w:val="num" w:pos="1440"/>
+        </w:tabs>
+        <w:ind w:left="1440" w:hanging="360"/>
+      </w:pPr>
+      <w:rPr>
+        <w:rFonts w:ascii="Symbol" w:hAnsi="Symbol" w:hint="default"/>
+      </w:rPr>
+    </w:lvl>
+    <w:lvl w:ilvl="4">
+      <w:start w:val="1"/>
+      <w:numFmt w:val="bullet"/>
+      <w:pStyle w:val="ListBullet5"/>
+      <w:pStyle w:val="ListBullet"/>
+      <w:lvlText w:val=""/>
+      <w:lvlJc w:val="left"/>
+      <w:pPr>
+        <w:tabs>
+          <w:tab w:val="num" w:pos="1800"/>
+        </w:tabs>
+        <w:ind w:left="1800" w:hanging="360"/>
+      </w:pPr>
+      <w:rPr>
+        <w:rFonts w:ascii="Symbol" w:hAnsi="Symbol" w:hint="default"/>
+      </w:rPr>
+    </w:lvl>
+    <w:lvl w:ilvl="5">
+      <w:start w:val="1"/>
+      <w:numFmt w:val="bullet"/>
+      <w:pStyle w:val="ListBullet6"/>
+      <w:pStyle w:val="ListBullet"/>
+      <w:lvlText w:val=""/>
+      <w:lvlJc w:val="left"/>
+      <w:pPr>
+        <w:tabs>
+          <w:tab w:val="num" w:pos="2160"/>
+        </w:tabs>
+        <w:ind w:left="2160" w:hanging="360"/>
+      </w:pPr>
+      <w:rPr>
+        <w:rFonts w:ascii="Symbol" w:hAnsi="Symbol" w:hint="default"/>
+      </w:rPr>
+    </w:lvl>
+    <w:lvl w:ilvl="6">
+      <w:start w:val="1"/>
+      <w:numFmt w:val="bullet"/>
+      <w:pStyle w:val="ListBullet7"/>
+      <w:pStyle w:val="ListBullet"/>
+      <w:lvlText w:val=""/>
+      <w:lvlJc w:val="left"/>
+      <w:pPr>
+        <w:tabs>
+          <w:tab w:val="num" w:pos="2520"/>
+        </w:tabs>
+        <w:ind w:left="2520" w:hanging="360"/>
+      </w:pPr>
+      <w:rPr>
+        <w:rFonts w:ascii="Symbol" w:hAnsi="Symbol" w:hint="default"/>
+      </w:rPr>
+    </w:lvl>
+    <w:lvl w:ilvl="7">
+      <w:start w:val="1"/>
+      <w:numFmt w:val="bullet"/>
+      <w:pStyle w:val="ListBullet8"/>
+      <w:pStyle w:val="ListBullet"/>
+      <w:lvlText w:val=""/>
+      <w:lvlJc w:val="left"/>
+      <w:pPr>
+        <w:tabs>
+          <w:tab w:val="num" w:pos="2880"/>
+        </w:tabs>
+        <w:ind w:left="2880" w:hanging="360"/>
+      </w:pPr>
+      <w:rPr>
+        <w:rFonts w:ascii="Symbol" w:hAnsi="Symbol" w:hint="default"/>
+      </w:rPr>
+    </w:lvl>
+    <w:lvl w:ilvl="8">
+      <w:start w:val="1"/>
+      <w:numFmt w:val="bullet"/>
+      <w:pStyle w:val="ListBullet9"/>
+      <w:pStyle w:val="ListBullet"/>
+      <w:lvlText w:val=""/>
+      <w:lvlJc w:val="left"/>
+      <w:pPr>
+        <w:tabs>
+          <w:tab w:val="num" w:pos="3240"/>
+        </w:tabs>
+        <w:ind w:left="3240" w:hanging="360"/>
+      </w:pPr>
+      <w:rPr>
+        <w:rFonts w:ascii="Symbol" w:hAnsi="Symbol" w:hint="default"/>
+      </w:rPr>
+    </w:lvl>
+  </w:abstractNum>
+  <w:abstractNum w:abstractNumId="22">
+    <w:nsid w:val="B06DDCF7"/>
+    <w:multiLevelType w:val="multilevel"/>
+    <w:tmpl w:val="D0A62B40"/>
+    <w:lvl w:ilvl="0">
+      <w:start w:val="1"/>
+      <w:numFmt w:val="decimal"/>
+      <w:pStyle w:val="ListNumber"/>
+      <w:pStyle w:val="ListNumber"/>
+      <w:lvlText w:val="%1."/>
+      <w:lvlJc w:val="left"/>
+      <w:pPr>
+        <w:tabs>
+          <w:tab w:val="num" w:pos="360"/>
+        </w:tabs>
+        <w:ind w:left="360" w:hanging="360"/>
+      </w:pPr>
+    </w:lvl>
+    <w:lvl w:ilvl="1">
+      <w:start w:val="1"/>
+      <w:numFmt w:val="lowerLetter"/>
+      <w:pStyle w:val="ListNumber2"/>
+      <w:pStyle w:val="ListNumber"/>
+      <w:lvlText w:val="%2."/>
+      <w:lvlJc w:val="left"/>
+      <w:pPr>
+        <w:tabs>
+          <w:tab w:val="num" w:pos="720"/>
+        </w:tabs>
+        <w:ind w:left="720" w:hanging="360"/>
+      </w:pPr>
+    </w:lvl>
+    <w:lvl w:ilvl="2">
+      <w:start w:val="1"/>
+      <w:numFmt w:val="lowerRoman"/>
+      <w:pStyle w:val="ListNumber3"/>
+      <w:pStyle w:val="ListNumber"/>
+      <w:lvlText w:val="%3."/>
+      <w:lvlJc w:val="left"/>
+      <w:pPr>
+        <w:tabs>
+          <w:tab w:val="num" w:pos="1080"/>
+        </w:tabs>
+        <w:ind w:left="1080" w:hanging="360"/>
+      </w:pPr>
+    </w:lvl>
+    <w:lvl w:ilvl="3">
+      <w:start w:val="1"/>
+      <w:numFmt w:val="decimal"/>
+      <w:pStyle w:val="ListNumber4"/>
+      <w:pStyle w:val="ListNumber"/>
+      <w:lvlText w:val="%4."/>
+      <w:lvlJc w:val="left"/>
+      <w:pPr>
+        <w:tabs>
+          <w:tab w:val="num" w:pos="1440"/>
+        </w:tabs>
+        <w:ind w:left="1440" w:hanging="360"/>
+      </w:pPr>
+    </w:lvl>
+    <w:lvl w:ilvl="4">
+      <w:start w:val="1"/>
+      <w:numFmt w:val="lowerLetter"/>
+      <w:pStyle w:val="ListNumber5"/>
+      <w:pStyle w:val="ListNumber"/>
+      <w:lvlText w:val="%5."/>
+      <w:lvlJc w:val="left"/>
+      <w:pPr>
+        <w:tabs>
+          <w:tab w:val="num" w:pos="1800"/>
+        </w:tabs>
+        <w:ind w:left="1800" w:hanging="360"/>
+      </w:pPr>
+    </w:lvl>
+    <w:lvl w:ilvl="5">
+      <w:start w:val="1"/>
+      <w:numFmt w:val="lowerRoman"/>
+      <w:pStyle w:val="ListNumber6"/>
+      <w:pStyle w:val="ListNumber"/>
+      <w:lvlText w:val="%6."/>
+      <w:lvlJc w:val="left"/>
+      <w:pPr>
+        <w:tabs>
+          <w:tab w:val="num" w:pos="2160"/>
+        </w:tabs>
+        <w:ind w:left="2160" w:hanging="360"/>
+      </w:pPr>
+    </w:lvl>
+    <w:lvl w:ilvl="6">
+      <w:start w:val="1"/>
+      <w:numFmt w:val="decimal"/>
+      <w:pStyle w:val="ListNumber7"/>
+      <w:pStyle w:val="ListNumber"/>
+      <w:lvlText w:val="%7."/>
+      <w:lvlJc w:val="left"/>
+      <w:pPr>
+        <w:tabs>
+          <w:tab w:val="num" w:pos="2520"/>
+        </w:tabs>
+        <w:ind w:left="2520" w:hanging="360"/>
+      </w:pPr>
+    </w:lvl>
+    <w:lvl w:ilvl="7">
+      <w:start w:val="1"/>
+      <w:numFmt w:val="lowerLetter"/>
+      <w:pStyle w:val="ListNumber8"/>
+      <w:pStyle w:val="ListNumber"/>
+      <w:lvlText w:val="%8."/>
+      <w:lvlJc w:val="left"/>
+      <w:pPr>
+        <w:tabs>
+          <w:tab w:val="num" w:pos="2880"/>
+        </w:tabs>
+        <w:ind w:left="2880" w:hanging="360"/>
+      </w:pPr>
+    </w:lvl>
+    <w:lvl w:ilvl="8">
+      <w:start w:val="1"/>
+      <w:numFmt w:val="lowerRoman"/>
+      <w:pStyle w:val="ListNumber9"/>
+      <w:pStyle w:val="ListNumber"/>
+      <w:lvlText w:val="%9."/>
+      <w:lvlJc w:val="left"/>
+      <w:pPr>
+        <w:tabs>
+          <w:tab w:val="num" w:pos="3240"/>
+        </w:tabs>
+        <w:ind w:left="3240" w:hanging="360"/>
+      </w:pPr>
+    </w:lvl>
+  </w:abstractNum>
+  <w:abstractNum w:abstractNumId="23">
+    <w:nsid w:val="224BC35E"/>
+    <w:multiLevelType w:val="multilevel"/>
+    <w:tmpl w:val="29761A62"/>
+    <w:lvl w:ilvl="0">
+      <w:start w:val="1"/>
+      <w:numFmt w:val="bullet"/>
+      <w:pStyle w:val="ListBullet"/>
+      <w:pStyle w:val="ListBullet"/>
+      <w:lvlText w:val=""/>
+      <w:lvlJc w:val="left"/>
+      <w:pPr>
+        <w:tabs>
+          <w:tab w:val="num" w:pos="360"/>
+        </w:tabs>
+        <w:ind w:left="360" w:hanging="360"/>
+      </w:pPr>
+      <w:rPr>
+        <w:rFonts w:ascii="Symbol" w:hAnsi="Symbol" w:hint="default"/>
+      </w:rPr>
+    </w:lvl>
+    <w:lvl w:ilvl="1">
+      <w:start w:val="1"/>
+      <w:numFmt w:val="bullet"/>
+      <w:pStyle w:val="ListBullet2"/>
+      <w:pStyle w:val="ListBullet"/>
+      <w:lvlText w:val=""/>
+      <w:lvlJc w:val="left"/>
+      <w:pPr>
+        <w:tabs>
+          <w:tab w:val="num" w:pos="720"/>
+        </w:tabs>
+        <w:ind w:left="720" w:hanging="360"/>
+      </w:pPr>
+      <w:rPr>
+        <w:rFonts w:ascii="Symbol" w:hAnsi="Symbol" w:hint="default"/>
+      </w:rPr>
+    </w:lvl>
+    <w:lvl w:ilvl="2">
+      <w:start w:val="1"/>
+      <w:numFmt w:val="bullet"/>
+      <w:pStyle w:val="ListBullet3"/>
+      <w:pStyle w:val="ListBullet"/>
+      <w:lvlText w:val=""/>
+      <w:lvlJc w:val="left"/>
+      <w:pPr>
+        <w:tabs>
+          <w:tab w:val="num" w:pos="1080"/>
+        </w:tabs>
+        <w:ind w:left="1080" w:hanging="360"/>
+      </w:pPr>
+      <w:rPr>
+        <w:rFonts w:ascii="Symbol" w:hAnsi="Symbol" w:hint="default"/>
+      </w:rPr>
+    </w:lvl>
+    <w:lvl w:ilvl="3">
+      <w:start w:val="1"/>
+      <w:numFmt w:val="bullet"/>
+      <w:pStyle w:val="ListBullet4"/>
+      <w:pStyle w:val="ListBullet"/>
+      <w:lvlText w:val=""/>
+      <w:lvlJc w:val="left"/>
+      <w:pPr>
+        <w:tabs>
+          <w:tab w:val="num" w:pos="1440"/>
+        </w:tabs>
+        <w:ind w:left="1440" w:hanging="360"/>
+      </w:pPr>
+      <w:rPr>
+        <w:rFonts w:ascii="Symbol" w:hAnsi="Symbol" w:hint="default"/>
+      </w:rPr>
+    </w:lvl>
+    <w:lvl w:ilvl="4">
+      <w:start w:val="1"/>
+      <w:numFmt w:val="bullet"/>
+      <w:pStyle w:val="ListBullet5"/>
+      <w:pStyle w:val="ListBullet"/>
+      <w:lvlText w:val=""/>
+      <w:lvlJc w:val="left"/>
+      <w:pPr>
+        <w:tabs>
+          <w:tab w:val="num" w:pos="1800"/>
+        </w:tabs>
+        <w:ind w:left="1800" w:hanging="360"/>
+      </w:pPr>
+      <w:rPr>
+        <w:rFonts w:ascii="Symbol" w:hAnsi="Symbol" w:hint="default"/>
+      </w:rPr>
+    </w:lvl>
+    <w:lvl w:ilvl="5">
+      <w:start w:val="1"/>
+      <w:numFmt w:val="bullet"/>
+      <w:pStyle w:val="ListBullet6"/>
+      <w:pStyle w:val="ListBullet"/>
+      <w:lvlText w:val=""/>
+      <w:lvlJc w:val="left"/>
+      <w:pPr>
+        <w:tabs>
+          <w:tab w:val="num" w:pos="2160"/>
+        </w:tabs>
+        <w:ind w:left="2160" w:hanging="360"/>
+      </w:pPr>
+      <w:rPr>
+        <w:rFonts w:ascii="Symbol" w:hAnsi="Symbol" w:hint="default"/>
+      </w:rPr>
+    </w:lvl>
+    <w:lvl w:ilvl="6">
+      <w:start w:val="1"/>
+      <w:numFmt w:val="bullet"/>
+      <w:pStyle w:val="ListBullet7"/>
+      <w:pStyle w:val="ListBullet"/>
+      <w:lvlText w:val=""/>
+      <w:lvlJc w:val="left"/>
+      <w:pPr>
+        <w:tabs>
+          <w:tab w:val="num" w:pos="2520"/>
+        </w:tabs>
+        <w:ind w:left="2520" w:hanging="360"/>
+      </w:pPr>
+      <w:rPr>
+        <w:rFonts w:ascii="Symbol" w:hAnsi="Symbol" w:hint="default"/>
+      </w:rPr>
+    </w:lvl>
+    <w:lvl w:ilvl="7">
+      <w:start w:val="1"/>
+      <w:numFmt w:val="bullet"/>
+      <w:pStyle w:val="ListBullet8"/>
+      <w:pStyle w:val="ListBullet"/>
+      <w:lvlText w:val=""/>
+      <w:lvlJc w:val="left"/>
+      <w:pPr>
+        <w:tabs>
+          <w:tab w:val="num" w:pos="2880"/>
+        </w:tabs>
+        <w:ind w:left="2880" w:hanging="360"/>
+      </w:pPr>
+      <w:rPr>
+        <w:rFonts w:ascii="Symbol" w:hAnsi="Symbol" w:hint="default"/>
+      </w:rPr>
+    </w:lvl>
+    <w:lvl w:ilvl="8">
+      <w:start w:val="1"/>
+      <w:numFmt w:val="bullet"/>
+      <w:pStyle w:val="ListBullet9"/>
+      <w:pStyle w:val="ListBullet"/>
+      <w:lvlText w:val=""/>
+      <w:lvlJc w:val="left"/>
+      <w:pPr>
+        <w:tabs>
+          <w:tab w:val="num" w:pos="3240"/>
+        </w:tabs>
+        <w:ind w:left="3240" w:hanging="360"/>
+      </w:pPr>
+      <w:rPr>
+        <w:rFonts w:ascii="Symbol" w:hAnsi="Symbol" w:hint="default"/>
+      </w:rPr>
+    </w:lvl>
+  </w:abstractNum>
+  <w:abstractNum w:abstractNumId="24">
+    <w:nsid w:val="7D2D727B"/>
+    <w:multiLevelType w:val="multilevel"/>
+    <w:tmpl w:val="D0A62B40"/>
+    <w:lvl w:ilvl="0">
+      <w:start w:val="1"/>
+      <w:numFmt w:val="decimal"/>
+      <w:pStyle w:val="ListNumber"/>
+      <w:pStyle w:val="ListNumber"/>
+      <w:lvlText w:val="%1."/>
+      <w:lvlJc w:val="left"/>
+      <w:pPr>
+        <w:tabs>
+          <w:tab w:val="num" w:pos="360"/>
+        </w:tabs>
+        <w:ind w:left="360" w:hanging="360"/>
+      </w:pPr>
+    </w:lvl>
+    <w:lvl w:ilvl="1">
+      <w:start w:val="1"/>
+      <w:numFmt w:val="lowerLetter"/>
+      <w:pStyle w:val="ListNumber2"/>
+      <w:pStyle w:val="ListNumber"/>
+      <w:lvlText w:val="%2."/>
+      <w:lvlJc w:val="left"/>
+      <w:pPr>
+        <w:tabs>
+          <w:tab w:val="num" w:pos="720"/>
+        </w:tabs>
+        <w:ind w:left="720" w:hanging="360"/>
+      </w:pPr>
+    </w:lvl>
+    <w:lvl w:ilvl="2">
+      <w:start w:val="1"/>
+      <w:numFmt w:val="lowerRoman"/>
+      <w:pStyle w:val="ListNumber3"/>
+      <w:pStyle w:val="ListNumber"/>
+      <w:lvlText w:val="%3."/>
+      <w:lvlJc w:val="left"/>
+      <w:pPr>
+        <w:tabs>
+          <w:tab w:val="num" w:pos="1080"/>
+        </w:tabs>
+        <w:ind w:left="1080" w:hanging="360"/>
+      </w:pPr>
+    </w:lvl>
+    <w:lvl w:ilvl="3">
+      <w:start w:val="1"/>
+      <w:numFmt w:val="decimal"/>
+      <w:pStyle w:val="ListNumber4"/>
+      <w:pStyle w:val="ListNumber"/>
+      <w:lvlText w:val="%4."/>
+      <w:lvlJc w:val="left"/>
+      <w:pPr>
+        <w:tabs>
+          <w:tab w:val="num" w:pos="1440"/>
+        </w:tabs>
+        <w:ind w:left="1440" w:hanging="360"/>
+      </w:pPr>
+    </w:lvl>
+    <w:lvl w:ilvl="4">
+      <w:start w:val="1"/>
+      <w:numFmt w:val="lowerLetter"/>
+      <w:pStyle w:val="ListNumber5"/>
+      <w:pStyle w:val="ListNumber"/>
+      <w:lvlText w:val="%5."/>
+      <w:lvlJc w:val="left"/>
+      <w:pPr>
+        <w:tabs>
+          <w:tab w:val="num" w:pos="1800"/>
+        </w:tabs>
+        <w:ind w:left="1800" w:hanging="360"/>
+      </w:pPr>
+    </w:lvl>
+    <w:lvl w:ilvl="5">
+      <w:start w:val="1"/>
+      <w:numFmt w:val="lowerRoman"/>
+      <w:pStyle w:val="ListNumber6"/>
+      <w:pStyle w:val="ListNumber"/>
+      <w:lvlText w:val="%6."/>
+      <w:lvlJc w:val="left"/>
+      <w:pPr>
+        <w:tabs>
+          <w:tab w:val="num" w:pos="2160"/>
+        </w:tabs>
+        <w:ind w:left="2160" w:hanging="360"/>
+      </w:pPr>
+    </w:lvl>
+    <w:lvl w:ilvl="6">
+      <w:start w:val="1"/>
+      <w:numFmt w:val="decimal"/>
+      <w:pStyle w:val="ListNumber7"/>
+      <w:pStyle w:val="ListNumber"/>
+      <w:lvlText w:val="%7."/>
+      <w:lvlJc w:val="left"/>
+      <w:pPr>
+        <w:tabs>
+          <w:tab w:val="num" w:pos="2520"/>
+        </w:tabs>
+        <w:ind w:left="2520" w:hanging="360"/>
+      </w:pPr>
+    </w:lvl>
+    <w:lvl w:ilvl="7">
+      <w:start w:val="1"/>
+      <w:numFmt w:val="lowerLetter"/>
+      <w:pStyle w:val="ListNumber8"/>
+      <w:pStyle w:val="ListNumber"/>
+      <w:lvlText w:val="%8."/>
+      <w:lvlJc w:val="left"/>
+      <w:pPr>
+        <w:tabs>
+          <w:tab w:val="num" w:pos="2880"/>
+        </w:tabs>
+        <w:ind w:left="2880" w:hanging="360"/>
+      </w:pPr>
+    </w:lvl>
+    <w:lvl w:ilvl="8">
+      <w:start w:val="1"/>
+      <w:numFmt w:val="lowerRoman"/>
+      <w:pStyle w:val="ListNumber9"/>
+      <w:pStyle w:val="ListNumber"/>
+      <w:lvlText w:val="%9."/>
+      <w:lvlJc w:val="left"/>
+      <w:pPr>
+        <w:tabs>
+          <w:tab w:val="num" w:pos="3240"/>
+        </w:tabs>
+        <w:ind w:left="3240" w:hanging="360"/>
+      </w:pPr>
+    </w:lvl>
+  </w:abstractNum>
+  <w:abstractNum w:abstractNumId="25">
+    <w:nsid w:val="61FD50C8"/>
+    <w:multiLevelType w:val="multilevel"/>
+    <w:tmpl w:val="29761A62"/>
+    <w:lvl w:ilvl="0">
+      <w:start w:val="1"/>
+      <w:numFmt w:val="bullet"/>
+      <w:pStyle w:val="ListBullet"/>
+      <w:pStyle w:val="ListBullet"/>
+      <w:lvlText w:val=""/>
+      <w:lvlJc w:val="left"/>
+      <w:pPr>
+        <w:tabs>
+          <w:tab w:val="num" w:pos="360"/>
+        </w:tabs>
+        <w:ind w:left="360" w:hanging="360"/>
+      </w:pPr>
+      <w:rPr>
+        <w:rFonts w:ascii="Symbol" w:hAnsi="Symbol" w:hint="default"/>
+      </w:rPr>
+    </w:lvl>
+    <w:lvl w:ilvl="1">
+      <w:start w:val="1"/>
+      <w:numFmt w:val="bullet"/>
+      <w:pStyle w:val="ListBullet2"/>
+      <w:pStyle w:val="ListBullet"/>
+      <w:lvlText w:val=""/>
+      <w:lvlJc w:val="left"/>
+      <w:pPr>
+        <w:tabs>
+          <w:tab w:val="num" w:pos="720"/>
+        </w:tabs>
+        <w:ind w:left="720" w:hanging="360"/>
+      </w:pPr>
+      <w:rPr>
+        <w:rFonts w:ascii="Symbol" w:hAnsi="Symbol" w:hint="default"/>
+      </w:rPr>
+    </w:lvl>
+    <w:lvl w:ilvl="2">
+      <w:start w:val="1"/>
+      <w:numFmt w:val="bullet"/>
+      <w:pStyle w:val="ListBullet3"/>
+      <w:pStyle w:val="ListBullet"/>
+      <w:lvlText w:val=""/>
+      <w:lvlJc w:val="left"/>
+      <w:pPr>
+        <w:tabs>
+          <w:tab w:val="num" w:pos="1080"/>
+        </w:tabs>
+        <w:ind w:left="1080" w:hanging="360"/>
+      </w:pPr>
+      <w:rPr>
+        <w:rFonts w:ascii="Symbol" w:hAnsi="Symbol" w:hint="default"/>
+      </w:rPr>
+    </w:lvl>
+    <w:lvl w:ilvl="3">
+      <w:start w:val="1"/>
+      <w:numFmt w:val="bullet"/>
+      <w:pStyle w:val="ListBullet4"/>
+      <w:pStyle w:val="ListBullet"/>
+      <w:lvlText w:val=""/>
+      <w:lvlJc w:val="left"/>
+      <w:pPr>
+        <w:tabs>
+          <w:tab w:val="num" w:pos="1440"/>
+        </w:tabs>
+        <w:ind w:left="1440" w:hanging="360"/>
+      </w:pPr>
+      <w:rPr>
+        <w:rFonts w:ascii="Symbol" w:hAnsi="Symbol" w:hint="default"/>
+      </w:rPr>
+    </w:lvl>
+    <w:lvl w:ilvl="4">
+      <w:start w:val="1"/>
+      <w:numFmt w:val="bullet"/>
+      <w:pStyle w:val="ListBullet5"/>
+      <w:pStyle w:val="ListBullet"/>
+      <w:lvlText w:val=""/>
+      <w:lvlJc w:val="left"/>
+      <w:pPr>
+        <w:tabs>
+          <w:tab w:val="num" w:pos="1800"/>
+        </w:tabs>
+        <w:ind w:left="1800" w:hanging="360"/>
+      </w:pPr>
+      <w:rPr>
+        <w:rFonts w:ascii="Symbol" w:hAnsi="Symbol" w:hint="default"/>
+      </w:rPr>
+    </w:lvl>
+    <w:lvl w:ilvl="5">
+      <w:start w:val="1"/>
+      <w:numFmt w:val="bullet"/>
+      <w:pStyle w:val="ListBullet6"/>
+      <w:pStyle w:val="ListBullet"/>
+      <w:lvlText w:val=""/>
+      <w:lvlJc w:val="left"/>
+      <w:pPr>
+        <w:tabs>
+          <w:tab w:val="num" w:pos="2160"/>
+        </w:tabs>
+        <w:ind w:left="2160" w:hanging="360"/>
+      </w:pPr>
+      <w:rPr>
+        <w:rFonts w:ascii="Symbol" w:hAnsi="Symbol" w:hint="default"/>
+      </w:rPr>
+    </w:lvl>
+    <w:lvl w:ilvl="6">
+      <w:start w:val="1"/>
+      <w:numFmt w:val="bullet"/>
+      <w:pStyle w:val="ListBullet7"/>
+      <w:pStyle w:val="ListBullet"/>
+      <w:lvlText w:val=""/>
+      <w:lvlJc w:val="left"/>
+      <w:pPr>
+        <w:tabs>
+          <w:tab w:val="num" w:pos="2520"/>
+        </w:tabs>
+        <w:ind w:left="2520" w:hanging="360"/>
+      </w:pPr>
+      <w:rPr>
+        <w:rFonts w:ascii="Symbol" w:hAnsi="Symbol" w:hint="default"/>
+      </w:rPr>
+    </w:lvl>
+    <w:lvl w:ilvl="7">
+      <w:start w:val="1"/>
+      <w:numFmt w:val="bullet"/>
+      <w:pStyle w:val="ListBullet8"/>
+      <w:pStyle w:val="ListBullet"/>
+      <w:lvlText w:val=""/>
+      <w:lvlJc w:val="left"/>
+      <w:pPr>
+        <w:tabs>
+          <w:tab w:val="num" w:pos="2880"/>
+        </w:tabs>
+        <w:ind w:left="2880" w:hanging="360"/>
+      </w:pPr>
+      <w:rPr>
+        <w:rFonts w:ascii="Symbol" w:hAnsi="Symbol" w:hint="default"/>
+      </w:rPr>
+    </w:lvl>
+    <w:lvl w:ilvl="8">
+      <w:start w:val="1"/>
+      <w:numFmt w:val="bullet"/>
+      <w:pStyle w:val="ListBullet9"/>
+      <w:pStyle w:val="ListBullet"/>
+      <w:lvlText w:val=""/>
+      <w:lvlJc w:val="left"/>
+      <w:pPr>
+        <w:tabs>
+          <w:tab w:val="num" w:pos="3240"/>
+        </w:tabs>
+        <w:ind w:left="3240" w:hanging="360"/>
       </w:pPr>
       <w:rPr>
         <w:rFonts w:ascii="Symbol" w:hAnsi="Symbol" w:hint="default"/>
@@ -5699,7 +8223,7 @@
   <w:num w:numId="13">
     <w:abstractNumId w:val="12"/>
     <w:lvlOverride w:ilvl="0">
-      <w:startOverride w:val="1"/>
+      <w:startOverride w:val="3"/>
     </w:lvlOverride>
   </w:num>
   <w:num w:numId="14">
@@ -5723,12 +8247,12 @@
   <w:num w:numId="17">
     <w:abstractNumId w:val="16"/>
     <w:lvlOverride w:ilvl="0">
-      <w:startOverride w:val="3"/>
+      <w:startOverride w:val="1"/>
     </w:lvlOverride>
   </w:num>
   <w:num w:numId="18">
     <w:abstractNumId w:val="17"/>
-    <w:lvlOverride w:ilvl="0">
+    <w:lvlOverride w:ilvl="1">
       <w:startOverride w:val="1"/>
     </w:lvlOverride>
   </w:num>
@@ -5740,7 +8264,7 @@
   </w:num>
   <w:num w:numId="20">
     <w:abstractNumId w:val="19"/>
-    <w:lvlOverride w:ilvl="0">
+    <w:lvlOverride w:ilvl="1">
       <w:startOverride w:val="1"/>
     </w:lvlOverride>
   </w:num>
@@ -5776,54 +8300,6 @@
   </w:num>
   <w:num w:numId="26">
     <w:abstractNumId w:val="25"/>
-    <w:lvlOverride w:ilvl="0">
-      <w:startOverride w:val="1"/>
-    </w:lvlOverride>
-  </w:num>
-  <w:num w:numId="27">
-    <w:abstractNumId w:val="26"/>
-    <w:lvlOverride w:ilvl="0">
-      <w:startOverride w:val="1"/>
-    </w:lvlOverride>
-  </w:num>
-  <w:num w:numId="28">
-    <w:abstractNumId w:val="27"/>
-    <w:lvlOverride w:ilvl="0">
-      <w:startOverride w:val="1"/>
-    </w:lvlOverride>
-  </w:num>
-  <w:num w:numId="29">
-    <w:abstractNumId w:val="28"/>
-    <w:lvlOverride w:ilvl="0">
-      <w:startOverride w:val="1"/>
-    </w:lvlOverride>
-  </w:num>
-  <w:num w:numId="30">
-    <w:abstractNumId w:val="29"/>
-    <w:lvlOverride w:ilvl="0">
-      <w:startOverride w:val="1"/>
-    </w:lvlOverride>
-  </w:num>
-  <w:num w:numId="31">
-    <w:abstractNumId w:val="30"/>
-    <w:lvlOverride w:ilvl="0">
-      <w:startOverride w:val="1"/>
-    </w:lvlOverride>
-  </w:num>
-  <w:num w:numId="32">
-    <w:abstractNumId w:val="31"/>
-    <w:lvlOverride w:ilvl="0">
-      <w:startOverride w:val="1"/>
-    </w:lvlOverride>
-  </w:num>
-  <w:num w:numId="33">
-    <w:abstractNumId w:val="32"/>
-    <w:lvlOverride w:ilvl="0">
-      <w:startOverride w:val="1"/>
-    </w:lvlOverride>
-  </w:num>
-  <w:num w:numId="34">
-    <w:abstractNumId w:val="33"/>
     <w:lvlOverride w:ilvl="0">
       <w:startOverride w:val="1"/>
     </w:lvlOverride>
@@ -6529,6 +9005,7 @@
     <w:rsid w:val="00326F90"/>
     <w:pPr>
       <w:numPr>
+        <w:ilvl w:val="0"/>
         <w:numId w:val="1"/>
       </w:numPr>
       <w:spacing w:after="160" w:line="280" w:lineRule="auto"/>
@@ -6547,7 +9024,8 @@
     <w:rsid w:val="00326F90"/>
     <w:pPr>
       <w:numPr>
-        <w:numId w:val="2"/>
+        <w:ilvl w:val="1"/>
+        <w:numId w:val="1"/>
       </w:numPr>
       <w:spacing w:after="160" w:line="280" w:lineRule="auto"/>
       <w:contextualSpacing/>
@@ -6565,7 +9043,8 @@
     <w:rsid w:val="00326F90"/>
     <w:pPr>
       <w:numPr>
-        <w:numId w:val="3"/>
+        <w:ilvl w:val="2"/>
+        <w:numId w:val="1"/>
       </w:numPr>
       <w:spacing w:after="160" w:line="280" w:lineRule="auto"/>
       <w:contextualSpacing/>
@@ -6583,6 +9062,7 @@
     <w:rsid w:val="00326F90"/>
     <w:pPr>
       <w:numPr>
+        <w:ilvl w:val="0"/>
         <w:numId w:val="5"/>
       </w:numPr>
       <w:spacing w:after="160" w:line="280" w:lineRule="auto"/>
@@ -6601,7 +9081,8 @@
     <w:rsid w:val="0029639D"/>
     <w:pPr>
       <w:numPr>
-        <w:numId w:val="6"/>
+        <w:ilvl w:val="1"/>
+        <w:numId w:val="5"/>
       </w:numPr>
       <w:spacing w:after="160" w:line="280" w:lineRule="auto"/>
       <w:contextualSpacing/>
@@ -6619,7 +9100,8 @@
     <w:rsid w:val="0029639D"/>
     <w:pPr>
       <w:numPr>
-        <w:numId w:val="7"/>
+        <w:ilvl w:val="2"/>
+        <w:numId w:val="5"/>
       </w:numPr>
       <w:spacing w:after="160" w:line="280" w:lineRule="auto"/>
       <w:contextualSpacing/>
@@ -17732,6 +20214,234 @@
     <w:rPr>
       <w:rFonts w:ascii="Consolas" w:hAnsi="Consolas"/>
       <w:sz w:val="18"/>
+    </w:rPr>
+  </w:style>
+  <w:style w:type="paragraph" w:styleId="ListNumber4">
+    <w:name w:val="List Number 4"/>
+    <w:basedOn w:val="Normal"/>
+    <w:uiPriority w:val="99"/>
+    <w:unhideWhenUsed/>
+    <w:rsid w:val="00326F90"/>
+    <w:pPr>
+      <w:numPr>
+        <w:ilvl w:val="3"/>
+        <w:numId w:val="5"/>
+      </w:numPr>
+      <w:spacing w:after="160" w:line="280" w:lineRule="auto"/>
+      <w:contextualSpacing/>
+    </w:pPr>
+    <w:rPr>
+      <w:rFonts w:asciiTheme="minorHAnsi" w:hAnsiTheme="minorHAnsi"/>
+      <w:sz w:val="22"/>
+    </w:rPr>
+  </w:style>
+  <w:style w:type="paragraph" w:styleId="ListNumber5">
+    <w:name w:val="List Number 5"/>
+    <w:basedOn w:val="Normal"/>
+    <w:uiPriority w:val="99"/>
+    <w:unhideWhenUsed/>
+    <w:rsid w:val="00326F90"/>
+    <w:pPr>
+      <w:numPr>
+        <w:ilvl w:val="4"/>
+        <w:numId w:val="5"/>
+      </w:numPr>
+      <w:spacing w:after="160" w:line="280" w:lineRule="auto"/>
+      <w:contextualSpacing/>
+    </w:pPr>
+    <w:rPr>
+      <w:rFonts w:asciiTheme="minorHAnsi" w:hAnsiTheme="minorHAnsi"/>
+      <w:sz w:val="22"/>
+    </w:rPr>
+  </w:style>
+  <w:style w:type="paragraph" w:styleId="ListNumber6">
+    <w:name w:val="List Number 6"/>
+    <w:basedOn w:val="Normal"/>
+    <w:uiPriority w:val="99"/>
+    <w:unhideWhenUsed/>
+    <w:rsid w:val="00326F90"/>
+    <w:pPr>
+      <w:numPr>
+        <w:ilvl w:val="5"/>
+        <w:numId w:val="5"/>
+      </w:numPr>
+      <w:spacing w:after="160" w:line="280" w:lineRule="auto"/>
+      <w:contextualSpacing/>
+    </w:pPr>
+    <w:rPr>
+      <w:rFonts w:asciiTheme="minorHAnsi" w:hAnsiTheme="minorHAnsi"/>
+      <w:sz w:val="22"/>
+    </w:rPr>
+  </w:style>
+  <w:style w:type="paragraph" w:styleId="ListNumber7">
+    <w:name w:val="List Number 7"/>
+    <w:basedOn w:val="Normal"/>
+    <w:uiPriority w:val="99"/>
+    <w:unhideWhenUsed/>
+    <w:rsid w:val="00326F90"/>
+    <w:pPr>
+      <w:numPr>
+        <w:ilvl w:val="6"/>
+        <w:numId w:val="5"/>
+      </w:numPr>
+      <w:spacing w:after="160" w:line="280" w:lineRule="auto"/>
+      <w:contextualSpacing/>
+    </w:pPr>
+    <w:rPr>
+      <w:rFonts w:asciiTheme="minorHAnsi" w:hAnsiTheme="minorHAnsi"/>
+      <w:sz w:val="22"/>
+    </w:rPr>
+  </w:style>
+  <w:style w:type="paragraph" w:styleId="ListNumber8">
+    <w:name w:val="List Number 8"/>
+    <w:basedOn w:val="Normal"/>
+    <w:uiPriority w:val="99"/>
+    <w:unhideWhenUsed/>
+    <w:rsid w:val="00326F90"/>
+    <w:pPr>
+      <w:numPr>
+        <w:ilvl w:val="7"/>
+        <w:numId w:val="5"/>
+      </w:numPr>
+      <w:spacing w:after="160" w:line="280" w:lineRule="auto"/>
+      <w:contextualSpacing/>
+    </w:pPr>
+    <w:rPr>
+      <w:rFonts w:asciiTheme="minorHAnsi" w:hAnsiTheme="minorHAnsi"/>
+      <w:sz w:val="22"/>
+    </w:rPr>
+  </w:style>
+  <w:style w:type="paragraph" w:styleId="ListNumber9">
+    <w:name w:val="List Number 9"/>
+    <w:basedOn w:val="Normal"/>
+    <w:uiPriority w:val="99"/>
+    <w:unhideWhenUsed/>
+    <w:rsid w:val="00326F90"/>
+    <w:pPr>
+      <w:numPr>
+        <w:ilvl w:val="8"/>
+        <w:numId w:val="5"/>
+      </w:numPr>
+      <w:spacing w:after="160" w:line="280" w:lineRule="auto"/>
+      <w:contextualSpacing/>
+    </w:pPr>
+    <w:rPr>
+      <w:rFonts w:asciiTheme="minorHAnsi" w:hAnsiTheme="minorHAnsi"/>
+      <w:sz w:val="22"/>
+    </w:rPr>
+  </w:style>
+  <w:style w:type="paragraph" w:styleId="ListBullet4">
+    <w:name w:val="List Bullet 4"/>
+    <w:basedOn w:val="Normal"/>
+    <w:uiPriority w:val="99"/>
+    <w:unhideWhenUsed/>
+    <w:rsid w:val="00326F90"/>
+    <w:pPr>
+      <w:numPr>
+        <w:ilvl w:val="3"/>
+        <w:numId w:val="1"/>
+      </w:numPr>
+      <w:spacing w:after="160" w:line="280" w:lineRule="auto"/>
+      <w:contextualSpacing/>
+    </w:pPr>
+    <w:rPr>
+      <w:rFonts w:asciiTheme="minorHAnsi" w:hAnsiTheme="minorHAnsi"/>
+      <w:sz w:val="22"/>
+    </w:rPr>
+  </w:style>
+  <w:style w:type="paragraph" w:styleId="ListBullet5">
+    <w:name w:val="List Bullet 5"/>
+    <w:basedOn w:val="Normal"/>
+    <w:uiPriority w:val="99"/>
+    <w:unhideWhenUsed/>
+    <w:rsid w:val="00326F90"/>
+    <w:pPr>
+      <w:numPr>
+        <w:ilvl w:val="4"/>
+        <w:numId w:val="1"/>
+      </w:numPr>
+      <w:spacing w:after="160" w:line="280" w:lineRule="auto"/>
+      <w:contextualSpacing/>
+    </w:pPr>
+    <w:rPr>
+      <w:rFonts w:asciiTheme="minorHAnsi" w:hAnsiTheme="minorHAnsi"/>
+      <w:sz w:val="22"/>
+    </w:rPr>
+  </w:style>
+  <w:style w:type="paragraph" w:styleId="ListBullet6">
+    <w:name w:val="List Bullet 6"/>
+    <w:basedOn w:val="Normal"/>
+    <w:uiPriority w:val="99"/>
+    <w:unhideWhenUsed/>
+    <w:rsid w:val="00326F90"/>
+    <w:pPr>
+      <w:numPr>
+        <w:ilvl w:val="5"/>
+        <w:numId w:val="1"/>
+      </w:numPr>
+      <w:spacing w:after="160" w:line="280" w:lineRule="auto"/>
+      <w:contextualSpacing/>
+    </w:pPr>
+    <w:rPr>
+      <w:rFonts w:asciiTheme="minorHAnsi" w:hAnsiTheme="minorHAnsi"/>
+      <w:sz w:val="22"/>
+    </w:rPr>
+  </w:style>
+  <w:style w:type="paragraph" w:styleId="ListBullet7">
+    <w:name w:val="List Bullet 7"/>
+    <w:basedOn w:val="Normal"/>
+    <w:uiPriority w:val="99"/>
+    <w:unhideWhenUsed/>
+    <w:rsid w:val="00326F90"/>
+    <w:pPr>
+      <w:numPr>
+        <w:ilvl w:val="6"/>
+        <w:numId w:val="1"/>
+      </w:numPr>
+      <w:spacing w:after="160" w:line="280" w:lineRule="auto"/>
+      <w:contextualSpacing/>
+    </w:pPr>
+    <w:rPr>
+      <w:rFonts w:asciiTheme="minorHAnsi" w:hAnsiTheme="minorHAnsi"/>
+      <w:sz w:val="22"/>
+    </w:rPr>
+  </w:style>
+  <w:style w:type="paragraph" w:styleId="ListBullet8">
+    <w:name w:val="List Bullet 8"/>
+    <w:basedOn w:val="Normal"/>
+    <w:uiPriority w:val="99"/>
+    <w:unhideWhenUsed/>
+    <w:rsid w:val="00326F90"/>
+    <w:pPr>
+      <w:numPr>
+        <w:ilvl w:val="7"/>
+        <w:numId w:val="1"/>
+      </w:numPr>
+      <w:spacing w:after="160" w:line="280" w:lineRule="auto"/>
+      <w:contextualSpacing/>
+    </w:pPr>
+    <w:rPr>
+      <w:rFonts w:asciiTheme="minorHAnsi" w:hAnsiTheme="minorHAnsi"/>
+      <w:sz w:val="22"/>
+    </w:rPr>
+  </w:style>
+  <w:style w:type="paragraph" w:styleId="ListBullet9">
+    <w:name w:val="List Bullet 9"/>
+    <w:basedOn w:val="Normal"/>
+    <w:uiPriority w:val="99"/>
+    <w:unhideWhenUsed/>
+    <w:rsid w:val="00326F90"/>
+    <w:pPr>
+      <w:numPr>
+        <w:ilvl w:val="8"/>
+        <w:numId w:val="1"/>
+      </w:numPr>
+      <w:spacing w:after="160" w:line="280" w:lineRule="auto"/>
+      <w:contextualSpacing/>
+    </w:pPr>
+    <w:rPr>
+      <w:rFonts w:asciiTheme="minorHAnsi" w:hAnsiTheme="minorHAnsi"/>
+      <w:sz w:val="22"/>
     </w:rPr>
   </w:style>
   <w:style w:type="character" w:customStyle="1" w:styleId="Hyperlink">

</xml_diff>